<commit_message>
Actualizar caratula, simplificar tablas y completar los cinco puntos del caso
</commit_message>
<xml_diff>
--- a/entregables/Modelo_Negocio_Pedidos.docx
+++ b/entregables/Modelo_Negocio_Pedidos.docx
@@ -2,6 +2,115 @@
 <file path=word/document.xml><?xml version="1.0" encoding="utf-8"?>
 <w:document xmlns:wpc="http://schemas.microsoft.com/office/word/2010/wordprocessingCanvas" xmlns:mo="http://schemas.microsoft.com/office/mac/office/2008/main" xmlns:mc="http://schemas.openxmlformats.org/markup-compatibility/2006" xmlns:mv="urn:schemas-microsoft-com:mac:vml" xmlns:o="urn:schemas-microsoft-com:office:office" xmlns:r="http://schemas.openxmlformats.org/officeDocument/2006/relationships" xmlns:m="http://schemas.openxmlformats.org/officeDocument/2006/math" xmlns:v="urn:schemas-microsoft-com:vml" xmlns:wp14="http://schemas.microsoft.com/office/word/2010/wordprocessingDrawing" xmlns:wp="http://schemas.openxmlformats.org/drawingml/2006/wordprocessingDrawing" xmlns:w10="urn:schemas-microsoft-com:office:word" xmlns:w="http://schemas.openxmlformats.org/wordprocessingml/2006/main" xmlns:w14="http://schemas.microsoft.com/office/word/2010/wordml" xmlns:wpg="http://schemas.microsoft.com/office/word/2010/wordprocessingGroup" xmlns:wpi="http://schemas.microsoft.com/office/word/2010/wordprocessingInk" xmlns:wne="http://schemas.microsoft.com/office/word/2006/wordml" xmlns:wps="http://schemas.microsoft.com/office/word/2010/wordprocessingShape" mc:Ignorable="w14 wp14">
   <w:body>
+    <w:tbl>
+      <w:tblPr>
+        <w:tblW w:type="auto" w:w="0"/>
+        <w:tblLayout w:type="fixed"/>
+        <w:tblLook w:firstColumn="1" w:firstRow="1" w:lastColumn="0" w:lastRow="0" w:noHBand="0" w:noVBand="1" w:val="04A0"/>
+      </w:tblPr>
+      <w:tblGrid>
+        <w:gridCol w:w="1587"/>
+        <w:gridCol w:w="7824"/>
+      </w:tblGrid>
+      <w:tr>
+        <w:tc>
+          <w:tcPr>
+            <w:tcW w:type="dxa" w:w="4873"/>
+          </w:tcPr>
+          <w:p>
+            <w:r>
+              <w:drawing>
+                <wp:inline xmlns:a="http://schemas.openxmlformats.org/drawingml/2006/main" xmlns:pic="http://schemas.openxmlformats.org/drawingml/2006/picture">
+                  <wp:extent cx="936000" cy="936000"/>
+                  <wp:docPr id="1" name="Picture 1"/>
+                  <wp:cNvGraphicFramePr>
+                    <a:graphicFrameLocks noChangeAspect="1"/>
+                  </wp:cNvGraphicFramePr>
+                  <a:graphic>
+                    <a:graphicData uri="http://schemas.openxmlformats.org/drawingml/2006/picture">
+                      <pic:pic>
+                        <pic:nvPicPr>
+                          <pic:cNvPr id="0" name="escudo_unjfsc.png"/>
+                          <pic:cNvPicPr/>
+                        </pic:nvPicPr>
+                        <pic:blipFill>
+                          <a:blip r:embed="rId9"/>
+                          <a:stretch>
+                            <a:fillRect/>
+                          </a:stretch>
+                        </pic:blipFill>
+                        <pic:spPr>
+                          <a:xfrm>
+                            <a:off x="0" y="0"/>
+                            <a:ext cx="936000" cy="936000"/>
+                          </a:xfrm>
+                          <a:prstGeom prst="rect"/>
+                        </pic:spPr>
+                      </pic:pic>
+                    </a:graphicData>
+                  </a:graphic>
+                </wp:inline>
+              </w:drawing>
+            </w:r>
+          </w:p>
+        </w:tc>
+        <w:tc>
+          <w:tcPr>
+            <w:tcW w:type="dxa" w:w="4873"/>
+          </w:tcPr>
+          <w:p>
+            <w:pPr>
+              <w:jc w:val="center"/>
+            </w:pPr>
+            <w:r>
+              <w:rPr>
+                <w:b/>
+                <w:sz w:val="30"/>
+              </w:rPr>
+              <w:t>UNIVERSIDAD NACIONAL JOSÉ FAUSTINO</w:t>
+              <w:br/>
+              <w:t>SÁNCHEZ CARRIÓN</w:t>
+            </w:r>
+          </w:p>
+          <w:p>
+            <w:pPr>
+              <w:jc w:val="center"/>
+            </w:pPr>
+            <w:r>
+              <w:rPr>
+                <w:b/>
+                <w:sz w:val="20"/>
+              </w:rPr>
+              <w:t>FACULTAD DE INGENIERÍA INDUSTRIAL, SISTEMAS E INFORMÁTICA</w:t>
+            </w:r>
+          </w:p>
+        </w:tc>
+      </w:tr>
+    </w:tbl>
+    <w:p>
+      <w:pPr>
+        <w:jc w:val="center"/>
+      </w:pPr>
+      <w:r>
+        <w:rPr>
+          <w:b/>
+          <w:sz w:val="22"/>
+        </w:rPr>
+        <w:t>“ESCUELA PROFESIONAL DE INGENIERÍA DE SISTEMAS”</w:t>
+      </w:r>
+    </w:p>
+    <w:p>
+      <w:pPr>
+        <w:jc w:val="center"/>
+      </w:pPr>
+      <w:r>
+        <w:rPr>
+          <w:b/>
+          <w:sz w:val="38"/>
+        </w:rPr>
+        <w:t>COMPLEMENTO ESPECIALIZADO</w:t>
+      </w:r>
+    </w:p>
     <w:p>
       <w:pPr>
         <w:jc w:val="center"/>
@@ -11,9 +120,7 @@
           <w:b/>
           <w:sz w:val="34"/>
         </w:rPr>
-        <w:t>UNIVERSIDAD NACIONAL JOSÉ FAUSTINO</w:t>
-        <w:br/>
-        <w:t>SÁNCHEZ CARRIÓN</w:t>
+        <w:t>ATENCIÓN DE PEDIDOS</w:t>
       </w:r>
     </w:p>
     <w:p>
@@ -22,22 +129,10 @@
       </w:pPr>
       <w:r>
         <w:rPr>
-          <w:b/>
-          <w:sz w:val="22"/>
+          <w:b w:val="0"/>
+          <w:sz w:val="26"/>
         </w:rPr>
-        <w:t>FACULTAD DE INGENIERÍA INDUSTRIAL, SISTEMAS E INFORMÁTICA</w:t>
-      </w:r>
-    </w:p>
-    <w:p>
-      <w:pPr>
-        <w:jc w:val="center"/>
-      </w:pPr>
-      <w:r>
-        <w:rPr>
-          <w:b/>
-          <w:sz w:val="22"/>
-        </w:rPr>
-        <w:t>ESCUELA PROFESIONAL DE INGENIERÍA DE SISTEMAS</w:t>
+        <w:t>Modelo de negocio y casos de uso del sistema</w:t>
       </w:r>
     </w:p>
     <w:p>
@@ -57,52 +152,7 @@
       <w:r>
         <w:rPr>
           <w:b/>
-          <w:sz w:val="40"/>
-        </w:rPr>
-        <w:t>COMPLEMENTO ESPECIALIZADO</w:t>
-      </w:r>
-    </w:p>
-    <w:p>
-      <w:pPr>
-        <w:jc w:val="center"/>
-      </w:pPr>
-      <w:r>
-        <w:rPr>
-          <w:b/>
-          <w:sz w:val="34"/>
-        </w:rPr>
-        <w:t>MODELO DE CASOS DE USO DEL NEGOCIO</w:t>
-      </w:r>
-    </w:p>
-    <w:p>
-      <w:pPr>
-        <w:jc w:val="center"/>
-      </w:pPr>
-      <w:r>
-        <w:rPr>
-          <w:b w:val="0"/>
-          <w:sz w:val="30"/>
-        </w:rPr>
-        <w:t>Caso práctico: atención de pedidos</w:t>
-      </w:r>
-    </w:p>
-    <w:p>
-      <w:pPr>
-        <w:jc w:val="left"/>
-      </w:pPr>
-      <w:r>
-        <w:rPr>
-          <w:b w:val="0"/>
-        </w:rPr>
-      </w:r>
-    </w:p>
-    <w:p>
-      <w:pPr>
-        <w:jc w:val="center"/>
-      </w:pPr>
-      <w:r>
-        <w:rPr>
-          <w:b/>
+          <w:sz w:val="20"/>
         </w:rPr>
         <w:t>ESTUDIANTE:</w:t>
       </w:r>
@@ -114,6 +164,7 @@
       <w:r>
         <w:rPr>
           <w:b w:val="0"/>
+          <w:sz w:val="22"/>
         </w:rPr>
         <w:t>OLIVARES MORENO, PIERO ALEXANDER</w:t>
       </w:r>
@@ -135,6 +186,7 @@
       <w:r>
         <w:rPr>
           <w:b/>
+          <w:sz w:val="20"/>
         </w:rPr>
         <w:t>DOCENTE:</w:t>
       </w:r>
@@ -146,6 +198,7 @@
       <w:r>
         <w:rPr>
           <w:b w:val="0"/>
+          <w:sz w:val="22"/>
         </w:rPr>
         <w:t>ING. RONALD D. FLORES FLORES</w:t>
       </w:r>
@@ -167,6 +220,7 @@
       <w:r>
         <w:rPr>
           <w:b/>
+          <w:sz w:val="20"/>
         </w:rPr>
         <w:t>CICLO:</w:t>
       </w:r>
@@ -178,6 +232,7 @@
       <w:r>
         <w:rPr>
           <w:b w:val="0"/>
+          <w:sz w:val="22"/>
         </w:rPr>
         <w:t>V</w:t>
       </w:r>
@@ -199,33 +254,35 @@
       <w:r>
         <w:rPr>
           <w:b/>
-          <w:sz w:val="28"/>
+          <w:sz w:val="26"/>
         </w:rPr>
         <w:t>HUACHO – 2026</w:t>
       </w:r>
     </w:p>
     <w:p>
       <w:pPr>
-        <w:jc w:val="center"/>
+        <w:jc w:val="left"/>
+        <w:pBdr>
+          <w:bottom w:val="single" w:sz="12" w:color="D4A500"/>
+        </w:pBdr>
       </w:pPr>
       <w:r>
         <w:rPr>
           <w:b w:val="0"/>
-          <w:color w:val="D4A500"/>
         </w:rPr>
-        <w:t>━━━━━━━━━━━━━━━━━━━━━━━━━━━━</w:t>
       </w:r>
     </w:p>
     <w:p>
       <w:pPr>
-        <w:jc w:val="center"/>
+        <w:jc w:val="left"/>
+        <w:pBdr>
+          <w:bottom w:val="single" w:sz="12" w:color="387AD3"/>
+        </w:pBdr>
       </w:pPr>
       <w:r>
         <w:rPr>
           <w:b w:val="0"/>
-          <w:color w:val="387AD3"/>
         </w:rPr>
-        <w:t>━━━━━━━━━━━━━━━━━━━━━━━━━━━━</w:t>
       </w:r>
     </w:p>
     <w:p>
@@ -238,7 +295,7 @@
         <w:pStyle w:val="Title"/>
       </w:pPr>
       <w:r>
-        <w:t>1. Análisis del caso</w:t>
+        <w:t>Atención de pedidos</w:t>
       </w:r>
     </w:p>
     <w:p>
@@ -249,7 +306,15 @@
         <w:rPr>
           <w:b w:val="0"/>
         </w:rPr>
-        <w:t>El negocio atiende pedidos captados por vendedores que visitan a sus clientes. La atención comprende la toma de la solicitud, la evaluación de existencias y crédito, el registro, la revisión documental, la preparación física, el despacho y la facturación. El resultado descrito es un pedido despachado y su factura enviada al cliente.</w:t>
+        <w:t>La empresa recibe pedidos por medio de sus vendedores. Antes de aceptarlos, revisa los productos disponibles y el crédito del cliente. Luego prepara el pedido, lo despacha y envía la factura.</w:t>
+      </w:r>
+    </w:p>
+    <w:p>
+      <w:pPr>
+        <w:pStyle w:val="Heading1"/>
+      </w:pPr>
+      <w:r>
+        <w:t>1. Procesos del negocio</w:t>
       </w:r>
     </w:p>
     <w:p>
@@ -260,300 +325,7 @@
         <w:rPr>
           <w:b w:val="0"/>
         </w:rPr>
-        <w:t>Alcance: únicamente el modelo de negocio. Se mantiene el estilo del ejemplo VentaLIBROS: actor de negocio externo, trabajadores internos, casos de uso de negocio y asociaciones dirigidas de participación. Los seis CUN descomponen el proceso general «Atender pedidos» con fines de análisis; no son pantallas ni funciones de software.</w:t>
-      </w:r>
-    </w:p>
-    <w:p>
-      <w:pPr>
-        <w:pStyle w:val="Heading1"/>
-      </w:pPr>
-      <w:r>
-        <w:t>2. Actores y trabajadores del negocio</w:t>
-      </w:r>
-    </w:p>
-    <w:tbl>
-      <w:tblPr>
-        <w:tblStyle w:val="LightShading-Accent1"/>
-        <w:tblW w:type="auto" w:w="0"/>
-        <w:tblLook w:firstColumn="1" w:firstRow="1" w:lastColumn="0" w:lastRow="0" w:noHBand="0" w:noVBand="1" w:val="04A0"/>
-      </w:tblPr>
-      <w:tblGrid>
-        <w:gridCol w:w="3249"/>
-        <w:gridCol w:w="3249"/>
-        <w:gridCol w:w="3249"/>
-      </w:tblGrid>
-      <w:tr>
-        <w:trPr>
-          <w:tblHeader/>
-        </w:trPr>
-        <w:tc>
-          <w:tcPr>
-            <w:tcW w:type="dxa" w:w="3249"/>
-          </w:tcPr>
-          <w:p>
-            <w:r>
-              <w:rPr>
-                <w:sz w:val="20"/>
-              </w:rPr>
-              <w:t>Participante</w:t>
-            </w:r>
-          </w:p>
-        </w:tc>
-        <w:tc>
-          <w:tcPr>
-            <w:tcW w:type="dxa" w:w="3249"/>
-          </w:tcPr>
-          <w:p>
-            <w:r>
-              <w:rPr>
-                <w:sz w:val="20"/>
-              </w:rPr>
-              <w:t>Tipo / figura</w:t>
-            </w:r>
-          </w:p>
-        </w:tc>
-        <w:tc>
-          <w:tcPr>
-            <w:tcW w:type="dxa" w:w="3249"/>
-          </w:tcPr>
-          <w:p>
-            <w:r>
-              <w:rPr>
-                <w:sz w:val="20"/>
-              </w:rPr>
-              <w:t>Intervención</w:t>
-            </w:r>
-          </w:p>
-        </w:tc>
-      </w:tr>
-      <w:tr>
-        <w:tc>
-          <w:tcPr>
-            <w:tcW w:type="dxa" w:w="3249"/>
-          </w:tcPr>
-          <w:p>
-            <w:r>
-              <w:rPr>
-                <w:sz w:val="20"/>
-              </w:rPr>
-              <w:t>Cliente</w:t>
-            </w:r>
-          </w:p>
-        </w:tc>
-        <w:tc>
-          <w:tcPr>
-            <w:tcW w:type="dxa" w:w="3249"/>
-          </w:tcPr>
-          <w:p>
-            <w:r>
-              <w:rPr>
-                <w:sz w:val="20"/>
-              </w:rPr>
-              <w:t>Actor de negocio: muñeco con marca diagonal</w:t>
-            </w:r>
-          </w:p>
-        </w:tc>
-        <w:tc>
-          <w:tcPr>
-            <w:tcW w:type="dxa" w:w="3249"/>
-          </w:tcPr>
-          <w:p>
-            <w:r>
-              <w:rPr>
-                <w:sz w:val="20"/>
-              </w:rPr>
-              <w:t>Solicita productos al vendedor y recibe la factura. Es el beneficiario externo; no se afirma que use el sistema.</w:t>
-            </w:r>
-          </w:p>
-        </w:tc>
-      </w:tr>
-      <w:tr>
-        <w:tc>
-          <w:tcPr>
-            <w:tcW w:type="dxa" w:w="3249"/>
-          </w:tcPr>
-          <w:p>
-            <w:r>
-              <w:rPr>
-                <w:sz w:val="20"/>
-              </w:rPr>
-              <w:t>Vendedor</w:t>
-            </w:r>
-          </w:p>
-        </w:tc>
-        <w:tc>
-          <w:tcPr>
-            <w:tcW w:type="dxa" w:w="3249"/>
-          </w:tcPr>
-          <w:p>
-            <w:r>
-              <w:rPr>
-                <w:sz w:val="20"/>
-              </w:rPr>
-              <w:t>Trabajador de negocio: figura dentro de un círculo</w:t>
-            </w:r>
-          </w:p>
-        </w:tc>
-        <w:tc>
-          <w:tcPr>
-            <w:tcW w:type="dxa" w:w="3249"/>
-          </w:tcPr>
-          <w:p>
-            <w:r>
-              <w:rPr>
-                <w:sz w:val="20"/>
-              </w:rPr>
-              <w:t>Visita al cliente, toma su solicitud, llama a la operadora y entrega el pedido impreso.</w:t>
-            </w:r>
-          </w:p>
-        </w:tc>
-      </w:tr>
-      <w:tr>
-        <w:tc>
-          <w:tcPr>
-            <w:tcW w:type="dxa" w:w="3249"/>
-          </w:tcPr>
-          <w:p>
-            <w:r>
-              <w:rPr>
-                <w:sz w:val="20"/>
-              </w:rPr>
-              <w:t>Operadora</w:t>
-            </w:r>
-          </w:p>
-        </w:tc>
-        <w:tc>
-          <w:tcPr>
-            <w:tcW w:type="dxa" w:w="3249"/>
-          </w:tcPr>
-          <w:p>
-            <w:r>
-              <w:rPr>
-                <w:sz w:val="20"/>
-              </w:rPr>
-              <w:t>Trabajador de negocio: figura dentro de un círculo</w:t>
-            </w:r>
-          </w:p>
-        </w:tc>
-        <w:tc>
-          <w:tcPr>
-            <w:tcW w:type="dxa" w:w="3249"/>
-          </w:tcPr>
-          <w:p>
-            <w:r>
-              <w:rPr>
-                <w:sz w:val="20"/>
-              </w:rPr>
-              <w:t>Consulta existencias y crédito, registra el pedido, revisa el impreso y actualiza su situación para habilitar la facturación.</w:t>
-            </w:r>
-          </w:p>
-        </w:tc>
-      </w:tr>
-      <w:tr>
-        <w:tc>
-          <w:tcPr>
-            <w:tcW w:type="dxa" w:w="3249"/>
-          </w:tcPr>
-          <w:p>
-            <w:r>
-              <w:rPr>
-                <w:sz w:val="20"/>
-              </w:rPr>
-              <w:t>Despachador</w:t>
-            </w:r>
-          </w:p>
-        </w:tc>
-        <w:tc>
-          <w:tcPr>
-            <w:tcW w:type="dxa" w:w="3249"/>
-          </w:tcPr>
-          <w:p>
-            <w:r>
-              <w:rPr>
-                <w:sz w:val="20"/>
-              </w:rPr>
-              <w:t>Trabajador de negocio: figura dentro de un círculo</w:t>
-            </w:r>
-          </w:p>
-        </w:tc>
-        <w:tc>
-          <w:tcPr>
-            <w:tcW w:type="dxa" w:w="3249"/>
-          </w:tcPr>
-          <w:p>
-            <w:r>
-              <w:rPr>
-                <w:sz w:val="20"/>
-              </w:rPr>
-              <w:t>Retira mercancía, prepara y embala el pedido, identifica el paquete y elabora la nota de despacho.</w:t>
-            </w:r>
-          </w:p>
-        </w:tc>
-      </w:tr>
-      <w:tr>
-        <w:tc>
-          <w:tcPr>
-            <w:tcW w:type="dxa" w:w="3249"/>
-          </w:tcPr>
-          <w:p>
-            <w:r>
-              <w:rPr>
-                <w:sz w:val="20"/>
-              </w:rPr>
-              <w:t>Área de transportes</w:t>
-            </w:r>
-          </w:p>
-        </w:tc>
-        <w:tc>
-          <w:tcPr>
-            <w:tcW w:type="dxa" w:w="3249"/>
-          </w:tcPr>
-          <w:p>
-            <w:r>
-              <w:rPr>
-                <w:sz w:val="20"/>
-              </w:rPr>
-              <w:t>Trabajador de negocio: figura dentro de un círculo</w:t>
-            </w:r>
-          </w:p>
-        </w:tc>
-        <w:tc>
-          <w:tcPr>
-            <w:tcW w:type="dxa" w:w="3249"/>
-          </w:tcPr>
-          <w:p>
-            <w:r>
-              <w:rPr>
-                <w:sz w:val="20"/>
-              </w:rPr>
-              <w:t>Recibe el paquete y la nota de despacho. Se representa como rol interno; no se presume una empresa externa.</w:t>
-            </w:r>
-          </w:p>
-        </w:tc>
-      </w:tr>
-    </w:tbl>
-    <w:p>
-      <w:pPr>
-        <w:jc w:val="left"/>
-      </w:pPr>
-      <w:r>
-        <w:rPr>
-          <w:b w:val="0"/>
-        </w:rPr>
-        <w:t>El almacén es un área y una fuente de existencias, no un actor adicional identificado explícitamente. El teléfono, el archivo de pedidos, la cuenta corriente y el sistema son medios o recursos. No se agregan banco, administrador ni subtipos de cliente del ejemplo de libros.</w:t>
-      </w:r>
-    </w:p>
-    <w:p>
-      <w:r>
-        <w:br w:type="page"/>
-      </w:r>
-    </w:p>
-    <w:p>
-      <w:pPr>
-        <w:pStyle w:val="Heading1"/>
-      </w:pPr>
-      <w:r>
-        <w:t>3. Tabla de actores, procesos y escenarios</w:t>
+        <w:t>• Tomar pedido</w:t>
       </w:r>
     </w:p>
     <w:p>
@@ -564,195 +336,401 @@
         <w:rPr>
           <w:b w:val="0"/>
         </w:rPr>
-        <w:t>Un escenario es una ejecución concreta del proceso: indica qué sucede, quién interviene y cuál es el resultado. Se separan los hechos del enunciado de las situaciones que requieren aclaración.</w:t>
+        <w:t>• Evaluar y registrar pedido</w:t>
+      </w:r>
+    </w:p>
+    <w:p>
+      <w:pPr>
+        <w:jc w:val="left"/>
+      </w:pPr>
+      <w:r>
+        <w:rPr>
+          <w:b w:val="0"/>
+        </w:rPr>
+        <w:t>• Verificar pedido impreso</w:t>
+      </w:r>
+    </w:p>
+    <w:p>
+      <w:pPr>
+        <w:jc w:val="left"/>
+      </w:pPr>
+      <w:r>
+        <w:rPr>
+          <w:b w:val="0"/>
+        </w:rPr>
+        <w:t>• Preparar y embalar pedido</w:t>
+      </w:r>
+    </w:p>
+    <w:p>
+      <w:pPr>
+        <w:jc w:val="left"/>
+      </w:pPr>
+      <w:r>
+        <w:rPr>
+          <w:b w:val="0"/>
+        </w:rPr>
+        <w:t>• Despachar pedido</w:t>
+      </w:r>
+    </w:p>
+    <w:p>
+      <w:pPr>
+        <w:jc w:val="left"/>
+      </w:pPr>
+      <w:r>
+        <w:rPr>
+          <w:b w:val="0"/>
+        </w:rPr>
+        <w:t>• Facturar pedido</w:t>
+      </w:r>
+    </w:p>
+    <w:p>
+      <w:pPr>
+        <w:pStyle w:val="Heading1"/>
+      </w:pPr>
+      <w:r>
+        <w:t>2. Actores del negocio</w:t>
       </w:r>
     </w:p>
     <w:tbl>
       <w:tblPr>
-        <w:tblStyle w:val="LightShading-Accent1"/>
         <w:tblW w:type="auto" w:w="0"/>
+        <w:tblLayout w:type="fixed"/>
         <w:tblLook w:firstColumn="1" w:firstRow="1" w:lastColumn="0" w:lastRow="0" w:noHBand="0" w:noVBand="1" w:val="04A0"/>
+        <w:tblBorders>
+          <w:top w:val="single" w:sz="4" w:color="B8B8B8"/>
+          <w:left w:val="single" w:sz="4" w:color="B8B8B8"/>
+          <w:bottom w:val="single" w:sz="4" w:color="B8B8B8"/>
+          <w:right w:val="single" w:sz="4" w:color="B8B8B8"/>
+          <w:insideH w:val="single" w:sz="4" w:color="B8B8B8"/>
+          <w:insideV w:val="single" w:sz="4" w:color="B8B8B8"/>
+        </w:tblBorders>
       </w:tblPr>
       <w:tblGrid>
-        <w:gridCol w:w="3249"/>
-        <w:gridCol w:w="3249"/>
-        <w:gridCol w:w="3249"/>
+        <w:gridCol w:w="1984"/>
+        <w:gridCol w:w="2551"/>
+        <w:gridCol w:w="4876"/>
       </w:tblGrid>
       <w:tr>
         <w:trPr>
           <w:tblHeader/>
+          <w:cantSplit/>
         </w:trPr>
         <w:tc>
           <w:tcPr>
             <w:tcW w:type="dxa" w:w="3249"/>
+            <w:shd w:fill="E8E8E8"/>
           </w:tcPr>
           <w:p>
+            <w:pPr>
+              <w:spacing w:before="120" w:after="120"/>
+            </w:pPr>
             <w:r>
               <w:rPr>
-                <w:sz w:val="20"/>
+                <w:b/>
+                <w:sz w:val="21"/>
               </w:rPr>
-              <w:t>CUN / proceso</w:t>
+              <w:t>Participante</w:t>
             </w:r>
           </w:p>
         </w:tc>
         <w:tc>
           <w:tcPr>
             <w:tcW w:type="dxa" w:w="3249"/>
+            <w:shd w:fill="E8E8E8"/>
           </w:tcPr>
           <w:p>
+            <w:pPr>
+              <w:spacing w:before="120" w:after="120"/>
+            </w:pPr>
             <w:r>
               <w:rPr>
-                <w:sz w:val="20"/>
+                <w:b/>
+                <w:sz w:val="21"/>
               </w:rPr>
-              <w:t>Actores o trabajadores</w:t>
+              <w:t>Tipo</w:t>
             </w:r>
           </w:p>
         </w:tc>
         <w:tc>
           <w:tcPr>
             <w:tcW w:type="dxa" w:w="3249"/>
+            <w:shd w:fill="E8E8E8"/>
           </w:tcPr>
           <w:p>
+            <w:pPr>
+              <w:spacing w:before="120" w:after="120"/>
+            </w:pPr>
             <w:r>
               <w:rPr>
-                <w:sz w:val="20"/>
+                <w:b/>
+                <w:sz w:val="21"/>
               </w:rPr>
-              <w:t>Escenario principal y resultado</w:t>
+              <w:t>Qué hace</w:t>
             </w:r>
           </w:p>
         </w:tc>
       </w:tr>
       <w:tr>
+        <w:trPr>
+          <w:cantSplit/>
+        </w:trPr>
         <w:tc>
           <w:tcPr>
-            <w:tcW w:type="dxa" w:w="3249"/>
+            <w:tcW w:type="dxa" w:w="1984"/>
           </w:tcPr>
           <w:p>
+            <w:pPr>
+              <w:spacing w:before="120" w:after="120"/>
+            </w:pPr>
             <w:r>
               <w:rPr>
-                <w:sz w:val="20"/>
+                <w:sz w:val="21"/>
               </w:rPr>
-              <w:t>CUN-01</w:t>
-              <w:br/>
-              <w:t>Tomar pedido</w:t>
+              <w:t>Cliente</w:t>
             </w:r>
           </w:p>
         </w:tc>
         <w:tc>
           <w:tcPr>
-            <w:tcW w:type="dxa" w:w="3249"/>
+            <w:tcW w:type="dxa" w:w="2551"/>
           </w:tcPr>
           <w:p>
+            <w:pPr>
+              <w:spacing w:before="120" w:after="120"/>
+            </w:pPr>
             <w:r>
               <w:rPr>
-                <w:sz w:val="20"/>
+                <w:sz w:val="21"/>
               </w:rPr>
-              <w:t>Cliente; vendedor</w:t>
+              <w:t>Actor externo</w:t>
             </w:r>
           </w:p>
         </w:tc>
         <w:tc>
           <w:tcPr>
-            <w:tcW w:type="dxa" w:w="3249"/>
+            <w:tcW w:type="dxa" w:w="4876"/>
           </w:tcPr>
           <w:p>
+            <w:pPr>
+              <w:spacing w:before="120" w:after="120"/>
+            </w:pPr>
             <w:r>
               <w:rPr>
-                <w:sz w:val="20"/>
+                <w:sz w:val="21"/>
               </w:rPr>
-              <w:t>El vendedor visita al cliente y recoge el detalle de los productos solicitados.</w:t>
-              <w:br/>
-              <w:t>Resultado: Solicitud captada para consultar su atención.</w:t>
+              <w:t>Solicita productos y recibe la factura.</w:t>
             </w:r>
           </w:p>
         </w:tc>
       </w:tr>
       <w:tr>
+        <w:trPr>
+          <w:cantSplit/>
+        </w:trPr>
         <w:tc>
           <w:tcPr>
-            <w:tcW w:type="dxa" w:w="3249"/>
+            <w:tcW w:type="dxa" w:w="1984"/>
           </w:tcPr>
           <w:p>
+            <w:pPr>
+              <w:spacing w:before="120" w:after="120"/>
+            </w:pPr>
             <w:r>
               <w:rPr>
-                <w:sz w:val="20"/>
+                <w:sz w:val="21"/>
               </w:rPr>
-              <w:t>CUN-02</w:t>
-              <w:br/>
-              <w:t>Evaluar y registrar pedido</w:t>
+              <w:t>Vendedor</w:t>
             </w:r>
           </w:p>
         </w:tc>
         <w:tc>
           <w:tcPr>
-            <w:tcW w:type="dxa" w:w="3249"/>
+            <w:tcW w:type="dxa" w:w="2551"/>
           </w:tcPr>
           <w:p>
+            <w:pPr>
+              <w:spacing w:before="120" w:after="120"/>
+            </w:pPr>
             <w:r>
               <w:rPr>
-                <w:sz w:val="20"/>
+                <w:sz w:val="21"/>
               </w:rPr>
-              <w:t>Vendedor; operadora</w:t>
+              <w:t>Trabajador del negocio</w:t>
             </w:r>
           </w:p>
         </w:tc>
         <w:tc>
           <w:tcPr>
-            <w:tcW w:type="dxa" w:w="3249"/>
+            <w:tcW w:type="dxa" w:w="4876"/>
           </w:tcPr>
           <w:p>
+            <w:pPr>
+              <w:spacing w:before="120" w:after="120"/>
+            </w:pPr>
             <w:r>
               <w:rPr>
-                <w:sz w:val="20"/>
+                <w:sz w:val="21"/>
               </w:rPr>
-              <w:t>El vendedor llama. La operadora consulta los saldos de almacén y el crédito autorizado en la cuenta corriente según el monto. Si es atendible, registra número de pedido, cliente, vendedor y monto total.</w:t>
-              <w:br/>
-              <w:t>Resultado: Pedido registrado después de ambas comprobaciones.</w:t>
+              <w:t>Toma el pedido y entrega el formato impreso.</w:t>
             </w:r>
           </w:p>
         </w:tc>
       </w:tr>
       <w:tr>
+        <w:trPr>
+          <w:cantSplit/>
+        </w:trPr>
         <w:tc>
           <w:tcPr>
-            <w:tcW w:type="dxa" w:w="3249"/>
+            <w:tcW w:type="dxa" w:w="1984"/>
           </w:tcPr>
           <w:p>
+            <w:pPr>
+              <w:spacing w:before="120" w:after="120"/>
+            </w:pPr>
             <w:r>
               <w:rPr>
-                <w:sz w:val="20"/>
+                <w:sz w:val="21"/>
               </w:rPr>
-              <w:t>CUN-03</w:t>
-              <w:br/>
-              <w:t>Verificar pedido impreso</w:t>
+              <w:t>Operadora</w:t>
             </w:r>
           </w:p>
         </w:tc>
         <w:tc>
           <w:tcPr>
-            <w:tcW w:type="dxa" w:w="3249"/>
+            <w:tcW w:type="dxa" w:w="2551"/>
           </w:tcPr>
           <w:p>
+            <w:pPr>
+              <w:spacing w:before="120" w:after="120"/>
+            </w:pPr>
             <w:r>
               <w:rPr>
-                <w:sz w:val="20"/>
+                <w:sz w:val="21"/>
               </w:rPr>
-              <w:t>Vendedor; operadora</w:t>
+              <w:t>Trabajadora del negocio</w:t>
             </w:r>
           </w:p>
         </w:tc>
         <w:tc>
           <w:tcPr>
-            <w:tcW w:type="dxa" w:w="3249"/>
+            <w:tcW w:type="dxa" w:w="4876"/>
           </w:tcPr>
           <w:p>
+            <w:pPr>
+              <w:spacing w:before="120" w:after="120"/>
+            </w:pPr>
             <w:r>
               <w:rPr>
-                <w:sz w:val="20"/>
+                <w:sz w:val="21"/>
               </w:rPr>
-              <w:t>El vendedor entrega el pedido impreso en los formatos de la empresa. Una copia se contrasta con el registro y otra se remite al área de despacho.</w:t>
-              <w:br/>
-              <w:t>Resultado: Datos contrastados y copia disponible para despacho.</w:t>
+              <w:t>Revisa existencias y crédito; registra y actualiza el pedido.</w:t>
+            </w:r>
+          </w:p>
+        </w:tc>
+      </w:tr>
+      <w:tr>
+        <w:trPr>
+          <w:cantSplit/>
+        </w:trPr>
+        <w:tc>
+          <w:tcPr>
+            <w:tcW w:type="dxa" w:w="1984"/>
+          </w:tcPr>
+          <w:p>
+            <w:pPr>
+              <w:spacing w:before="120" w:after="120"/>
+            </w:pPr>
+            <w:r>
+              <w:rPr>
+                <w:sz w:val="21"/>
+              </w:rPr>
+              <w:t>Despachador</w:t>
+            </w:r>
+          </w:p>
+        </w:tc>
+        <w:tc>
+          <w:tcPr>
+            <w:tcW w:type="dxa" w:w="2551"/>
+          </w:tcPr>
+          <w:p>
+            <w:pPr>
+              <w:spacing w:before="120" w:after="120"/>
+            </w:pPr>
+            <w:r>
+              <w:rPr>
+                <w:sz w:val="21"/>
+              </w:rPr>
+              <w:t>Trabajador del negocio</w:t>
+            </w:r>
+          </w:p>
+        </w:tc>
+        <w:tc>
+          <w:tcPr>
+            <w:tcW w:type="dxa" w:w="4876"/>
+          </w:tcPr>
+          <w:p>
+            <w:pPr>
+              <w:spacing w:before="120" w:after="120"/>
+            </w:pPr>
+            <w:r>
+              <w:rPr>
+                <w:sz w:val="21"/>
+              </w:rPr>
+              <w:t>Prepara el paquete y la nota de despacho.</w:t>
+            </w:r>
+          </w:p>
+        </w:tc>
+      </w:tr>
+      <w:tr>
+        <w:trPr>
+          <w:cantSplit/>
+        </w:trPr>
+        <w:tc>
+          <w:tcPr>
+            <w:tcW w:type="dxa" w:w="1984"/>
+          </w:tcPr>
+          <w:p>
+            <w:pPr>
+              <w:spacing w:before="120" w:after="120"/>
+            </w:pPr>
+            <w:r>
+              <w:rPr>
+                <w:sz w:val="21"/>
+              </w:rPr>
+              <w:t>Área de transportes</w:t>
+            </w:r>
+          </w:p>
+        </w:tc>
+        <w:tc>
+          <w:tcPr>
+            <w:tcW w:type="dxa" w:w="2551"/>
+          </w:tcPr>
+          <w:p>
+            <w:pPr>
+              <w:spacing w:before="120" w:after="120"/>
+            </w:pPr>
+            <w:r>
+              <w:rPr>
+                <w:sz w:val="21"/>
+              </w:rPr>
+              <w:t>Área interna</w:t>
+            </w:r>
+          </w:p>
+        </w:tc>
+        <w:tc>
+          <w:tcPr>
+            <w:tcW w:type="dxa" w:w="4876"/>
+          </w:tcPr>
+          <w:p>
+            <w:pPr>
+              <w:spacing w:before="120" w:after="120"/>
+            </w:pPr>
+            <w:r>
+              <w:rPr>
+                <w:sz w:val="21"/>
+              </w:rPr>
+              <w:t>Recibe el paquete y la nota de despacho.</w:t>
             </w:r>
           </w:p>
         </w:tc>
@@ -768,88 +746,273 @@
         <w:pStyle w:val="Heading1"/>
       </w:pPr>
       <w:r>
-        <w:t>3. Tabla de actores, procesos y escenarios (continuación)</w:t>
+        <w:t>Procesos y escenarios</w:t>
+      </w:r>
+    </w:p>
+    <w:p>
+      <w:pPr>
+        <w:jc w:val="left"/>
+      </w:pPr>
+      <w:r>
+        <w:rPr>
+          <w:b w:val="0"/>
+        </w:rPr>
+        <w:t>Los escenarios resumen las acciones que aparecen en el modelo de negocio.</w:t>
       </w:r>
     </w:p>
     <w:tbl>
       <w:tblPr>
-        <w:tblStyle w:val="LightShading-Accent1"/>
         <w:tblW w:type="auto" w:w="0"/>
+        <w:tblLayout w:type="fixed"/>
         <w:tblLook w:firstColumn="1" w:firstRow="1" w:lastColumn="0" w:lastRow="0" w:noHBand="0" w:noVBand="1" w:val="04A0"/>
+        <w:tblBorders>
+          <w:top w:val="single" w:sz="4" w:color="B8B8B8"/>
+          <w:left w:val="single" w:sz="4" w:color="B8B8B8"/>
+          <w:bottom w:val="single" w:sz="4" w:color="B8B8B8"/>
+          <w:right w:val="single" w:sz="4" w:color="B8B8B8"/>
+          <w:insideH w:val="single" w:sz="4" w:color="B8B8B8"/>
+          <w:insideV w:val="single" w:sz="4" w:color="B8B8B8"/>
+        </w:tblBorders>
       </w:tblPr>
       <w:tblGrid>
-        <w:gridCol w:w="3249"/>
-        <w:gridCol w:w="3249"/>
-        <w:gridCol w:w="3249"/>
+        <w:gridCol w:w="3175"/>
+        <w:gridCol w:w="2835"/>
+        <w:gridCol w:w="3402"/>
       </w:tblGrid>
       <w:tr>
         <w:trPr>
           <w:tblHeader/>
+          <w:cantSplit/>
         </w:trPr>
         <w:tc>
           <w:tcPr>
             <w:tcW w:type="dxa" w:w="3249"/>
+            <w:shd w:fill="E8E8E8"/>
           </w:tcPr>
           <w:p>
+            <w:pPr>
+              <w:spacing w:before="120" w:after="120"/>
+            </w:pPr>
             <w:r>
               <w:rPr>
-                <w:sz w:val="20"/>
+                <w:b/>
+                <w:sz w:val="21"/>
               </w:rPr>
-              <w:t>CUN / proceso</w:t>
+              <w:t>Participantes</w:t>
             </w:r>
           </w:p>
         </w:tc>
         <w:tc>
           <w:tcPr>
             <w:tcW w:type="dxa" w:w="3249"/>
+            <w:shd w:fill="E8E8E8"/>
           </w:tcPr>
           <w:p>
+            <w:pPr>
+              <w:spacing w:before="120" w:after="120"/>
+            </w:pPr>
             <w:r>
               <w:rPr>
-                <w:sz w:val="20"/>
+                <w:b/>
+                <w:sz w:val="21"/>
               </w:rPr>
-              <w:t>Actores o trabajadores</w:t>
+              <w:t>Proceso</w:t>
             </w:r>
           </w:p>
         </w:tc>
         <w:tc>
           <w:tcPr>
             <w:tcW w:type="dxa" w:w="3249"/>
+            <w:shd w:fill="E8E8E8"/>
           </w:tcPr>
           <w:p>
+            <w:pPr>
+              <w:spacing w:before="120" w:after="120"/>
+            </w:pPr>
             <w:r>
               <w:rPr>
-                <w:sz w:val="20"/>
+                <w:b/>
+                <w:sz w:val="21"/>
               </w:rPr>
-              <w:t>Escenario principal y resultado</w:t>
+              <w:t>Escenario</w:t>
             </w:r>
           </w:p>
         </w:tc>
       </w:tr>
       <w:tr>
+        <w:trPr>
+          <w:cantSplit/>
+        </w:trPr>
         <w:tc>
           <w:tcPr>
-            <w:tcW w:type="dxa" w:w="3249"/>
+            <w:tcW w:type="dxa" w:w="3175"/>
           </w:tcPr>
           <w:p>
+            <w:pPr>
+              <w:spacing w:before="120" w:after="120"/>
+            </w:pPr>
             <w:r>
               <w:rPr>
-                <w:sz w:val="20"/>
+                <w:sz w:val="21"/>
               </w:rPr>
-              <w:t>CUN-04</w:t>
-              <w:br/>
-              <w:t>Preparar y embalar pedido</w:t>
+              <w:t>Cliente y vendedor</w:t>
             </w:r>
           </w:p>
         </w:tc>
         <w:tc>
           <w:tcPr>
-            <w:tcW w:type="dxa" w:w="3249"/>
+            <w:tcW w:type="dxa" w:w="2835"/>
           </w:tcPr>
           <w:p>
+            <w:pPr>
+              <w:spacing w:before="120" w:after="120"/>
+            </w:pPr>
             <w:r>
               <w:rPr>
-                <w:sz w:val="20"/>
+                <w:sz w:val="21"/>
+              </w:rPr>
+              <w:t>Recepción de la solicitud</w:t>
+            </w:r>
+          </w:p>
+        </w:tc>
+        <w:tc>
+          <w:tcPr>
+            <w:tcW w:type="dxa" w:w="3402"/>
+          </w:tcPr>
+          <w:p>
+            <w:pPr>
+              <w:spacing w:before="120" w:after="120"/>
+            </w:pPr>
+            <w:r>
+              <w:rPr>
+                <w:sz w:val="21"/>
+              </w:rPr>
+              <w:t>Tomar pedido</w:t>
+            </w:r>
+          </w:p>
+        </w:tc>
+      </w:tr>
+      <w:tr>
+        <w:trPr>
+          <w:cantSplit/>
+        </w:trPr>
+        <w:tc>
+          <w:tcPr>
+            <w:tcW w:type="dxa" w:w="3175"/>
+          </w:tcPr>
+          <w:p>
+            <w:pPr>
+              <w:spacing w:before="120" w:after="120"/>
+            </w:pPr>
+            <w:r>
+              <w:rPr>
+                <w:sz w:val="21"/>
+              </w:rPr>
+              <w:t>Vendedor y operadora</w:t>
+            </w:r>
+          </w:p>
+        </w:tc>
+        <w:tc>
+          <w:tcPr>
+            <w:tcW w:type="dxa" w:w="2835"/>
+          </w:tcPr>
+          <w:p>
+            <w:pPr>
+              <w:spacing w:before="120" w:after="120"/>
+            </w:pPr>
+            <w:r>
+              <w:rPr>
+                <w:sz w:val="21"/>
+              </w:rPr>
+              <w:t>Evaluación del pedido</w:t>
+            </w:r>
+          </w:p>
+        </w:tc>
+        <w:tc>
+          <w:tcPr>
+            <w:tcW w:type="dxa" w:w="3402"/>
+          </w:tcPr>
+          <w:p>
+            <w:pPr>
+              <w:spacing w:before="120" w:after="120"/>
+            </w:pPr>
+            <w:r>
+              <w:rPr>
+                <w:sz w:val="21"/>
+              </w:rPr>
+              <w:t>Evaluar y registrar pedido</w:t>
+            </w:r>
+          </w:p>
+        </w:tc>
+      </w:tr>
+      <w:tr>
+        <w:trPr>
+          <w:cantSplit/>
+        </w:trPr>
+        <w:tc>
+          <w:tcPr>
+            <w:tcW w:type="dxa" w:w="3175"/>
+          </w:tcPr>
+          <w:p>
+            <w:pPr>
+              <w:spacing w:before="120" w:after="120"/>
+            </w:pPr>
+            <w:r>
+              <w:rPr>
+                <w:sz w:val="21"/>
+              </w:rPr>
+              <w:t>Vendedor y operadora</w:t>
+            </w:r>
+          </w:p>
+        </w:tc>
+        <w:tc>
+          <w:tcPr>
+            <w:tcW w:type="dxa" w:w="2835"/>
+          </w:tcPr>
+          <w:p>
+            <w:pPr>
+              <w:spacing w:before="120" w:after="120"/>
+            </w:pPr>
+            <w:r>
+              <w:rPr>
+                <w:sz w:val="21"/>
+              </w:rPr>
+              <w:t>Revisión del formato</w:t>
+            </w:r>
+          </w:p>
+        </w:tc>
+        <w:tc>
+          <w:tcPr>
+            <w:tcW w:type="dxa" w:w="3402"/>
+          </w:tcPr>
+          <w:p>
+            <w:pPr>
+              <w:spacing w:before="120" w:after="120"/>
+            </w:pPr>
+            <w:r>
+              <w:rPr>
+                <w:sz w:val="21"/>
+              </w:rPr>
+              <w:t>Verificar pedido impreso</w:t>
+            </w:r>
+          </w:p>
+        </w:tc>
+      </w:tr>
+      <w:tr>
+        <w:trPr>
+          <w:cantSplit/>
+        </w:trPr>
+        <w:tc>
+          <w:tcPr>
+            <w:tcW w:type="dxa" w:w="3175"/>
+          </w:tcPr>
+          <w:p>
+            <w:pPr>
+              <w:spacing w:before="120" w:after="120"/>
+            </w:pPr>
+            <w:r>
+              <w:rPr>
+                <w:sz w:val="21"/>
               </w:rPr>
               <w:t>Despachador</w:t>
             </w:r>
@@ -857,111 +1020,174 @@
         </w:tc>
         <w:tc>
           <w:tcPr>
-            <w:tcW w:type="dxa" w:w="3249"/>
+            <w:tcW w:type="dxa" w:w="2835"/>
           </w:tcPr>
           <w:p>
+            <w:pPr>
+              <w:spacing w:before="120" w:after="120"/>
+            </w:pPr>
             <w:r>
               <w:rPr>
-                <w:sz w:val="20"/>
+                <w:sz w:val="21"/>
               </w:rPr>
-              <w:t>Despacho retira del almacén los productos solicitados, prepara el pedido físico, lo embala, asigna al paquete el código del pedido y elabora la nota de despacho.</w:t>
-              <w:br/>
-              <w:t>Resultado: Paquete identificado y nota de despacho preparada.</w:t>
+              <w:t>Preparación del paquete</w:t>
+            </w:r>
+          </w:p>
+        </w:tc>
+        <w:tc>
+          <w:tcPr>
+            <w:tcW w:type="dxa" w:w="3402"/>
+          </w:tcPr>
+          <w:p>
+            <w:pPr>
+              <w:spacing w:before="120" w:after="120"/>
+            </w:pPr>
+            <w:r>
+              <w:rPr>
+                <w:sz w:val="21"/>
+              </w:rPr>
+              <w:t>Preparar y embalar pedido</w:t>
             </w:r>
           </w:p>
         </w:tc>
       </w:tr>
       <w:tr>
+        <w:trPr>
+          <w:cantSplit/>
+        </w:trPr>
         <w:tc>
           <w:tcPr>
-            <w:tcW w:type="dxa" w:w="3249"/>
+            <w:tcW w:type="dxa" w:w="3175"/>
           </w:tcPr>
           <w:p>
+            <w:pPr>
+              <w:spacing w:before="120" w:after="120"/>
+            </w:pPr>
             <w:r>
               <w:rPr>
-                <w:sz w:val="20"/>
+                <w:sz w:val="21"/>
               </w:rPr>
-              <w:t>CUN-05</w:t>
-              <w:br/>
-              <w:t>Despachar pedido</w:t>
+              <w:t>Despachador, transportes y operadora</w:t>
             </w:r>
           </w:p>
         </w:tc>
         <w:tc>
           <w:tcPr>
-            <w:tcW w:type="dxa" w:w="3249"/>
+            <w:tcW w:type="dxa" w:w="2835"/>
           </w:tcPr>
           <w:p>
+            <w:pPr>
+              <w:spacing w:before="120" w:after="120"/>
+            </w:pPr>
             <w:r>
               <w:rPr>
-                <w:sz w:val="20"/>
+                <w:sz w:val="21"/>
               </w:rPr>
-              <w:t>Despachador; área de transportes; operadora</w:t>
+              <w:t>Salida del pedido</w:t>
             </w:r>
           </w:p>
         </w:tc>
         <w:tc>
           <w:tcPr>
-            <w:tcW w:type="dxa" w:w="3249"/>
+            <w:tcW w:type="dxa" w:w="3402"/>
           </w:tcPr>
           <w:p>
+            <w:pPr>
+              <w:spacing w:before="120" w:after="120"/>
+            </w:pPr>
             <w:r>
               <w:rPr>
-                <w:sz w:val="20"/>
+                <w:sz w:val="21"/>
               </w:rPr>
-              <w:t>Se remiten el paquete y la nota al área de transportes. Cuando el paquete sale del almacén, una copia de la nota se envía a la operadora para marcar el pedido como atendido y habilitar la facturación.</w:t>
-              <w:br/>
-              <w:t>Resultado: Salida comunicada, pedido atendido y facturación habilitada.</w:t>
+              <w:t>Despachar pedido</w:t>
             </w:r>
           </w:p>
         </w:tc>
       </w:tr>
       <w:tr>
+        <w:trPr>
+          <w:cantSplit/>
+        </w:trPr>
         <w:tc>
           <w:tcPr>
-            <w:tcW w:type="dxa" w:w="3249"/>
+            <w:tcW w:type="dxa" w:w="3175"/>
           </w:tcPr>
           <w:p>
+            <w:pPr>
+              <w:spacing w:before="120" w:after="120"/>
+            </w:pPr>
             <w:r>
               <w:rPr>
-                <w:sz w:val="20"/>
+                <w:sz w:val="21"/>
               </w:rPr>
-              <w:t>CUN-06</w:t>
-              <w:br/>
-              <w:t>Facturar pedido</w:t>
+              <w:t>Operadora y cliente</w:t>
             </w:r>
           </w:p>
         </w:tc>
         <w:tc>
           <w:tcPr>
-            <w:tcW w:type="dxa" w:w="3249"/>
+            <w:tcW w:type="dxa" w:w="2835"/>
           </w:tcPr>
           <w:p>
+            <w:pPr>
+              <w:spacing w:before="120" w:after="120"/>
+            </w:pPr>
             <w:r>
               <w:rPr>
-                <w:sz w:val="20"/>
+                <w:sz w:val="21"/>
               </w:rPr>
-              <w:t>Operadora; cliente</w:t>
+              <w:t>Facturación</w:t>
             </w:r>
           </w:p>
         </w:tc>
         <w:tc>
           <w:tcPr>
-            <w:tcW w:type="dxa" w:w="3249"/>
+            <w:tcW w:type="dxa" w:w="3402"/>
           </w:tcPr>
           <w:p>
+            <w:pPr>
+              <w:spacing w:before="120" w:after="120"/>
+            </w:pPr>
             <w:r>
               <w:rPr>
-                <w:sz w:val="20"/>
+                <w:sz w:val="21"/>
               </w:rPr>
-              <w:t>Con la opción habilitada se prepara la factura del pedido y se envía al cliente una vez despachado el producto.</w:t>
-              <w:br/>
-              <w:t>Resultado: Factura preparada y enviada al cliente.</w:t>
+              <w:t>Facturar pedido</w:t>
             </w:r>
           </w:p>
         </w:tc>
       </w:tr>
     </w:tbl>
+    <w:p>
+      <w:pPr>
+        <w:pStyle w:val="Heading2"/>
+      </w:pPr>
+      <w:r>
+        <w:t>Cómo se realiza la atención</w:t>
+      </w:r>
+    </w:p>
+    <w:p>
+      <w:pPr>
+        <w:jc w:val="left"/>
+      </w:pPr>
+      <w:r>
+        <w:rPr>
+          <w:b w:val="0"/>
+        </w:rPr>
+        <w:t>El vendedor toma la solicitud y llama a la operadora. Ella revisa las existencias y el crédito del cliente antes de registrar el pedido. Después, el vendedor entrega el formato impreso para revisar los datos y enviar una copia a despacho.</w:t>
+      </w:r>
+    </w:p>
+    <w:p>
+      <w:pPr>
+        <w:jc w:val="left"/>
+      </w:pPr>
+      <w:r>
+        <w:rPr>
+          <w:b w:val="0"/>
+        </w:rPr>
+        <w:t>El despachador prepara el paquete y la nota de despacho. Cuando el pedido sale del almacén, se informa a la operadora para marcarlo como atendido y habilitar su facturación. La factura se envía al cliente después del despacho.</w:t>
+      </w:r>
+    </w:p>
     <w:p>
       <w:r>
         <w:br w:type="page"/>
@@ -972,7 +1198,7 @@
         <w:pStyle w:val="Heading1"/>
       </w:pPr>
       <w:r>
-        <w:t>4. Diagrama CUN del modelo de negocio</w:t>
+        <w:t>3. Modelo de casos de uso del negocio</w:t>
       </w:r>
     </w:p>
     <w:p>
@@ -983,15 +1209,15 @@
         <w:rPr>
           <w:b w:val="0"/>
         </w:rPr>
-        <w:t>La figura conserva los estereotipos visuales de tu archivo: Business Actor, Business Worker y Business Use Case. El cliente aparece como beneficiario externo; su asociación con la facturación representa la recepción de la factura, no su emisión.</w:t>
+        <w:t>El cliente se muestra como actor externo. El vendedor, la operadora, el despachador y transportes participan dentro de la empresa. Las conexiones indican quién interviene en cada proceso.</w:t>
       </w:r>
     </w:p>
     <w:p>
       <w:r>
         <w:drawing>
           <wp:inline xmlns:a="http://schemas.openxmlformats.org/drawingml/2006/main" xmlns:pic="http://schemas.openxmlformats.org/drawingml/2006/picture">
-            <wp:extent cx="5868000" cy="6732758"/>
-            <wp:docPr id="1" name="Picture 1"/>
+            <wp:extent cx="5652000" cy="5919726"/>
+            <wp:docPr id="2" name="Picture 2"/>
             <wp:cNvGraphicFramePr>
               <a:graphicFrameLocks noChangeAspect="1"/>
             </wp:cNvGraphicFramePr>
@@ -999,11 +1225,11 @@
               <a:graphicData uri="http://schemas.openxmlformats.org/drawingml/2006/picture">
                 <pic:pic>
                   <pic:nvPicPr>
-                    <pic:cNvPr id="0" name="Modelo_negocio_pedidos.png"/>
+                    <pic:cNvPr id="0" name="Modelo_negocio_word.png"/>
                     <pic:cNvPicPr/>
                   </pic:nvPicPr>
                   <pic:blipFill>
-                    <a:blip r:embed="rId9"/>
+                    <a:blip r:embed="rId10"/>
                     <a:stretch>
                       <a:fillRect/>
                     </a:stretch>
@@ -1011,7 +1237,79 @@
                   <pic:spPr>
                     <a:xfrm>
                       <a:off x="0" y="0"/>
-                      <a:ext cx="5868000" cy="6732758"/>
+                      <a:ext cx="5652000" cy="5919726"/>
+                    </a:xfrm>
+                    <a:prstGeom prst="rect"/>
+                  </pic:spPr>
+                </pic:pic>
+              </a:graphicData>
+            </a:graphic>
+          </wp:inline>
+        </w:drawing>
+      </w:r>
+    </w:p>
+    <w:p>
+      <w:pPr>
+        <w:jc w:val="center"/>
+      </w:pPr>
+      <w:r>
+        <w:rPr>
+          <w:b w:val="0"/>
+          <w:sz w:val="18"/>
+        </w:rPr>
+        <w:t>Modelo de negocio de atención de pedidos.</w:t>
+      </w:r>
+    </w:p>
+    <w:p>
+      <w:r>
+        <w:br w:type="page"/>
+      </w:r>
+    </w:p>
+    <w:p>
+      <w:pPr>
+        <w:pStyle w:val="Heading1"/>
+      </w:pPr>
+      <w:r>
+        <w:t>4. Diagrama de casos de uso del sistema</w:t>
+      </w:r>
+    </w:p>
+    <w:p>
+      <w:pPr>
+        <w:jc w:val="left"/>
+      </w:pPr>
+      <w:r>
+        <w:rPr>
+          <w:b w:val="0"/>
+        </w:rPr>
+        <w:t>La operadora es la usuaria del sistema identificada en el caso. Consulta existencias y crédito, registra el pedido, revisa sus datos y actualiza su estado. Al marcarlo como atendido, se habilita la facturación.</w:t>
+      </w:r>
+    </w:p>
+    <w:p>
+      <w:r>
+        <w:drawing>
+          <wp:inline xmlns:a="http://schemas.openxmlformats.org/drawingml/2006/main" xmlns:pic="http://schemas.openxmlformats.org/drawingml/2006/picture">
+            <wp:extent cx="5868000" cy="5868000"/>
+            <wp:docPr id="3" name="Picture 3"/>
+            <wp:cNvGraphicFramePr>
+              <a:graphicFrameLocks noChangeAspect="1"/>
+            </wp:cNvGraphicFramePr>
+            <a:graphic>
+              <a:graphicData uri="http://schemas.openxmlformats.org/drawingml/2006/picture">
+                <pic:pic>
+                  <pic:nvPicPr>
+                    <pic:cNvPr id="0" name="Casos_uso_sistema.png"/>
+                    <pic:cNvPicPr/>
+                  </pic:nvPicPr>
+                  <pic:blipFill>
+                    <a:blip r:embed="rId11"/>
+                    <a:stretch>
+                      <a:fillRect/>
+                    </a:stretch>
+                  </pic:blipFill>
+                  <pic:spPr>
+                    <a:xfrm>
+                      <a:off x="0" y="0"/>
+                      <a:ext cx="5868000" cy="5868000"/>
                     </a:xfrm>
                     <a:prstGeom prst="rect"/>
                   </pic:spPr>
@@ -1029,9 +1327,9 @@
       <w:r>
         <w:rPr>
           <w:b w:val="0"/>
-          <w:sz w:val="18"/>
+          <w:sz w:val="20"/>
         </w:rPr>
-        <w:t>Figura 1. Modelo de negocio de atención de pedidos. Representación gráfica elaborada a partir de la notación del archivo de referencia; no es una captura ni una exportación de IBM Rational Rose.</w:t>
+        <w:t>Se considera que la operadora también emite la factura. El caso no precisa si esta tarea la realiza otra persona.</w:t>
       </w:r>
     </w:p>
     <w:p>
@@ -1044,437 +1342,7 @@
         <w:pStyle w:val="Heading1"/>
       </w:pPr>
       <w:r>
-        <w:t>5. Conexiones y lectura del modelo</w:t>
-      </w:r>
-    </w:p>
-    <w:tbl>
-      <w:tblPr>
-        <w:tblStyle w:val="LightShading-Accent1"/>
-        <w:tblW w:type="auto" w:w="0"/>
-        <w:tblLook w:firstColumn="1" w:firstRow="1" w:lastColumn="0" w:lastRow="0" w:noHBand="0" w:noVBand="1" w:val="04A0"/>
-      </w:tblPr>
-      <w:tblGrid>
-        <w:gridCol w:w="4873"/>
-        <w:gridCol w:w="4873"/>
-      </w:tblGrid>
-      <w:tr>
-        <w:trPr>
-          <w:tblHeader/>
-        </w:trPr>
-        <w:tc>
-          <w:tcPr>
-            <w:tcW w:type="dxa" w:w="4873"/>
-          </w:tcPr>
-          <w:p>
-            <w:r>
-              <w:rPr>
-                <w:sz w:val="20"/>
-              </w:rPr>
-              <w:t>Participante</w:t>
-            </w:r>
-          </w:p>
-        </w:tc>
-        <w:tc>
-          <w:tcPr>
-            <w:tcW w:type="dxa" w:w="4873"/>
-          </w:tcPr>
-          <w:p>
-            <w:r>
-              <w:rPr>
-                <w:sz w:val="20"/>
-              </w:rPr>
-              <w:t>CUN asociados</w:t>
-            </w:r>
-          </w:p>
-        </w:tc>
-      </w:tr>
-      <w:tr>
-        <w:tc>
-          <w:tcPr>
-            <w:tcW w:type="dxa" w:w="4873"/>
-          </w:tcPr>
-          <w:p>
-            <w:r>
-              <w:rPr>
-                <w:sz w:val="20"/>
-              </w:rPr>
-              <w:t>Cliente</w:t>
-            </w:r>
-          </w:p>
-        </w:tc>
-        <w:tc>
-          <w:tcPr>
-            <w:tcW w:type="dxa" w:w="4873"/>
-          </w:tcPr>
-          <w:p>
-            <w:r>
-              <w:rPr>
-                <w:sz w:val="20"/>
-              </w:rPr>
-              <w:t>CUN-01; CUN-06</w:t>
-            </w:r>
-          </w:p>
-        </w:tc>
-      </w:tr>
-      <w:tr>
-        <w:tc>
-          <w:tcPr>
-            <w:tcW w:type="dxa" w:w="4873"/>
-          </w:tcPr>
-          <w:p>
-            <w:r>
-              <w:rPr>
-                <w:sz w:val="20"/>
-              </w:rPr>
-              <w:t>Vendedor</w:t>
-            </w:r>
-          </w:p>
-        </w:tc>
-        <w:tc>
-          <w:tcPr>
-            <w:tcW w:type="dxa" w:w="4873"/>
-          </w:tcPr>
-          <w:p>
-            <w:r>
-              <w:rPr>
-                <w:sz w:val="20"/>
-              </w:rPr>
-              <w:t>CUN-01; CUN-02; CUN-03</w:t>
-            </w:r>
-          </w:p>
-        </w:tc>
-      </w:tr>
-      <w:tr>
-        <w:tc>
-          <w:tcPr>
-            <w:tcW w:type="dxa" w:w="4873"/>
-          </w:tcPr>
-          <w:p>
-            <w:r>
-              <w:rPr>
-                <w:sz w:val="20"/>
-              </w:rPr>
-              <w:t>Operadora</w:t>
-            </w:r>
-          </w:p>
-        </w:tc>
-        <w:tc>
-          <w:tcPr>
-            <w:tcW w:type="dxa" w:w="4873"/>
-          </w:tcPr>
-          <w:p>
-            <w:r>
-              <w:rPr>
-                <w:sz w:val="20"/>
-              </w:rPr>
-              <w:t>CUN-02; CUN-03; CUN-05; CUN-06</w:t>
-            </w:r>
-          </w:p>
-        </w:tc>
-      </w:tr>
-      <w:tr>
-        <w:tc>
-          <w:tcPr>
-            <w:tcW w:type="dxa" w:w="4873"/>
-          </w:tcPr>
-          <w:p>
-            <w:r>
-              <w:rPr>
-                <w:sz w:val="20"/>
-              </w:rPr>
-              <w:t>Despachador</w:t>
-            </w:r>
-          </w:p>
-        </w:tc>
-        <w:tc>
-          <w:tcPr>
-            <w:tcW w:type="dxa" w:w="4873"/>
-          </w:tcPr>
-          <w:p>
-            <w:r>
-              <w:rPr>
-                <w:sz w:val="20"/>
-              </w:rPr>
-              <w:t>CUN-04; CUN-05</w:t>
-            </w:r>
-          </w:p>
-        </w:tc>
-      </w:tr>
-      <w:tr>
-        <w:tc>
-          <w:tcPr>
-            <w:tcW w:type="dxa" w:w="4873"/>
-          </w:tcPr>
-          <w:p>
-            <w:r>
-              <w:rPr>
-                <w:sz w:val="20"/>
-              </w:rPr>
-              <w:t>Área de transportes</w:t>
-            </w:r>
-          </w:p>
-        </w:tc>
-        <w:tc>
-          <w:tcPr>
-            <w:tcW w:type="dxa" w:w="4873"/>
-          </w:tcPr>
-          <w:p>
-            <w:r>
-              <w:rPr>
-                <w:sz w:val="20"/>
-              </w:rPr>
-              <w:t>CUN-05</w:t>
-            </w:r>
-          </w:p>
-        </w:tc>
-      </w:tr>
-    </w:tbl>
-    <w:p>
-      <w:pPr>
-        <w:jc w:val="left"/>
-      </w:pPr>
-      <w:r>
-        <w:rPr>
-          <w:b w:val="0"/>
-        </w:rPr>
-        <w:t>Las líneas dirigidas conservan el estilo de tu ejemplo y expresan participación en el caso de uso. No conectan un proceso con el siguiente ni representan el flujo del pedido. No se usan generalizaciones: el caso no define tipos especializados de cliente. Tampoco se añaden relaciones include o extend, porque no se está realizando el modelo detallado del sistema.</w:t>
-      </w:r>
-    </w:p>
-    <w:p>
-      <w:pPr>
-        <w:pStyle w:val="Heading1"/>
-      </w:pPr>
-      <w:r>
-        <w:t>6. Escenarios alternativos y aspectos por validar</w:t>
-      </w:r>
-    </w:p>
-    <w:tbl>
-      <w:tblPr>
-        <w:tblStyle w:val="LightShading-Accent1"/>
-        <w:tblW w:type="auto" w:w="0"/>
-        <w:tblLook w:firstColumn="1" w:firstRow="1" w:lastColumn="0" w:lastRow="0" w:noHBand="0" w:noVBand="1" w:val="04A0"/>
-      </w:tblPr>
-      <w:tblGrid>
-        <w:gridCol w:w="4873"/>
-        <w:gridCol w:w="4873"/>
-      </w:tblGrid>
-      <w:tr>
-        <w:trPr>
-          <w:tblHeader/>
-        </w:trPr>
-        <w:tc>
-          <w:tcPr>
-            <w:tcW w:type="dxa" w:w="4873"/>
-          </w:tcPr>
-          <w:p>
-            <w:r>
-              <w:rPr>
-                <w:sz w:val="20"/>
-              </w:rPr>
-              <w:t>Proceso</w:t>
-            </w:r>
-          </w:p>
-        </w:tc>
-        <w:tc>
-          <w:tcPr>
-            <w:tcW w:type="dxa" w:w="4873"/>
-          </w:tcPr>
-          <w:p>
-            <w:r>
-              <w:rPr>
-                <w:sz w:val="20"/>
-              </w:rPr>
-              <w:t>Situación / límite del enunciado</w:t>
-            </w:r>
-          </w:p>
-        </w:tc>
-      </w:tr>
-      <w:tr>
-        <w:tc>
-          <w:tcPr>
-            <w:tcW w:type="dxa" w:w="4873"/>
-          </w:tcPr>
-          <w:p>
-            <w:r>
-              <w:rPr>
-                <w:sz w:val="20"/>
-              </w:rPr>
-              <w:t>CUN-01</w:t>
-            </w:r>
-          </w:p>
-        </w:tc>
-        <w:tc>
-          <w:tcPr>
-            <w:tcW w:type="dxa" w:w="4873"/>
-          </w:tcPr>
-          <w:p>
-            <w:r>
-              <w:rPr>
-                <w:sz w:val="20"/>
-              </w:rPr>
-              <w:t>El enunciado no detalla excepciones en esta etapa.</w:t>
-            </w:r>
-          </w:p>
-        </w:tc>
-      </w:tr>
-      <w:tr>
-        <w:tc>
-          <w:tcPr>
-            <w:tcW w:type="dxa" w:w="4873"/>
-          </w:tcPr>
-          <w:p>
-            <w:r>
-              <w:rPr>
-                <w:sz w:val="20"/>
-              </w:rPr>
-              <w:t>CUN-02</w:t>
-            </w:r>
-          </w:p>
-        </w:tc>
-        <w:tc>
-          <w:tcPr>
-            <w:tcW w:type="dxa" w:w="4873"/>
-          </w:tcPr>
-          <w:p>
-            <w:r>
-              <w:rPr>
-                <w:sz w:val="20"/>
-              </w:rPr>
-              <w:t>Si faltan existencias o el crédito resulta insuficiente, no se presupone aceptación: se requiere definir con el negocio cómo resolverlo.</w:t>
-            </w:r>
-          </w:p>
-        </w:tc>
-      </w:tr>
-      <w:tr>
-        <w:tc>
-          <w:tcPr>
-            <w:tcW w:type="dxa" w:w="4873"/>
-          </w:tcPr>
-          <w:p>
-            <w:r>
-              <w:rPr>
-                <w:sz w:val="20"/>
-              </w:rPr>
-              <w:t>CUN-03</w:t>
-            </w:r>
-          </w:p>
-        </w:tc>
-        <w:tc>
-          <w:tcPr>
-            <w:tcW w:type="dxa" w:w="4873"/>
-          </w:tcPr>
-          <w:p>
-            <w:r>
-              <w:rPr>
-                <w:sz w:val="20"/>
-              </w:rPr>
-              <w:t>Si se detectan diferencias, el caso no establece quién corrige ni cómo se autoriza la corrección; queda por precisar.</w:t>
-            </w:r>
-          </w:p>
-        </w:tc>
-      </w:tr>
-      <w:tr>
-        <w:tc>
-          <w:tcPr>
-            <w:tcW w:type="dxa" w:w="4873"/>
-          </w:tcPr>
-          <w:p>
-            <w:r>
-              <w:rPr>
-                <w:sz w:val="20"/>
-              </w:rPr>
-              <w:t>CUN-04</w:t>
-            </w:r>
-          </w:p>
-        </w:tc>
-        <w:tc>
-          <w:tcPr>
-            <w:tcW w:type="dxa" w:w="4873"/>
-          </w:tcPr>
-          <w:p>
-            <w:r>
-              <w:rPr>
-                <w:sz w:val="20"/>
-              </w:rPr>
-              <w:t>No se describen faltantes al preparar ni despachos parciales; no se incorporan como políticas.</w:t>
-            </w:r>
-          </w:p>
-        </w:tc>
-      </w:tr>
-      <w:tr>
-        <w:tc>
-          <w:tcPr>
-            <w:tcW w:type="dxa" w:w="4873"/>
-          </w:tcPr>
-          <w:p>
-            <w:r>
-              <w:rPr>
-                <w:sz w:val="20"/>
-              </w:rPr>
-              <w:t>CUN-05</w:t>
-            </w:r>
-          </w:p>
-        </w:tc>
-        <w:tc>
-          <w:tcPr>
-            <w:tcW w:type="dxa" w:w="4873"/>
-          </w:tcPr>
-          <w:p>
-            <w:r>
-              <w:rPr>
-                <w:sz w:val="20"/>
-              </w:rPr>
-              <w:t>Si no hay constancia de salida, no se da por cumplido el evento que habilita la facturación. No se modela una entrega domiciliaria no descrita.</w:t>
-            </w:r>
-          </w:p>
-        </w:tc>
-      </w:tr>
-      <w:tr>
-        <w:tc>
-          <w:tcPr>
-            <w:tcW w:type="dxa" w:w="4873"/>
-          </w:tcPr>
-          <w:p>
-            <w:r>
-              <w:rPr>
-                <w:sz w:val="20"/>
-              </w:rPr>
-              <w:t>CUN-06</w:t>
-            </w:r>
-          </w:p>
-        </w:tc>
-        <w:tc>
-          <w:tcPr>
-            <w:tcW w:type="dxa" w:w="4873"/>
-          </w:tcPr>
-          <w:p>
-            <w:r>
-              <w:rPr>
-                <w:sz w:val="20"/>
-              </w:rPr>
-              <w:t>El enunciado no identifica quién prepara la factura: se asocia a la operadora por su intervención al habilitarla, como supuesto por validar.</w:t>
-            </w:r>
-          </w:p>
-        </w:tc>
-      </w:tr>
-    </w:tbl>
-    <w:p>
-      <w:pPr>
-        <w:jc w:val="left"/>
-      </w:pPr>
-      <w:r>
-        <w:rPr>
-          <w:b w:val="0"/>
-        </w:rPr>
-        <w:t>La preparación y envío de la factura se vinculan a la operadora como supuesto de modelado; el texto solo confirma expresamente que ella habilita la facturación. Debe validarse si interviene otro trabajador. Transportes se modela como área interna, tal como indica el relato. El ciclo V se conserva provisionalmente de la carátula facilitada.</w:t>
-      </w:r>
-    </w:p>
-    <w:p>
-      <w:pPr>
-        <w:pStyle w:val="Heading1"/>
-      </w:pPr>
-      <w:r>
-        <w:t>Referencia y archivo editable</w:t>
+        <w:t>5. Reglas de negocio</w:t>
       </w:r>
     </w:p>
     <w:p>
@@ -1485,7 +1353,7 @@
         <w:rPr>
           <w:b w:val="0"/>
         </w:rPr>
-        <w:t>Fuentes: imagen del caso práctico proporcionada por el estudiante; archivo OlivaresMoreno_VentaLIBROS.mdl, escrito originalmente con Rose 2006. El archivo adjunto OlivaresMoreno_AtencionPedidos.mdl fue generado adaptando la estructura Petal y las vistas del ejemplo. Su apertura y presentación visual deben comprobarse en IBM Rational Rose; no se ha ejecutado ese programa en este entorno.</w:t>
+        <w:t>1. Antes de aceptar el pedido, se deben revisar las existencias de los productos solicitados.</w:t>
       </w:r>
     </w:p>
     <w:p>
@@ -1496,13 +1364,134 @@
         <w:rPr>
           <w:b w:val="0"/>
         </w:rPr>
-        <w:t>Carátula recreada con los datos y colores de la imagen facilitada. No se ha insertado una reproducción del escudo, porque no se dispone de su imagen original como archivo independiente.</w:t>
+        <w:t>2. También se debe revisar el crédito autorizado del cliente según el monto del pedido.</w:t>
+      </w:r>
+    </w:p>
+    <w:p>
+      <w:pPr>
+        <w:jc w:val="left"/>
+      </w:pPr>
+      <w:r>
+        <w:rPr>
+          <w:b w:val="0"/>
+        </w:rPr>
+        <w:t>3. Las existencias y el crédito se consultan antes de registrar el pedido.</w:t>
+      </w:r>
+    </w:p>
+    <w:p>
+      <w:pPr>
+        <w:jc w:val="left"/>
+      </w:pPr>
+      <w:r>
+        <w:rPr>
+          <w:b w:val="0"/>
+        </w:rPr>
+        <w:t>4. El registro debe incluir el número de pedido, el cliente, el vendedor y el monto total.</w:t>
+      </w:r>
+    </w:p>
+    <w:p>
+      <w:pPr>
+        <w:jc w:val="left"/>
+      </w:pPr>
+      <w:r>
+        <w:rPr>
+          <w:b w:val="0"/>
+        </w:rPr>
+        <w:t>5. El vendedor debe entregar el pedido impreso en los formatos de la empresa.</w:t>
+      </w:r>
+    </w:p>
+    <w:p>
+      <w:pPr>
+        <w:jc w:val="left"/>
+      </w:pPr>
+      <w:r>
+        <w:rPr>
+          <w:b w:val="0"/>
+        </w:rPr>
+        <w:t>6. Una copia del pedido se usa para revisar los datos registrados y otra se envía a despacho.</w:t>
+      </w:r>
+    </w:p>
+    <w:p>
+      <w:pPr>
+        <w:jc w:val="left"/>
+      </w:pPr>
+      <w:r>
+        <w:rPr>
+          <w:b w:val="0"/>
+        </w:rPr>
+        <w:t>7. El área de despacho prepara el pedido con los productos retirados del almacén.</w:t>
+      </w:r>
+    </w:p>
+    <w:p>
+      <w:pPr>
+        <w:jc w:val="left"/>
+      </w:pPr>
+      <w:r>
+        <w:rPr>
+          <w:b w:val="0"/>
+        </w:rPr>
+        <w:t>8. El paquete debe llevar el código del pedido.</w:t>
+      </w:r>
+    </w:p>
+    <w:p>
+      <w:pPr>
+        <w:jc w:val="left"/>
+      </w:pPr>
+      <w:r>
+        <w:rPr>
+          <w:b w:val="0"/>
+        </w:rPr>
+        <w:t>9. La nota de despacho se prepara al embalar el pedido.</w:t>
+      </w:r>
+    </w:p>
+    <w:p>
+      <w:pPr>
+        <w:jc w:val="left"/>
+      </w:pPr>
+      <w:r>
+        <w:rPr>
+          <w:b w:val="0"/>
+        </w:rPr>
+        <w:t>10. El paquete se entrega a transportes junto con la nota de despacho.</w:t>
+      </w:r>
+    </w:p>
+    <w:p>
+      <w:pPr>
+        <w:jc w:val="left"/>
+      </w:pPr>
+      <w:r>
+        <w:rPr>
+          <w:b w:val="0"/>
+        </w:rPr>
+        <w:t>11. Al salir el paquete del almacén, se envía una copia de la nota a la operadora.</w:t>
+      </w:r>
+    </w:p>
+    <w:p>
+      <w:pPr>
+        <w:jc w:val="left"/>
+      </w:pPr>
+      <w:r>
+        <w:rPr>
+          <w:b w:val="0"/>
+        </w:rPr>
+        <w:t>12. Con esa información, la operadora marca el pedido como atendido y habilita la facturación.</w:t>
+      </w:r>
+    </w:p>
+    <w:p>
+      <w:pPr>
+        <w:jc w:val="left"/>
+      </w:pPr>
+      <w:r>
+        <w:rPr>
+          <w:b w:val="0"/>
+        </w:rPr>
+        <w:t>13. La factura se envía al cliente una vez despachado el producto.</w:t>
       </w:r>
     </w:p>
     <w:sectPr>
-      <w:footerReference w:type="default" r:id="rId10"/>
+      <w:footerReference w:type="default" r:id="rId12"/>
       <w:pgSz w:w="12240" w:h="15840"/>
-      <w:pgMar w:top="1134" w:right="1247" w:bottom="1134" w:left="1247" w:header="720" w:footer="720" w:gutter="0"/>
+      <w:pgMar w:top="964" w:right="1247" w:bottom="964" w:left="1247" w:header="720" w:footer="720" w:gutter="0"/>
       <w:cols w:space="720"/>
       <w:docGrid w:linePitch="360"/>
     </w:sectPr>
@@ -1515,9 +1504,7 @@
   <w:p>
     <w:pPr>
       <w:pStyle w:val="Footer"/>
-      <w:jc w:val="right"/>
-    </w:pPr>
-    <w:fldSimple w:instr="PAGE"/>
+    </w:pPr>
   </w:p>
 </w:ftr>
 </file>
@@ -1886,7 +1873,7 @@
     <w:qFormat/>
     <w:rsid w:val="00FC693F"/>
     <w:pPr>
-      <w:spacing w:after="140"/>
+      <w:spacing w:after="140" w:line="264" w:lineRule="auto"/>
     </w:pPr>
     <w:rPr>
       <w:rFonts w:ascii="Calibri" w:hAnsi="Calibri"/>
@@ -1952,11 +1939,11 @@
       <w:outlineLvl w:val="0"/>
     </w:pPr>
     <w:rPr>
-      <w:rFonts w:asciiTheme="majorHAnsi" w:eastAsiaTheme="majorEastAsia" w:hAnsiTheme="majorHAnsi" w:cstheme="majorBidi"/>
+      <w:rFonts w:asciiTheme="majorHAnsi" w:eastAsiaTheme="majorEastAsia" w:hAnsiTheme="majorHAnsi" w:cstheme="majorBidi" w:ascii="Calibri" w:hAnsi="Calibri"/>
       <w:b/>
       <w:bCs/>
-      <w:color w:val="183C5A"/>
-      <w:sz w:val="28"/>
+      <w:color w:val="303030"/>
+      <w:sz w:val="32"/>
       <w:szCs w:val="28"/>
     </w:rPr>
   </w:style>
@@ -1976,11 +1963,11 @@
       <w:outlineLvl w:val="1"/>
     </w:pPr>
     <w:rPr>
-      <w:rFonts w:asciiTheme="majorHAnsi" w:eastAsiaTheme="majorEastAsia" w:hAnsiTheme="majorHAnsi" w:cstheme="majorBidi"/>
+      <w:rFonts w:asciiTheme="majorHAnsi" w:eastAsiaTheme="majorEastAsia" w:hAnsiTheme="majorHAnsi" w:cstheme="majorBidi" w:ascii="Calibri" w:hAnsi="Calibri"/>
       <w:b/>
       <w:bCs/>
-      <w:color w:val="183C5A"/>
-      <w:sz w:val="26"/>
+      <w:color w:val="303030"/>
+      <w:sz w:val="24"/>
       <w:szCs w:val="26"/>
     </w:rPr>
   </w:style>

</xml_diff>

<commit_message>
Agregar modelo de requerimiento funcional al MDL y actualizar el Word
</commit_message>
<xml_diff>
--- a/entregables/Modelo_Negocio_Pedidos.docx
+++ b/entregables/Modelo_Negocio_Pedidos.docx
@@ -1271,24 +1271,20 @@
       </w:pPr>
       <w:r>
         <w:t>4. Diagrama de casos de uso del sistema</w:t>
+        <w:br/>
+        <w:t>Modelo de Requerimiento Funcional</w:t>
       </w:r>
     </w:p>
     <w:p>
-      <w:pPr>
-        <w:jc w:val="left"/>
-      </w:pPr>
       <w:r>
-        <w:rPr>
-          <w:b w:val="0"/>
-        </w:rPr>
-        <w:t>La operadora es la usuaria del sistema identificada en el caso. Consulta existencias y crédito, registra el pedido, revisa sus datos y actualiza su estado. Al marcarlo como atendido, se habilita la facturación.</w:t>
+        <w:t>Este modelo muestra las funciones del sistema y quién las utiliza. La operadora revisa existencias y crédito, registra el pedido, verifica sus datos, actualiza su situación y habilita la facturación. El responsable de facturación emite la factura.</w:t>
       </w:r>
     </w:p>
     <w:p>
       <w:r>
         <w:drawing>
           <wp:inline xmlns:a="http://schemas.openxmlformats.org/drawingml/2006/main" xmlns:pic="http://schemas.openxmlformats.org/drawingml/2006/picture">
-            <wp:extent cx="5868000" cy="5868000"/>
+            <wp:extent cx="5940000" cy="4476946"/>
             <wp:docPr id="3" name="Picture 3"/>
             <wp:cNvGraphicFramePr>
               <a:graphicFrameLocks noChangeAspect="1"/>
@@ -1297,11 +1293,11 @@
               <a:graphicData uri="http://schemas.openxmlformats.org/drawingml/2006/picture">
                 <pic:pic>
                   <pic:nvPicPr>
-                    <pic:cNvPr id="0" name="Casos_uso_sistema.png"/>
+                    <pic:cNvPr id="0" name="Modelo_Requerimiento_Funcional.png"/>
                     <pic:cNvPicPr/>
                   </pic:nvPicPr>
                   <pic:blipFill>
-                    <a:blip r:embed="rId11"/>
+                    <a:blip r:embed="rId13"/>
                     <a:stretch>
                       <a:fillRect/>
                     </a:stretch>
@@ -1309,7 +1305,7 @@
                   <pic:spPr>
                     <a:xfrm>
                       <a:off x="0" y="0"/>
-                      <a:ext cx="5868000" cy="5868000"/>
+                      <a:ext cx="5940000" cy="4476946"/>
                     </a:xfrm>
                     <a:prstGeom prst="rect"/>
                   </pic:spPr>
@@ -1321,15 +1317,16 @@
       </w:r>
     </w:p>
     <w:p>
-      <w:pPr>
-        <w:jc w:val="left"/>
-      </w:pPr>
+      <w:r>
+        <w:t>El cliente y el vendedor no se muestran como usuarios del sistema: la solicitud se recibe por medio del vendedor y la consulta se hace por teléfono.</w:t>
+      </w:r>
+    </w:p>
+    <w:p>
       <w:r>
         <w:rPr>
-          <w:b w:val="0"/>
           <w:sz w:val="20"/>
         </w:rPr>
-        <w:t>Se considera que la operadora también emite la factura. El caso no precisa si esta tarea la realiza otra persona.</w:t>
+        <w:t>El caso no indica el cargo de quien prepara la factura. Se usa el rol «Responsable de facturación» para representar esa tarea; podría realizarla la misma operadora.</w:t>
       </w:r>
     </w:p>
     <w:p>

</xml_diff>

<commit_message>
Reemplazar tabla de escenarios por matriz de procesos y actores
</commit_message>
<xml_diff>
--- a/entregables/Modelo_Negocio_Pedidos.docx
+++ b/entregables/Modelo_Negocio_Pedidos.docx
@@ -754,87 +754,349 @@
         <w:jc w:val="left"/>
       </w:pPr>
       <w:r>
-        <w:rPr>
-          <w:b w:val="0"/>
-        </w:rPr>
-        <w:t>Los escenarios resumen las acciones que aparecen en el modelo de negocio.</w:t>
+        <w:t>La X indica quién participa en cada actividad.</w:t>
       </w:r>
     </w:p>
     <w:tbl>
       <w:tblPr>
         <w:tblW w:type="auto" w:w="0"/>
+        <w:jc w:val="center"/>
         <w:tblLayout w:type="fixed"/>
         <w:tblLook w:firstColumn="1" w:firstRow="1" w:lastColumn="0" w:lastRow="0" w:noHBand="0" w:noVBand="1" w:val="04A0"/>
         <w:tblBorders>
-          <w:top w:val="single" w:sz="4" w:color="B8B8B8"/>
-          <w:left w:val="single" w:sz="4" w:color="B8B8B8"/>
-          <w:bottom w:val="single" w:sz="4" w:color="B8B8B8"/>
-          <w:right w:val="single" w:sz="4" w:color="B8B8B8"/>
-          <w:insideH w:val="single" w:sz="4" w:color="B8B8B8"/>
-          <w:insideV w:val="single" w:sz="4" w:color="B8B8B8"/>
+          <w:top w:val="single" w:sz="5" w:color="222222"/>
+          <w:left w:val="single" w:sz="5" w:color="222222"/>
+          <w:bottom w:val="single" w:sz="5" w:color="222222"/>
+          <w:right w:val="single" w:sz="5" w:color="222222"/>
+          <w:insideH w:val="single" w:sz="5" w:color="222222"/>
+          <w:insideV w:val="single" w:sz="5" w:color="222222"/>
         </w:tblBorders>
       </w:tblPr>
       <w:tblGrid>
-        <w:gridCol w:w="3175"/>
-        <w:gridCol w:w="2835"/>
-        <w:gridCol w:w="3402"/>
+        <w:gridCol w:w="1871"/>
+        <w:gridCol w:w="3458"/>
+        <w:gridCol w:w="680"/>
+        <w:gridCol w:w="680"/>
+        <w:gridCol w:w="680"/>
+        <w:gridCol w:w="680"/>
+        <w:gridCol w:w="680"/>
+        <w:gridCol w:w="680"/>
       </w:tblGrid>
       <w:tr>
         <w:trPr>
+          <w:trHeight w:val="397"/>
           <w:tblHeader/>
           <w:cantSplit/>
         </w:trPr>
         <w:tc>
           <w:tcPr>
-            <w:tcW w:type="dxa" w:w="3249"/>
-            <w:shd w:fill="E8E8E8"/>
+            <w:tcW w:type="dxa" w:w="1871"/>
+            <w:vMerge w:val="restart"/>
+            <w:shd w:fill="222B35"/>
+            <w:vAlign w:val="center"/>
+            <w:tcMar>
+              <w:top w:w="65" w:type="dxa"/>
+              <w:bottom w:w="65" w:type="dxa"/>
+              <w:left w:w="65" w:type="dxa"/>
+              <w:right w:w="65" w:type="dxa"/>
+            </w:tcMar>
+            <w:tcMar>
+              <w:top w:w="65" w:type="dxa"/>
+              <w:bottom w:w="65" w:type="dxa"/>
+              <w:left w:w="65" w:type="dxa"/>
+              <w:right w:w="65" w:type="dxa"/>
+            </w:tcMar>
           </w:tcPr>
           <w:p>
             <w:pPr>
-              <w:spacing w:before="120" w:after="120"/>
+              <w:spacing w:before="40" w:after="40" w:line="240" w:lineRule="auto"/>
+              <w:jc w:val="center"/>
             </w:pPr>
             <w:r>
               <w:rPr>
+                <w:rFonts w:ascii="Calibri" w:hAnsi="Calibri"/>
                 <w:b/>
-                <w:sz w:val="21"/>
+                <w:color w:val="FFFFFF"/>
+                <w:sz w:val="22"/>
               </w:rPr>
-              <w:t>Participantes</w:t>
+              <w:t>ESCENARIO</w:t>
             </w:r>
           </w:p>
         </w:tc>
         <w:tc>
           <w:tcPr>
-            <w:tcW w:type="dxa" w:w="3249"/>
-            <w:shd w:fill="E8E8E8"/>
+            <w:tcW w:type="dxa" w:w="3458"/>
+            <w:vMerge w:val="restart"/>
+            <w:shd w:fill="222B35"/>
+            <w:vAlign w:val="center"/>
+            <w:tcMar>
+              <w:top w:w="65" w:type="dxa"/>
+              <w:bottom w:w="65" w:type="dxa"/>
+              <w:left w:w="65" w:type="dxa"/>
+              <w:right w:w="65" w:type="dxa"/>
+            </w:tcMar>
+            <w:tcMar>
+              <w:top w:w="65" w:type="dxa"/>
+              <w:bottom w:w="65" w:type="dxa"/>
+              <w:left w:w="65" w:type="dxa"/>
+              <w:right w:w="65" w:type="dxa"/>
+            </w:tcMar>
           </w:tcPr>
           <w:p>
             <w:pPr>
-              <w:spacing w:before="120" w:after="120"/>
+              <w:spacing w:before="40" w:after="40" w:line="240" w:lineRule="auto"/>
+              <w:jc w:val="center"/>
             </w:pPr>
             <w:r>
               <w:rPr>
+                <w:rFonts w:ascii="Calibri" w:hAnsi="Calibri"/>
                 <w:b/>
-                <w:sz w:val="21"/>
+                <w:color w:val="FFFFFF"/>
+                <w:sz w:val="22"/>
               </w:rPr>
-              <w:t>Proceso</w:t>
+              <w:t>PROCESO</w:t>
             </w:r>
           </w:p>
         </w:tc>
         <w:tc>
           <w:tcPr>
-            <w:tcW w:type="dxa" w:w="3249"/>
-            <w:shd w:fill="E8E8E8"/>
+            <w:tcW w:type="dxa" w:w="4080"/>
+            <w:gridSpan w:val="6"/>
+            <w:shd w:fill="222B35"/>
+            <w:vAlign w:val="center"/>
+            <w:tcMar>
+              <w:top w:w="65" w:type="dxa"/>
+              <w:bottom w:w="65" w:type="dxa"/>
+              <w:left w:w="65" w:type="dxa"/>
+              <w:right w:w="65" w:type="dxa"/>
+            </w:tcMar>
+            <w:tcMar>
+              <w:top w:w="65" w:type="dxa"/>
+              <w:bottom w:w="65" w:type="dxa"/>
+              <w:left w:w="65" w:type="dxa"/>
+              <w:right w:w="65" w:type="dxa"/>
+            </w:tcMar>
+            <w:tcMar>
+              <w:top w:w="65" w:type="dxa"/>
+              <w:bottom w:w="65" w:type="dxa"/>
+              <w:left w:w="65" w:type="dxa"/>
+              <w:right w:w="65" w:type="dxa"/>
+            </w:tcMar>
+            <w:tcMar>
+              <w:top w:w="65" w:type="dxa"/>
+              <w:bottom w:w="65" w:type="dxa"/>
+              <w:left w:w="65" w:type="dxa"/>
+              <w:right w:w="65" w:type="dxa"/>
+            </w:tcMar>
+            <w:tcMar>
+              <w:top w:w="65" w:type="dxa"/>
+              <w:bottom w:w="65" w:type="dxa"/>
+              <w:left w:w="65" w:type="dxa"/>
+              <w:right w:w="65" w:type="dxa"/>
+            </w:tcMar>
+            <w:tcMar>
+              <w:top w:w="65" w:type="dxa"/>
+              <w:bottom w:w="65" w:type="dxa"/>
+              <w:left w:w="65" w:type="dxa"/>
+              <w:right w:w="65" w:type="dxa"/>
+            </w:tcMar>
           </w:tcPr>
           <w:p>
             <w:pPr>
-              <w:spacing w:before="120" w:after="120"/>
+              <w:spacing w:before="40" w:after="40" w:line="240" w:lineRule="auto"/>
+              <w:jc w:val="center"/>
             </w:pPr>
             <w:r>
               <w:rPr>
+                <w:rFonts w:ascii="Calibri" w:hAnsi="Calibri"/>
                 <w:b/>
-                <w:sz w:val="21"/>
+                <w:color w:val="FFFFFF"/>
+                <w:sz w:val="22"/>
               </w:rPr>
-              <w:t>Escenario</w:t>
+              <w:t>ACTOR</w:t>
+            </w:r>
+          </w:p>
+        </w:tc>
+      </w:tr>
+      <w:tr>
+        <w:trPr>
+          <w:trHeight w:val="1474"/>
+          <w:tblHeader/>
+          <w:cantSplit/>
+        </w:trPr>
+        <w:tc>
+          <w:tcPr>
+            <w:tcW w:type="dxa" w:w="1871"/>
+            <w:vMerge/>
+          </w:tcPr>
+          <w:p/>
+        </w:tc>
+        <w:tc>
+          <w:tcPr>
+            <w:tcW w:type="dxa" w:w="3458"/>
+            <w:vMerge/>
+          </w:tcPr>
+          <w:p/>
+        </w:tc>
+        <w:tc>
+          <w:tcPr>
+            <w:tcW w:type="dxa" w:w="680"/>
+            <w:textDirection w:val="btLr"/>
+            <w:vAlign w:val="center"/>
+            <w:tcMar>
+              <w:top w:w="65" w:type="dxa"/>
+              <w:bottom w:w="65" w:type="dxa"/>
+              <w:left w:w="65" w:type="dxa"/>
+              <w:right w:w="65" w:type="dxa"/>
+            </w:tcMar>
+          </w:tcPr>
+          <w:p>
+            <w:pPr>
+              <w:spacing w:before="40" w:after="40" w:line="240" w:lineRule="auto"/>
+              <w:jc w:val="center"/>
+            </w:pPr>
+            <w:r>
+              <w:rPr>
+                <w:rFonts w:ascii="Calibri" w:hAnsi="Calibri"/>
+                <w:b/>
+                <w:sz w:val="17"/>
+              </w:rPr>
+              <w:t>Cliente</w:t>
+            </w:r>
+          </w:p>
+        </w:tc>
+        <w:tc>
+          <w:tcPr>
+            <w:tcW w:type="dxa" w:w="680"/>
+            <w:textDirection w:val="btLr"/>
+            <w:vAlign w:val="center"/>
+            <w:tcMar>
+              <w:top w:w="65" w:type="dxa"/>
+              <w:bottom w:w="65" w:type="dxa"/>
+              <w:left w:w="65" w:type="dxa"/>
+              <w:right w:w="65" w:type="dxa"/>
+            </w:tcMar>
+          </w:tcPr>
+          <w:p>
+            <w:pPr>
+              <w:spacing w:before="40" w:after="40" w:line="240" w:lineRule="auto"/>
+              <w:jc w:val="center"/>
+            </w:pPr>
+            <w:r>
+              <w:rPr>
+                <w:rFonts w:ascii="Calibri" w:hAnsi="Calibri"/>
+                <w:b/>
+                <w:sz w:val="17"/>
+              </w:rPr>
+              <w:t>Vendedor</w:t>
+            </w:r>
+          </w:p>
+        </w:tc>
+        <w:tc>
+          <w:tcPr>
+            <w:tcW w:type="dxa" w:w="680"/>
+            <w:textDirection w:val="btLr"/>
+            <w:vAlign w:val="center"/>
+            <w:tcMar>
+              <w:top w:w="65" w:type="dxa"/>
+              <w:bottom w:w="65" w:type="dxa"/>
+              <w:left w:w="65" w:type="dxa"/>
+              <w:right w:w="65" w:type="dxa"/>
+            </w:tcMar>
+          </w:tcPr>
+          <w:p>
+            <w:pPr>
+              <w:spacing w:before="40" w:after="40" w:line="240" w:lineRule="auto"/>
+              <w:jc w:val="center"/>
+            </w:pPr>
+            <w:r>
+              <w:rPr>
+                <w:rFonts w:ascii="Calibri" w:hAnsi="Calibri"/>
+                <w:b/>
+                <w:sz w:val="17"/>
+              </w:rPr>
+              <w:t>Operadora</w:t>
+            </w:r>
+          </w:p>
+        </w:tc>
+        <w:tc>
+          <w:tcPr>
+            <w:tcW w:type="dxa" w:w="680"/>
+            <w:textDirection w:val="btLr"/>
+            <w:vAlign w:val="center"/>
+            <w:tcMar>
+              <w:top w:w="65" w:type="dxa"/>
+              <w:bottom w:w="65" w:type="dxa"/>
+              <w:left w:w="65" w:type="dxa"/>
+              <w:right w:w="65" w:type="dxa"/>
+            </w:tcMar>
+          </w:tcPr>
+          <w:p>
+            <w:pPr>
+              <w:spacing w:before="40" w:after="40" w:line="240" w:lineRule="auto"/>
+              <w:jc w:val="center"/>
+            </w:pPr>
+            <w:r>
+              <w:rPr>
+                <w:rFonts w:ascii="Calibri" w:hAnsi="Calibri"/>
+                <w:b/>
+                <w:sz w:val="17"/>
+              </w:rPr>
+              <w:t>Despachador</w:t>
+            </w:r>
+          </w:p>
+        </w:tc>
+        <w:tc>
+          <w:tcPr>
+            <w:tcW w:type="dxa" w:w="680"/>
+            <w:textDirection w:val="btLr"/>
+            <w:vAlign w:val="center"/>
+            <w:tcMar>
+              <w:top w:w="65" w:type="dxa"/>
+              <w:bottom w:w="65" w:type="dxa"/>
+              <w:left w:w="65" w:type="dxa"/>
+              <w:right w:w="65" w:type="dxa"/>
+            </w:tcMar>
+          </w:tcPr>
+          <w:p>
+            <w:pPr>
+              <w:spacing w:before="40" w:after="40" w:line="240" w:lineRule="auto"/>
+              <w:jc w:val="center"/>
+            </w:pPr>
+            <w:r>
+              <w:rPr>
+                <w:rFonts w:ascii="Calibri" w:hAnsi="Calibri"/>
+                <w:b/>
+                <w:sz w:val="17"/>
+              </w:rPr>
+              <w:t>Transportes</w:t>
+            </w:r>
+          </w:p>
+        </w:tc>
+        <w:tc>
+          <w:tcPr>
+            <w:tcW w:type="dxa" w:w="680"/>
+            <w:textDirection w:val="btLr"/>
+            <w:vAlign w:val="center"/>
+            <w:tcMar>
+              <w:top w:w="65" w:type="dxa"/>
+              <w:bottom w:w="65" w:type="dxa"/>
+              <w:left w:w="65" w:type="dxa"/>
+              <w:right w:w="65" w:type="dxa"/>
+            </w:tcMar>
+          </w:tcPr>
+          <w:p>
+            <w:pPr>
+              <w:spacing w:before="40" w:after="40" w:line="240" w:lineRule="auto"/>
+              <w:jc w:val="center"/>
+            </w:pPr>
+            <w:r>
+              <w:rPr>
+                <w:rFonts w:ascii="Calibri" w:hAnsi="Calibri"/>
+                <w:b/>
+                <w:sz w:val="17"/>
+              </w:rPr>
+              <w:t>Responsable de facturación</w:t>
             </w:r>
           </w:p>
         </w:tc>
@@ -845,49 +1107,2128 @@
         </w:trPr>
         <w:tc>
           <w:tcPr>
-            <w:tcW w:type="dxa" w:w="3175"/>
+            <w:tcW w:type="dxa" w:w="1871"/>
+            <w:vAlign w:val="center"/>
+            <w:tcMar>
+              <w:top w:w="65" w:type="dxa"/>
+              <w:bottom w:w="65" w:type="dxa"/>
+              <w:left w:w="65" w:type="dxa"/>
+              <w:right w:w="65" w:type="dxa"/>
+            </w:tcMar>
           </w:tcPr>
           <w:p>
             <w:pPr>
-              <w:spacing w:before="120" w:after="120"/>
+              <w:spacing w:before="40" w:after="40" w:line="240" w:lineRule="auto"/>
             </w:pPr>
             <w:r>
               <w:rPr>
-                <w:sz w:val="21"/>
+                <w:rFonts w:ascii="Calibri" w:hAnsi="Calibri"/>
+                <w:sz w:val="18"/>
               </w:rPr>
-              <w:t>Cliente y vendedor</w:t>
+              <w:t>Tomar pedido</w:t>
             </w:r>
           </w:p>
         </w:tc>
         <w:tc>
           <w:tcPr>
-            <w:tcW w:type="dxa" w:w="2835"/>
+            <w:tcW w:type="dxa" w:w="3458"/>
+            <w:vAlign w:val="center"/>
+            <w:tcMar>
+              <w:top w:w="65" w:type="dxa"/>
+              <w:bottom w:w="65" w:type="dxa"/>
+              <w:left w:w="65" w:type="dxa"/>
+              <w:right w:w="65" w:type="dxa"/>
+            </w:tcMar>
           </w:tcPr>
           <w:p>
             <w:pPr>
-              <w:spacing w:before="120" w:after="120"/>
+              <w:spacing w:before="40" w:after="40" w:line="240" w:lineRule="auto"/>
             </w:pPr>
             <w:r>
               <w:rPr>
-                <w:sz w:val="21"/>
+                <w:rFonts w:ascii="Calibri" w:hAnsi="Calibri"/>
+                <w:sz w:val="18"/>
               </w:rPr>
-              <w:t>Recepción de la solicitud</w:t>
+              <w:t>Solicitar productos y tomar el pedido</w:t>
             </w:r>
           </w:p>
         </w:tc>
         <w:tc>
           <w:tcPr>
-            <w:tcW w:type="dxa" w:w="3402"/>
+            <w:tcW w:type="dxa" w:w="680"/>
+            <w:vAlign w:val="center"/>
+            <w:tcMar>
+              <w:top w:w="65" w:type="dxa"/>
+              <w:bottom w:w="65" w:type="dxa"/>
+              <w:left w:w="65" w:type="dxa"/>
+              <w:right w:w="65" w:type="dxa"/>
+            </w:tcMar>
           </w:tcPr>
           <w:p>
             <w:pPr>
-              <w:spacing w:before="120" w:after="120"/>
+              <w:spacing w:before="40" w:after="40" w:line="240" w:lineRule="auto"/>
+              <w:jc w:val="center"/>
             </w:pPr>
             <w:r>
               <w:rPr>
-                <w:sz w:val="21"/>
+                <w:rFonts w:ascii="Calibri" w:hAnsi="Calibri"/>
+                <w:sz w:val="18"/>
               </w:rPr>
-              <w:t>Tomar pedido</w:t>
+              <w:t>X</w:t>
+            </w:r>
+          </w:p>
+        </w:tc>
+        <w:tc>
+          <w:tcPr>
+            <w:tcW w:type="dxa" w:w="680"/>
+            <w:vAlign w:val="center"/>
+            <w:tcMar>
+              <w:top w:w="65" w:type="dxa"/>
+              <w:bottom w:w="65" w:type="dxa"/>
+              <w:left w:w="65" w:type="dxa"/>
+              <w:right w:w="65" w:type="dxa"/>
+            </w:tcMar>
+          </w:tcPr>
+          <w:p>
+            <w:pPr>
+              <w:spacing w:before="40" w:after="40" w:line="240" w:lineRule="auto"/>
+              <w:jc w:val="center"/>
+            </w:pPr>
+            <w:r>
+              <w:rPr>
+                <w:rFonts w:ascii="Calibri" w:hAnsi="Calibri"/>
+                <w:sz w:val="18"/>
+              </w:rPr>
+              <w:t>X</w:t>
+            </w:r>
+          </w:p>
+        </w:tc>
+        <w:tc>
+          <w:tcPr>
+            <w:tcW w:type="dxa" w:w="680"/>
+            <w:vAlign w:val="center"/>
+            <w:tcMar>
+              <w:top w:w="65" w:type="dxa"/>
+              <w:bottom w:w="65" w:type="dxa"/>
+              <w:left w:w="65" w:type="dxa"/>
+              <w:right w:w="65" w:type="dxa"/>
+            </w:tcMar>
+          </w:tcPr>
+          <w:p>
+            <w:pPr>
+              <w:spacing w:before="40" w:after="40" w:line="240" w:lineRule="auto"/>
+              <w:jc w:val="center"/>
+            </w:pPr>
+          </w:p>
+        </w:tc>
+        <w:tc>
+          <w:tcPr>
+            <w:tcW w:type="dxa" w:w="680"/>
+            <w:vAlign w:val="center"/>
+            <w:tcMar>
+              <w:top w:w="65" w:type="dxa"/>
+              <w:bottom w:w="65" w:type="dxa"/>
+              <w:left w:w="65" w:type="dxa"/>
+              <w:right w:w="65" w:type="dxa"/>
+            </w:tcMar>
+          </w:tcPr>
+          <w:p>
+            <w:pPr>
+              <w:spacing w:before="40" w:after="40" w:line="240" w:lineRule="auto"/>
+              <w:jc w:val="center"/>
+            </w:pPr>
+          </w:p>
+        </w:tc>
+        <w:tc>
+          <w:tcPr>
+            <w:tcW w:type="dxa" w:w="680"/>
+            <w:vAlign w:val="center"/>
+            <w:tcMar>
+              <w:top w:w="65" w:type="dxa"/>
+              <w:bottom w:w="65" w:type="dxa"/>
+              <w:left w:w="65" w:type="dxa"/>
+              <w:right w:w="65" w:type="dxa"/>
+            </w:tcMar>
+          </w:tcPr>
+          <w:p>
+            <w:pPr>
+              <w:spacing w:before="40" w:after="40" w:line="240" w:lineRule="auto"/>
+              <w:jc w:val="center"/>
+            </w:pPr>
+          </w:p>
+        </w:tc>
+        <w:tc>
+          <w:tcPr>
+            <w:tcW w:type="dxa" w:w="680"/>
+            <w:vAlign w:val="center"/>
+            <w:tcMar>
+              <w:top w:w="65" w:type="dxa"/>
+              <w:bottom w:w="65" w:type="dxa"/>
+              <w:left w:w="65" w:type="dxa"/>
+              <w:right w:w="65" w:type="dxa"/>
+            </w:tcMar>
+          </w:tcPr>
+          <w:p>
+            <w:pPr>
+              <w:spacing w:before="40" w:after="40" w:line="240" w:lineRule="auto"/>
+              <w:jc w:val="center"/>
+            </w:pPr>
+          </w:p>
+        </w:tc>
+      </w:tr>
+      <w:tr>
+        <w:trPr>
+          <w:cantSplit/>
+        </w:trPr>
+        <w:tc>
+          <w:tcPr>
+            <w:tcW w:type="dxa" w:w="1871"/>
+            <w:vMerge w:val="restart"/>
+            <w:vAlign w:val="center"/>
+            <w:tcMar>
+              <w:top w:w="65" w:type="dxa"/>
+              <w:bottom w:w="65" w:type="dxa"/>
+              <w:left w:w="65" w:type="dxa"/>
+              <w:right w:w="65" w:type="dxa"/>
+            </w:tcMar>
+            <w:tcMar>
+              <w:top w:w="65" w:type="dxa"/>
+              <w:bottom w:w="65" w:type="dxa"/>
+              <w:left w:w="65" w:type="dxa"/>
+              <w:right w:w="65" w:type="dxa"/>
+            </w:tcMar>
+            <w:tcMar>
+              <w:top w:w="65" w:type="dxa"/>
+              <w:bottom w:w="65" w:type="dxa"/>
+              <w:left w:w="65" w:type="dxa"/>
+              <w:right w:w="65" w:type="dxa"/>
+            </w:tcMar>
+          </w:tcPr>
+          <w:p>
+            <w:pPr>
+              <w:spacing w:before="40" w:after="40" w:line="240" w:lineRule="auto"/>
+            </w:pPr>
+            <w:r>
+              <w:rPr>
+                <w:rFonts w:ascii="Calibri" w:hAnsi="Calibri"/>
+                <w:sz w:val="18"/>
+              </w:rPr>
+              <w:t>Evaluar y registrar pedido</w:t>
+            </w:r>
+          </w:p>
+        </w:tc>
+        <w:tc>
+          <w:tcPr>
+            <w:tcW w:type="dxa" w:w="3458"/>
+            <w:vAlign w:val="center"/>
+            <w:tcMar>
+              <w:top w:w="65" w:type="dxa"/>
+              <w:bottom w:w="65" w:type="dxa"/>
+              <w:left w:w="65" w:type="dxa"/>
+              <w:right w:w="65" w:type="dxa"/>
+            </w:tcMar>
+          </w:tcPr>
+          <w:p>
+            <w:pPr>
+              <w:spacing w:before="40" w:after="40" w:line="240" w:lineRule="auto"/>
+            </w:pPr>
+            <w:r>
+              <w:rPr>
+                <w:rFonts w:ascii="Calibri" w:hAnsi="Calibri"/>
+                <w:sz w:val="18"/>
+              </w:rPr>
+              <w:t>Consultar existencias</w:t>
+            </w:r>
+          </w:p>
+        </w:tc>
+        <w:tc>
+          <w:tcPr>
+            <w:tcW w:type="dxa" w:w="680"/>
+            <w:vAlign w:val="center"/>
+            <w:tcMar>
+              <w:top w:w="65" w:type="dxa"/>
+              <w:bottom w:w="65" w:type="dxa"/>
+              <w:left w:w="65" w:type="dxa"/>
+              <w:right w:w="65" w:type="dxa"/>
+            </w:tcMar>
+          </w:tcPr>
+          <w:p>
+            <w:pPr>
+              <w:spacing w:before="40" w:after="40" w:line="240" w:lineRule="auto"/>
+              <w:jc w:val="center"/>
+            </w:pPr>
+          </w:p>
+        </w:tc>
+        <w:tc>
+          <w:tcPr>
+            <w:tcW w:type="dxa" w:w="680"/>
+            <w:vAlign w:val="center"/>
+            <w:tcMar>
+              <w:top w:w="65" w:type="dxa"/>
+              <w:bottom w:w="65" w:type="dxa"/>
+              <w:left w:w="65" w:type="dxa"/>
+              <w:right w:w="65" w:type="dxa"/>
+            </w:tcMar>
+          </w:tcPr>
+          <w:p>
+            <w:pPr>
+              <w:spacing w:before="40" w:after="40" w:line="240" w:lineRule="auto"/>
+              <w:jc w:val="center"/>
+            </w:pPr>
+          </w:p>
+        </w:tc>
+        <w:tc>
+          <w:tcPr>
+            <w:tcW w:type="dxa" w:w="680"/>
+            <w:vAlign w:val="center"/>
+            <w:tcMar>
+              <w:top w:w="65" w:type="dxa"/>
+              <w:bottom w:w="65" w:type="dxa"/>
+              <w:left w:w="65" w:type="dxa"/>
+              <w:right w:w="65" w:type="dxa"/>
+            </w:tcMar>
+          </w:tcPr>
+          <w:p>
+            <w:pPr>
+              <w:spacing w:before="40" w:after="40" w:line="240" w:lineRule="auto"/>
+              <w:jc w:val="center"/>
+            </w:pPr>
+            <w:r>
+              <w:rPr>
+                <w:rFonts w:ascii="Calibri" w:hAnsi="Calibri"/>
+                <w:sz w:val="18"/>
+              </w:rPr>
+              <w:t>X</w:t>
+            </w:r>
+          </w:p>
+        </w:tc>
+        <w:tc>
+          <w:tcPr>
+            <w:tcW w:type="dxa" w:w="680"/>
+            <w:vAlign w:val="center"/>
+            <w:tcMar>
+              <w:top w:w="65" w:type="dxa"/>
+              <w:bottom w:w="65" w:type="dxa"/>
+              <w:left w:w="65" w:type="dxa"/>
+              <w:right w:w="65" w:type="dxa"/>
+            </w:tcMar>
+          </w:tcPr>
+          <w:p>
+            <w:pPr>
+              <w:spacing w:before="40" w:after="40" w:line="240" w:lineRule="auto"/>
+              <w:jc w:val="center"/>
+            </w:pPr>
+          </w:p>
+        </w:tc>
+        <w:tc>
+          <w:tcPr>
+            <w:tcW w:type="dxa" w:w="680"/>
+            <w:vAlign w:val="center"/>
+            <w:tcMar>
+              <w:top w:w="65" w:type="dxa"/>
+              <w:bottom w:w="65" w:type="dxa"/>
+              <w:left w:w="65" w:type="dxa"/>
+              <w:right w:w="65" w:type="dxa"/>
+            </w:tcMar>
+          </w:tcPr>
+          <w:p>
+            <w:pPr>
+              <w:spacing w:before="40" w:after="40" w:line="240" w:lineRule="auto"/>
+              <w:jc w:val="center"/>
+            </w:pPr>
+          </w:p>
+        </w:tc>
+        <w:tc>
+          <w:tcPr>
+            <w:tcW w:type="dxa" w:w="680"/>
+            <w:vAlign w:val="center"/>
+            <w:tcMar>
+              <w:top w:w="65" w:type="dxa"/>
+              <w:bottom w:w="65" w:type="dxa"/>
+              <w:left w:w="65" w:type="dxa"/>
+              <w:right w:w="65" w:type="dxa"/>
+            </w:tcMar>
+          </w:tcPr>
+          <w:p>
+            <w:pPr>
+              <w:spacing w:before="40" w:after="40" w:line="240" w:lineRule="auto"/>
+              <w:jc w:val="center"/>
+            </w:pPr>
+          </w:p>
+        </w:tc>
+      </w:tr>
+      <w:tr>
+        <w:trPr>
+          <w:cantSplit/>
+        </w:trPr>
+        <w:tc>
+          <w:tcPr>
+            <w:tcW w:type="dxa" w:w="1871"/>
+            <w:vMerge/>
+          </w:tcPr>
+          <w:p/>
+        </w:tc>
+        <w:tc>
+          <w:tcPr>
+            <w:tcW w:type="dxa" w:w="3458"/>
+            <w:vAlign w:val="center"/>
+            <w:tcMar>
+              <w:top w:w="65" w:type="dxa"/>
+              <w:bottom w:w="65" w:type="dxa"/>
+              <w:left w:w="65" w:type="dxa"/>
+              <w:right w:w="65" w:type="dxa"/>
+            </w:tcMar>
+          </w:tcPr>
+          <w:p>
+            <w:pPr>
+              <w:spacing w:before="40" w:after="40" w:line="240" w:lineRule="auto"/>
+            </w:pPr>
+            <w:r>
+              <w:rPr>
+                <w:rFonts w:ascii="Calibri" w:hAnsi="Calibri"/>
+                <w:sz w:val="18"/>
+              </w:rPr>
+              <w:t>Consultar crédito del cliente</w:t>
+            </w:r>
+          </w:p>
+        </w:tc>
+        <w:tc>
+          <w:tcPr>
+            <w:tcW w:type="dxa" w:w="680"/>
+            <w:vAlign w:val="center"/>
+            <w:tcMar>
+              <w:top w:w="65" w:type="dxa"/>
+              <w:bottom w:w="65" w:type="dxa"/>
+              <w:left w:w="65" w:type="dxa"/>
+              <w:right w:w="65" w:type="dxa"/>
+            </w:tcMar>
+          </w:tcPr>
+          <w:p>
+            <w:pPr>
+              <w:spacing w:before="40" w:after="40" w:line="240" w:lineRule="auto"/>
+              <w:jc w:val="center"/>
+            </w:pPr>
+          </w:p>
+        </w:tc>
+        <w:tc>
+          <w:tcPr>
+            <w:tcW w:type="dxa" w:w="680"/>
+            <w:vAlign w:val="center"/>
+            <w:tcMar>
+              <w:top w:w="65" w:type="dxa"/>
+              <w:bottom w:w="65" w:type="dxa"/>
+              <w:left w:w="65" w:type="dxa"/>
+              <w:right w:w="65" w:type="dxa"/>
+            </w:tcMar>
+          </w:tcPr>
+          <w:p>
+            <w:pPr>
+              <w:spacing w:before="40" w:after="40" w:line="240" w:lineRule="auto"/>
+              <w:jc w:val="center"/>
+            </w:pPr>
+          </w:p>
+        </w:tc>
+        <w:tc>
+          <w:tcPr>
+            <w:tcW w:type="dxa" w:w="680"/>
+            <w:vAlign w:val="center"/>
+            <w:tcMar>
+              <w:top w:w="65" w:type="dxa"/>
+              <w:bottom w:w="65" w:type="dxa"/>
+              <w:left w:w="65" w:type="dxa"/>
+              <w:right w:w="65" w:type="dxa"/>
+            </w:tcMar>
+          </w:tcPr>
+          <w:p>
+            <w:pPr>
+              <w:spacing w:before="40" w:after="40" w:line="240" w:lineRule="auto"/>
+              <w:jc w:val="center"/>
+            </w:pPr>
+            <w:r>
+              <w:rPr>
+                <w:rFonts w:ascii="Calibri" w:hAnsi="Calibri"/>
+                <w:sz w:val="18"/>
+              </w:rPr>
+              <w:t>X</w:t>
+            </w:r>
+          </w:p>
+        </w:tc>
+        <w:tc>
+          <w:tcPr>
+            <w:tcW w:type="dxa" w:w="680"/>
+            <w:vAlign w:val="center"/>
+            <w:tcMar>
+              <w:top w:w="65" w:type="dxa"/>
+              <w:bottom w:w="65" w:type="dxa"/>
+              <w:left w:w="65" w:type="dxa"/>
+              <w:right w:w="65" w:type="dxa"/>
+            </w:tcMar>
+          </w:tcPr>
+          <w:p>
+            <w:pPr>
+              <w:spacing w:before="40" w:after="40" w:line="240" w:lineRule="auto"/>
+              <w:jc w:val="center"/>
+            </w:pPr>
+          </w:p>
+        </w:tc>
+        <w:tc>
+          <w:tcPr>
+            <w:tcW w:type="dxa" w:w="680"/>
+            <w:vAlign w:val="center"/>
+            <w:tcMar>
+              <w:top w:w="65" w:type="dxa"/>
+              <w:bottom w:w="65" w:type="dxa"/>
+              <w:left w:w="65" w:type="dxa"/>
+              <w:right w:w="65" w:type="dxa"/>
+            </w:tcMar>
+          </w:tcPr>
+          <w:p>
+            <w:pPr>
+              <w:spacing w:before="40" w:after="40" w:line="240" w:lineRule="auto"/>
+              <w:jc w:val="center"/>
+            </w:pPr>
+          </w:p>
+        </w:tc>
+        <w:tc>
+          <w:tcPr>
+            <w:tcW w:type="dxa" w:w="680"/>
+            <w:vAlign w:val="center"/>
+            <w:tcMar>
+              <w:top w:w="65" w:type="dxa"/>
+              <w:bottom w:w="65" w:type="dxa"/>
+              <w:left w:w="65" w:type="dxa"/>
+              <w:right w:w="65" w:type="dxa"/>
+            </w:tcMar>
+          </w:tcPr>
+          <w:p>
+            <w:pPr>
+              <w:spacing w:before="40" w:after="40" w:line="240" w:lineRule="auto"/>
+              <w:jc w:val="center"/>
+            </w:pPr>
+          </w:p>
+        </w:tc>
+      </w:tr>
+      <w:tr>
+        <w:trPr>
+          <w:cantSplit/>
+        </w:trPr>
+        <w:tc>
+          <w:tcPr>
+            <w:tcW w:type="dxa" w:w="1871"/>
+            <w:vMerge/>
+          </w:tcPr>
+          <w:p/>
+        </w:tc>
+        <w:tc>
+          <w:tcPr>
+            <w:tcW w:type="dxa" w:w="3458"/>
+            <w:vAlign w:val="center"/>
+            <w:tcMar>
+              <w:top w:w="65" w:type="dxa"/>
+              <w:bottom w:w="65" w:type="dxa"/>
+              <w:left w:w="65" w:type="dxa"/>
+              <w:right w:w="65" w:type="dxa"/>
+            </w:tcMar>
+          </w:tcPr>
+          <w:p>
+            <w:pPr>
+              <w:spacing w:before="40" w:after="40" w:line="240" w:lineRule="auto"/>
+            </w:pPr>
+            <w:r>
+              <w:rPr>
+                <w:rFonts w:ascii="Calibri" w:hAnsi="Calibri"/>
+                <w:sz w:val="18"/>
+              </w:rPr>
+              <w:t>Registrar el pedido</w:t>
+            </w:r>
+          </w:p>
+        </w:tc>
+        <w:tc>
+          <w:tcPr>
+            <w:tcW w:type="dxa" w:w="680"/>
+            <w:vAlign w:val="center"/>
+            <w:tcMar>
+              <w:top w:w="65" w:type="dxa"/>
+              <w:bottom w:w="65" w:type="dxa"/>
+              <w:left w:w="65" w:type="dxa"/>
+              <w:right w:w="65" w:type="dxa"/>
+            </w:tcMar>
+          </w:tcPr>
+          <w:p>
+            <w:pPr>
+              <w:spacing w:before="40" w:after="40" w:line="240" w:lineRule="auto"/>
+              <w:jc w:val="center"/>
+            </w:pPr>
+          </w:p>
+        </w:tc>
+        <w:tc>
+          <w:tcPr>
+            <w:tcW w:type="dxa" w:w="680"/>
+            <w:vAlign w:val="center"/>
+            <w:tcMar>
+              <w:top w:w="65" w:type="dxa"/>
+              <w:bottom w:w="65" w:type="dxa"/>
+              <w:left w:w="65" w:type="dxa"/>
+              <w:right w:w="65" w:type="dxa"/>
+            </w:tcMar>
+          </w:tcPr>
+          <w:p>
+            <w:pPr>
+              <w:spacing w:before="40" w:after="40" w:line="240" w:lineRule="auto"/>
+              <w:jc w:val="center"/>
+            </w:pPr>
+          </w:p>
+        </w:tc>
+        <w:tc>
+          <w:tcPr>
+            <w:tcW w:type="dxa" w:w="680"/>
+            <w:vAlign w:val="center"/>
+            <w:tcMar>
+              <w:top w:w="65" w:type="dxa"/>
+              <w:bottom w:w="65" w:type="dxa"/>
+              <w:left w:w="65" w:type="dxa"/>
+              <w:right w:w="65" w:type="dxa"/>
+            </w:tcMar>
+          </w:tcPr>
+          <w:p>
+            <w:pPr>
+              <w:spacing w:before="40" w:after="40" w:line="240" w:lineRule="auto"/>
+              <w:jc w:val="center"/>
+            </w:pPr>
+            <w:r>
+              <w:rPr>
+                <w:rFonts w:ascii="Calibri" w:hAnsi="Calibri"/>
+                <w:sz w:val="18"/>
+              </w:rPr>
+              <w:t>X</w:t>
+            </w:r>
+          </w:p>
+        </w:tc>
+        <w:tc>
+          <w:tcPr>
+            <w:tcW w:type="dxa" w:w="680"/>
+            <w:vAlign w:val="center"/>
+            <w:tcMar>
+              <w:top w:w="65" w:type="dxa"/>
+              <w:bottom w:w="65" w:type="dxa"/>
+              <w:left w:w="65" w:type="dxa"/>
+              <w:right w:w="65" w:type="dxa"/>
+            </w:tcMar>
+          </w:tcPr>
+          <w:p>
+            <w:pPr>
+              <w:spacing w:before="40" w:after="40" w:line="240" w:lineRule="auto"/>
+              <w:jc w:val="center"/>
+            </w:pPr>
+          </w:p>
+        </w:tc>
+        <w:tc>
+          <w:tcPr>
+            <w:tcW w:type="dxa" w:w="680"/>
+            <w:vAlign w:val="center"/>
+            <w:tcMar>
+              <w:top w:w="65" w:type="dxa"/>
+              <w:bottom w:w="65" w:type="dxa"/>
+              <w:left w:w="65" w:type="dxa"/>
+              <w:right w:w="65" w:type="dxa"/>
+            </w:tcMar>
+          </w:tcPr>
+          <w:p>
+            <w:pPr>
+              <w:spacing w:before="40" w:after="40" w:line="240" w:lineRule="auto"/>
+              <w:jc w:val="center"/>
+            </w:pPr>
+          </w:p>
+        </w:tc>
+        <w:tc>
+          <w:tcPr>
+            <w:tcW w:type="dxa" w:w="680"/>
+            <w:vAlign w:val="center"/>
+            <w:tcMar>
+              <w:top w:w="65" w:type="dxa"/>
+              <w:bottom w:w="65" w:type="dxa"/>
+              <w:left w:w="65" w:type="dxa"/>
+              <w:right w:w="65" w:type="dxa"/>
+            </w:tcMar>
+          </w:tcPr>
+          <w:p>
+            <w:pPr>
+              <w:spacing w:before="40" w:after="40" w:line="240" w:lineRule="auto"/>
+              <w:jc w:val="center"/>
+            </w:pPr>
+          </w:p>
+        </w:tc>
+      </w:tr>
+      <w:tr>
+        <w:trPr>
+          <w:cantSplit/>
+        </w:trPr>
+        <w:tc>
+          <w:tcPr>
+            <w:tcW w:type="dxa" w:w="1871"/>
+            <w:vMerge w:val="restart"/>
+            <w:vAlign w:val="center"/>
+            <w:tcMar>
+              <w:top w:w="65" w:type="dxa"/>
+              <w:bottom w:w="65" w:type="dxa"/>
+              <w:left w:w="65" w:type="dxa"/>
+              <w:right w:w="65" w:type="dxa"/>
+            </w:tcMar>
+            <w:tcMar>
+              <w:top w:w="65" w:type="dxa"/>
+              <w:bottom w:w="65" w:type="dxa"/>
+              <w:left w:w="65" w:type="dxa"/>
+              <w:right w:w="65" w:type="dxa"/>
+            </w:tcMar>
+          </w:tcPr>
+          <w:p>
+            <w:pPr>
+              <w:spacing w:before="40" w:after="40" w:line="240" w:lineRule="auto"/>
+            </w:pPr>
+            <w:r>
+              <w:rPr>
+                <w:rFonts w:ascii="Calibri" w:hAnsi="Calibri"/>
+                <w:sz w:val="18"/>
+              </w:rPr>
+              <w:t>Verificar pedido impreso</w:t>
+            </w:r>
+          </w:p>
+        </w:tc>
+        <w:tc>
+          <w:tcPr>
+            <w:tcW w:type="dxa" w:w="3458"/>
+            <w:vAlign w:val="center"/>
+            <w:tcMar>
+              <w:top w:w="65" w:type="dxa"/>
+              <w:bottom w:w="65" w:type="dxa"/>
+              <w:left w:w="65" w:type="dxa"/>
+              <w:right w:w="65" w:type="dxa"/>
+            </w:tcMar>
+          </w:tcPr>
+          <w:p>
+            <w:pPr>
+              <w:spacing w:before="40" w:after="40" w:line="240" w:lineRule="auto"/>
+            </w:pPr>
+            <w:r>
+              <w:rPr>
+                <w:rFonts w:ascii="Calibri" w:hAnsi="Calibri"/>
+                <w:sz w:val="18"/>
+              </w:rPr>
+              <w:t>Entregar el pedido impreso</w:t>
+            </w:r>
+          </w:p>
+        </w:tc>
+        <w:tc>
+          <w:tcPr>
+            <w:tcW w:type="dxa" w:w="680"/>
+            <w:vAlign w:val="center"/>
+            <w:tcMar>
+              <w:top w:w="65" w:type="dxa"/>
+              <w:bottom w:w="65" w:type="dxa"/>
+              <w:left w:w="65" w:type="dxa"/>
+              <w:right w:w="65" w:type="dxa"/>
+            </w:tcMar>
+          </w:tcPr>
+          <w:p>
+            <w:pPr>
+              <w:spacing w:before="40" w:after="40" w:line="240" w:lineRule="auto"/>
+              <w:jc w:val="center"/>
+            </w:pPr>
+          </w:p>
+        </w:tc>
+        <w:tc>
+          <w:tcPr>
+            <w:tcW w:type="dxa" w:w="680"/>
+            <w:vAlign w:val="center"/>
+            <w:tcMar>
+              <w:top w:w="65" w:type="dxa"/>
+              <w:bottom w:w="65" w:type="dxa"/>
+              <w:left w:w="65" w:type="dxa"/>
+              <w:right w:w="65" w:type="dxa"/>
+            </w:tcMar>
+          </w:tcPr>
+          <w:p>
+            <w:pPr>
+              <w:spacing w:before="40" w:after="40" w:line="240" w:lineRule="auto"/>
+              <w:jc w:val="center"/>
+            </w:pPr>
+            <w:r>
+              <w:rPr>
+                <w:rFonts w:ascii="Calibri" w:hAnsi="Calibri"/>
+                <w:sz w:val="18"/>
+              </w:rPr>
+              <w:t>X</w:t>
+            </w:r>
+          </w:p>
+        </w:tc>
+        <w:tc>
+          <w:tcPr>
+            <w:tcW w:type="dxa" w:w="680"/>
+            <w:vAlign w:val="center"/>
+            <w:tcMar>
+              <w:top w:w="65" w:type="dxa"/>
+              <w:bottom w:w="65" w:type="dxa"/>
+              <w:left w:w="65" w:type="dxa"/>
+              <w:right w:w="65" w:type="dxa"/>
+            </w:tcMar>
+          </w:tcPr>
+          <w:p>
+            <w:pPr>
+              <w:spacing w:before="40" w:after="40" w:line="240" w:lineRule="auto"/>
+              <w:jc w:val="center"/>
+            </w:pPr>
+          </w:p>
+        </w:tc>
+        <w:tc>
+          <w:tcPr>
+            <w:tcW w:type="dxa" w:w="680"/>
+            <w:vAlign w:val="center"/>
+            <w:tcMar>
+              <w:top w:w="65" w:type="dxa"/>
+              <w:bottom w:w="65" w:type="dxa"/>
+              <w:left w:w="65" w:type="dxa"/>
+              <w:right w:w="65" w:type="dxa"/>
+            </w:tcMar>
+          </w:tcPr>
+          <w:p>
+            <w:pPr>
+              <w:spacing w:before="40" w:after="40" w:line="240" w:lineRule="auto"/>
+              <w:jc w:val="center"/>
+            </w:pPr>
+          </w:p>
+        </w:tc>
+        <w:tc>
+          <w:tcPr>
+            <w:tcW w:type="dxa" w:w="680"/>
+            <w:vAlign w:val="center"/>
+            <w:tcMar>
+              <w:top w:w="65" w:type="dxa"/>
+              <w:bottom w:w="65" w:type="dxa"/>
+              <w:left w:w="65" w:type="dxa"/>
+              <w:right w:w="65" w:type="dxa"/>
+            </w:tcMar>
+          </w:tcPr>
+          <w:p>
+            <w:pPr>
+              <w:spacing w:before="40" w:after="40" w:line="240" w:lineRule="auto"/>
+              <w:jc w:val="center"/>
+            </w:pPr>
+          </w:p>
+        </w:tc>
+        <w:tc>
+          <w:tcPr>
+            <w:tcW w:type="dxa" w:w="680"/>
+            <w:vAlign w:val="center"/>
+            <w:tcMar>
+              <w:top w:w="65" w:type="dxa"/>
+              <w:bottom w:w="65" w:type="dxa"/>
+              <w:left w:w="65" w:type="dxa"/>
+              <w:right w:w="65" w:type="dxa"/>
+            </w:tcMar>
+          </w:tcPr>
+          <w:p>
+            <w:pPr>
+              <w:spacing w:before="40" w:after="40" w:line="240" w:lineRule="auto"/>
+              <w:jc w:val="center"/>
+            </w:pPr>
+          </w:p>
+        </w:tc>
+      </w:tr>
+      <w:tr>
+        <w:trPr>
+          <w:cantSplit/>
+        </w:trPr>
+        <w:tc>
+          <w:tcPr>
+            <w:tcW w:type="dxa" w:w="1871"/>
+            <w:vMerge/>
+          </w:tcPr>
+          <w:p/>
+        </w:tc>
+        <w:tc>
+          <w:tcPr>
+            <w:tcW w:type="dxa" w:w="3458"/>
+            <w:vAlign w:val="center"/>
+            <w:tcMar>
+              <w:top w:w="65" w:type="dxa"/>
+              <w:bottom w:w="65" w:type="dxa"/>
+              <w:left w:w="65" w:type="dxa"/>
+              <w:right w:w="65" w:type="dxa"/>
+            </w:tcMar>
+          </w:tcPr>
+          <w:p>
+            <w:pPr>
+              <w:spacing w:before="40" w:after="40" w:line="240" w:lineRule="auto"/>
+            </w:pPr>
+            <w:r>
+              <w:rPr>
+                <w:rFonts w:ascii="Calibri" w:hAnsi="Calibri"/>
+                <w:sz w:val="18"/>
+              </w:rPr>
+              <w:t>Revisar datos y enviar copia a despacho</w:t>
+            </w:r>
+          </w:p>
+        </w:tc>
+        <w:tc>
+          <w:tcPr>
+            <w:tcW w:type="dxa" w:w="680"/>
+            <w:vAlign w:val="center"/>
+            <w:tcMar>
+              <w:top w:w="65" w:type="dxa"/>
+              <w:bottom w:w="65" w:type="dxa"/>
+              <w:left w:w="65" w:type="dxa"/>
+              <w:right w:w="65" w:type="dxa"/>
+            </w:tcMar>
+          </w:tcPr>
+          <w:p>
+            <w:pPr>
+              <w:spacing w:before="40" w:after="40" w:line="240" w:lineRule="auto"/>
+              <w:jc w:val="center"/>
+            </w:pPr>
+          </w:p>
+        </w:tc>
+        <w:tc>
+          <w:tcPr>
+            <w:tcW w:type="dxa" w:w="680"/>
+            <w:vAlign w:val="center"/>
+            <w:tcMar>
+              <w:top w:w="65" w:type="dxa"/>
+              <w:bottom w:w="65" w:type="dxa"/>
+              <w:left w:w="65" w:type="dxa"/>
+              <w:right w:w="65" w:type="dxa"/>
+            </w:tcMar>
+          </w:tcPr>
+          <w:p>
+            <w:pPr>
+              <w:spacing w:before="40" w:after="40" w:line="240" w:lineRule="auto"/>
+              <w:jc w:val="center"/>
+            </w:pPr>
+          </w:p>
+        </w:tc>
+        <w:tc>
+          <w:tcPr>
+            <w:tcW w:type="dxa" w:w="680"/>
+            <w:vAlign w:val="center"/>
+            <w:tcMar>
+              <w:top w:w="65" w:type="dxa"/>
+              <w:bottom w:w="65" w:type="dxa"/>
+              <w:left w:w="65" w:type="dxa"/>
+              <w:right w:w="65" w:type="dxa"/>
+            </w:tcMar>
+          </w:tcPr>
+          <w:p>
+            <w:pPr>
+              <w:spacing w:before="40" w:after="40" w:line="240" w:lineRule="auto"/>
+              <w:jc w:val="center"/>
+            </w:pPr>
+            <w:r>
+              <w:rPr>
+                <w:rFonts w:ascii="Calibri" w:hAnsi="Calibri"/>
+                <w:sz w:val="18"/>
+              </w:rPr>
+              <w:t>X</w:t>
+            </w:r>
+          </w:p>
+        </w:tc>
+        <w:tc>
+          <w:tcPr>
+            <w:tcW w:type="dxa" w:w="680"/>
+            <w:vAlign w:val="center"/>
+            <w:tcMar>
+              <w:top w:w="65" w:type="dxa"/>
+              <w:bottom w:w="65" w:type="dxa"/>
+              <w:left w:w="65" w:type="dxa"/>
+              <w:right w:w="65" w:type="dxa"/>
+            </w:tcMar>
+          </w:tcPr>
+          <w:p>
+            <w:pPr>
+              <w:spacing w:before="40" w:after="40" w:line="240" w:lineRule="auto"/>
+              <w:jc w:val="center"/>
+            </w:pPr>
+          </w:p>
+        </w:tc>
+        <w:tc>
+          <w:tcPr>
+            <w:tcW w:type="dxa" w:w="680"/>
+            <w:vAlign w:val="center"/>
+            <w:tcMar>
+              <w:top w:w="65" w:type="dxa"/>
+              <w:bottom w:w="65" w:type="dxa"/>
+              <w:left w:w="65" w:type="dxa"/>
+              <w:right w:w="65" w:type="dxa"/>
+            </w:tcMar>
+          </w:tcPr>
+          <w:p>
+            <w:pPr>
+              <w:spacing w:before="40" w:after="40" w:line="240" w:lineRule="auto"/>
+              <w:jc w:val="center"/>
+            </w:pPr>
+          </w:p>
+        </w:tc>
+        <w:tc>
+          <w:tcPr>
+            <w:tcW w:type="dxa" w:w="680"/>
+            <w:vAlign w:val="center"/>
+            <w:tcMar>
+              <w:top w:w="65" w:type="dxa"/>
+              <w:bottom w:w="65" w:type="dxa"/>
+              <w:left w:w="65" w:type="dxa"/>
+              <w:right w:w="65" w:type="dxa"/>
+            </w:tcMar>
+          </w:tcPr>
+          <w:p>
+            <w:pPr>
+              <w:spacing w:before="40" w:after="40" w:line="240" w:lineRule="auto"/>
+              <w:jc w:val="center"/>
+            </w:pPr>
+          </w:p>
+        </w:tc>
+      </w:tr>
+      <w:tr>
+        <w:trPr>
+          <w:cantSplit/>
+        </w:trPr>
+        <w:tc>
+          <w:tcPr>
+            <w:tcW w:type="dxa" w:w="1871"/>
+            <w:vMerge w:val="restart"/>
+            <w:vAlign w:val="center"/>
+            <w:tcMar>
+              <w:top w:w="65" w:type="dxa"/>
+              <w:bottom w:w="65" w:type="dxa"/>
+              <w:left w:w="65" w:type="dxa"/>
+              <w:right w:w="65" w:type="dxa"/>
+            </w:tcMar>
+            <w:tcMar>
+              <w:top w:w="65" w:type="dxa"/>
+              <w:bottom w:w="65" w:type="dxa"/>
+              <w:left w:w="65" w:type="dxa"/>
+              <w:right w:w="65" w:type="dxa"/>
+            </w:tcMar>
+            <w:tcMar>
+              <w:top w:w="65" w:type="dxa"/>
+              <w:bottom w:w="65" w:type="dxa"/>
+              <w:left w:w="65" w:type="dxa"/>
+              <w:right w:w="65" w:type="dxa"/>
+            </w:tcMar>
+          </w:tcPr>
+          <w:p>
+            <w:pPr>
+              <w:spacing w:before="40" w:after="40" w:line="240" w:lineRule="auto"/>
+            </w:pPr>
+            <w:r>
+              <w:rPr>
+                <w:rFonts w:ascii="Calibri" w:hAnsi="Calibri"/>
+                <w:sz w:val="18"/>
+              </w:rPr>
+              <w:t>Preparar y embalar pedido</w:t>
+            </w:r>
+          </w:p>
+        </w:tc>
+        <w:tc>
+          <w:tcPr>
+            <w:tcW w:type="dxa" w:w="3458"/>
+            <w:vAlign w:val="center"/>
+            <w:tcMar>
+              <w:top w:w="65" w:type="dxa"/>
+              <w:bottom w:w="65" w:type="dxa"/>
+              <w:left w:w="65" w:type="dxa"/>
+              <w:right w:w="65" w:type="dxa"/>
+            </w:tcMar>
+          </w:tcPr>
+          <w:p>
+            <w:pPr>
+              <w:spacing w:before="40" w:after="40" w:line="240" w:lineRule="auto"/>
+            </w:pPr>
+            <w:r>
+              <w:rPr>
+                <w:rFonts w:ascii="Calibri" w:hAnsi="Calibri"/>
+                <w:sz w:val="18"/>
+              </w:rPr>
+              <w:t>Retirar y embalar los productos</w:t>
+            </w:r>
+          </w:p>
+        </w:tc>
+        <w:tc>
+          <w:tcPr>
+            <w:tcW w:type="dxa" w:w="680"/>
+            <w:vAlign w:val="center"/>
+            <w:tcMar>
+              <w:top w:w="65" w:type="dxa"/>
+              <w:bottom w:w="65" w:type="dxa"/>
+              <w:left w:w="65" w:type="dxa"/>
+              <w:right w:w="65" w:type="dxa"/>
+            </w:tcMar>
+          </w:tcPr>
+          <w:p>
+            <w:pPr>
+              <w:spacing w:before="40" w:after="40" w:line="240" w:lineRule="auto"/>
+              <w:jc w:val="center"/>
+            </w:pPr>
+          </w:p>
+        </w:tc>
+        <w:tc>
+          <w:tcPr>
+            <w:tcW w:type="dxa" w:w="680"/>
+            <w:vAlign w:val="center"/>
+            <w:tcMar>
+              <w:top w:w="65" w:type="dxa"/>
+              <w:bottom w:w="65" w:type="dxa"/>
+              <w:left w:w="65" w:type="dxa"/>
+              <w:right w:w="65" w:type="dxa"/>
+            </w:tcMar>
+          </w:tcPr>
+          <w:p>
+            <w:pPr>
+              <w:spacing w:before="40" w:after="40" w:line="240" w:lineRule="auto"/>
+              <w:jc w:val="center"/>
+            </w:pPr>
+          </w:p>
+        </w:tc>
+        <w:tc>
+          <w:tcPr>
+            <w:tcW w:type="dxa" w:w="680"/>
+            <w:vAlign w:val="center"/>
+            <w:tcMar>
+              <w:top w:w="65" w:type="dxa"/>
+              <w:bottom w:w="65" w:type="dxa"/>
+              <w:left w:w="65" w:type="dxa"/>
+              <w:right w:w="65" w:type="dxa"/>
+            </w:tcMar>
+          </w:tcPr>
+          <w:p>
+            <w:pPr>
+              <w:spacing w:before="40" w:after="40" w:line="240" w:lineRule="auto"/>
+              <w:jc w:val="center"/>
+            </w:pPr>
+          </w:p>
+        </w:tc>
+        <w:tc>
+          <w:tcPr>
+            <w:tcW w:type="dxa" w:w="680"/>
+            <w:vAlign w:val="center"/>
+            <w:tcMar>
+              <w:top w:w="65" w:type="dxa"/>
+              <w:bottom w:w="65" w:type="dxa"/>
+              <w:left w:w="65" w:type="dxa"/>
+              <w:right w:w="65" w:type="dxa"/>
+            </w:tcMar>
+          </w:tcPr>
+          <w:p>
+            <w:pPr>
+              <w:spacing w:before="40" w:after="40" w:line="240" w:lineRule="auto"/>
+              <w:jc w:val="center"/>
+            </w:pPr>
+            <w:r>
+              <w:rPr>
+                <w:rFonts w:ascii="Calibri" w:hAnsi="Calibri"/>
+                <w:sz w:val="18"/>
+              </w:rPr>
+              <w:t>X</w:t>
+            </w:r>
+          </w:p>
+        </w:tc>
+        <w:tc>
+          <w:tcPr>
+            <w:tcW w:type="dxa" w:w="680"/>
+            <w:vAlign w:val="center"/>
+            <w:tcMar>
+              <w:top w:w="65" w:type="dxa"/>
+              <w:bottom w:w="65" w:type="dxa"/>
+              <w:left w:w="65" w:type="dxa"/>
+              <w:right w:w="65" w:type="dxa"/>
+            </w:tcMar>
+          </w:tcPr>
+          <w:p>
+            <w:pPr>
+              <w:spacing w:before="40" w:after="40" w:line="240" w:lineRule="auto"/>
+              <w:jc w:val="center"/>
+            </w:pPr>
+          </w:p>
+        </w:tc>
+        <w:tc>
+          <w:tcPr>
+            <w:tcW w:type="dxa" w:w="680"/>
+            <w:vAlign w:val="center"/>
+            <w:tcMar>
+              <w:top w:w="65" w:type="dxa"/>
+              <w:bottom w:w="65" w:type="dxa"/>
+              <w:left w:w="65" w:type="dxa"/>
+              <w:right w:w="65" w:type="dxa"/>
+            </w:tcMar>
+          </w:tcPr>
+          <w:p>
+            <w:pPr>
+              <w:spacing w:before="40" w:after="40" w:line="240" w:lineRule="auto"/>
+              <w:jc w:val="center"/>
+            </w:pPr>
+          </w:p>
+        </w:tc>
+      </w:tr>
+      <w:tr>
+        <w:trPr>
+          <w:cantSplit/>
+        </w:trPr>
+        <w:tc>
+          <w:tcPr>
+            <w:tcW w:type="dxa" w:w="1871"/>
+            <w:vMerge/>
+          </w:tcPr>
+          <w:p/>
+        </w:tc>
+        <w:tc>
+          <w:tcPr>
+            <w:tcW w:type="dxa" w:w="3458"/>
+            <w:vAlign w:val="center"/>
+            <w:tcMar>
+              <w:top w:w="65" w:type="dxa"/>
+              <w:bottom w:w="65" w:type="dxa"/>
+              <w:left w:w="65" w:type="dxa"/>
+              <w:right w:w="65" w:type="dxa"/>
+            </w:tcMar>
+          </w:tcPr>
+          <w:p>
+            <w:pPr>
+              <w:spacing w:before="40" w:after="40" w:line="240" w:lineRule="auto"/>
+            </w:pPr>
+            <w:r>
+              <w:rPr>
+                <w:rFonts w:ascii="Calibri" w:hAnsi="Calibri"/>
+                <w:sz w:val="18"/>
+              </w:rPr>
+              <w:t>Identificar el paquete con el código del pedido</w:t>
+            </w:r>
+          </w:p>
+        </w:tc>
+        <w:tc>
+          <w:tcPr>
+            <w:tcW w:type="dxa" w:w="680"/>
+            <w:vAlign w:val="center"/>
+            <w:tcMar>
+              <w:top w:w="65" w:type="dxa"/>
+              <w:bottom w:w="65" w:type="dxa"/>
+              <w:left w:w="65" w:type="dxa"/>
+              <w:right w:w="65" w:type="dxa"/>
+            </w:tcMar>
+          </w:tcPr>
+          <w:p>
+            <w:pPr>
+              <w:spacing w:before="40" w:after="40" w:line="240" w:lineRule="auto"/>
+              <w:jc w:val="center"/>
+            </w:pPr>
+          </w:p>
+        </w:tc>
+        <w:tc>
+          <w:tcPr>
+            <w:tcW w:type="dxa" w:w="680"/>
+            <w:vAlign w:val="center"/>
+            <w:tcMar>
+              <w:top w:w="65" w:type="dxa"/>
+              <w:bottom w:w="65" w:type="dxa"/>
+              <w:left w:w="65" w:type="dxa"/>
+              <w:right w:w="65" w:type="dxa"/>
+            </w:tcMar>
+          </w:tcPr>
+          <w:p>
+            <w:pPr>
+              <w:spacing w:before="40" w:after="40" w:line="240" w:lineRule="auto"/>
+              <w:jc w:val="center"/>
+            </w:pPr>
+          </w:p>
+        </w:tc>
+        <w:tc>
+          <w:tcPr>
+            <w:tcW w:type="dxa" w:w="680"/>
+            <w:vAlign w:val="center"/>
+            <w:tcMar>
+              <w:top w:w="65" w:type="dxa"/>
+              <w:bottom w:w="65" w:type="dxa"/>
+              <w:left w:w="65" w:type="dxa"/>
+              <w:right w:w="65" w:type="dxa"/>
+            </w:tcMar>
+          </w:tcPr>
+          <w:p>
+            <w:pPr>
+              <w:spacing w:before="40" w:after="40" w:line="240" w:lineRule="auto"/>
+              <w:jc w:val="center"/>
+            </w:pPr>
+          </w:p>
+        </w:tc>
+        <w:tc>
+          <w:tcPr>
+            <w:tcW w:type="dxa" w:w="680"/>
+            <w:vAlign w:val="center"/>
+            <w:tcMar>
+              <w:top w:w="65" w:type="dxa"/>
+              <w:bottom w:w="65" w:type="dxa"/>
+              <w:left w:w="65" w:type="dxa"/>
+              <w:right w:w="65" w:type="dxa"/>
+            </w:tcMar>
+          </w:tcPr>
+          <w:p>
+            <w:pPr>
+              <w:spacing w:before="40" w:after="40" w:line="240" w:lineRule="auto"/>
+              <w:jc w:val="center"/>
+            </w:pPr>
+            <w:r>
+              <w:rPr>
+                <w:rFonts w:ascii="Calibri" w:hAnsi="Calibri"/>
+                <w:sz w:val="18"/>
+              </w:rPr>
+              <w:t>X</w:t>
+            </w:r>
+          </w:p>
+        </w:tc>
+        <w:tc>
+          <w:tcPr>
+            <w:tcW w:type="dxa" w:w="680"/>
+            <w:vAlign w:val="center"/>
+            <w:tcMar>
+              <w:top w:w="65" w:type="dxa"/>
+              <w:bottom w:w="65" w:type="dxa"/>
+              <w:left w:w="65" w:type="dxa"/>
+              <w:right w:w="65" w:type="dxa"/>
+            </w:tcMar>
+          </w:tcPr>
+          <w:p>
+            <w:pPr>
+              <w:spacing w:before="40" w:after="40" w:line="240" w:lineRule="auto"/>
+              <w:jc w:val="center"/>
+            </w:pPr>
+          </w:p>
+        </w:tc>
+        <w:tc>
+          <w:tcPr>
+            <w:tcW w:type="dxa" w:w="680"/>
+            <w:vAlign w:val="center"/>
+            <w:tcMar>
+              <w:top w:w="65" w:type="dxa"/>
+              <w:bottom w:w="65" w:type="dxa"/>
+              <w:left w:w="65" w:type="dxa"/>
+              <w:right w:w="65" w:type="dxa"/>
+            </w:tcMar>
+          </w:tcPr>
+          <w:p>
+            <w:pPr>
+              <w:spacing w:before="40" w:after="40" w:line="240" w:lineRule="auto"/>
+              <w:jc w:val="center"/>
+            </w:pPr>
+          </w:p>
+        </w:tc>
+      </w:tr>
+      <w:tr>
+        <w:trPr>
+          <w:cantSplit/>
+        </w:trPr>
+        <w:tc>
+          <w:tcPr>
+            <w:tcW w:type="dxa" w:w="1871"/>
+            <w:vMerge/>
+          </w:tcPr>
+          <w:p/>
+        </w:tc>
+        <w:tc>
+          <w:tcPr>
+            <w:tcW w:type="dxa" w:w="3458"/>
+            <w:vAlign w:val="center"/>
+            <w:tcMar>
+              <w:top w:w="65" w:type="dxa"/>
+              <w:bottom w:w="65" w:type="dxa"/>
+              <w:left w:w="65" w:type="dxa"/>
+              <w:right w:w="65" w:type="dxa"/>
+            </w:tcMar>
+          </w:tcPr>
+          <w:p>
+            <w:pPr>
+              <w:spacing w:before="40" w:after="40" w:line="240" w:lineRule="auto"/>
+            </w:pPr>
+            <w:r>
+              <w:rPr>
+                <w:rFonts w:ascii="Calibri" w:hAnsi="Calibri"/>
+                <w:sz w:val="18"/>
+              </w:rPr>
+              <w:t>Preparar la nota de despacho</w:t>
+            </w:r>
+          </w:p>
+        </w:tc>
+        <w:tc>
+          <w:tcPr>
+            <w:tcW w:type="dxa" w:w="680"/>
+            <w:vAlign w:val="center"/>
+            <w:tcMar>
+              <w:top w:w="65" w:type="dxa"/>
+              <w:bottom w:w="65" w:type="dxa"/>
+              <w:left w:w="65" w:type="dxa"/>
+              <w:right w:w="65" w:type="dxa"/>
+            </w:tcMar>
+          </w:tcPr>
+          <w:p>
+            <w:pPr>
+              <w:spacing w:before="40" w:after="40" w:line="240" w:lineRule="auto"/>
+              <w:jc w:val="center"/>
+            </w:pPr>
+          </w:p>
+        </w:tc>
+        <w:tc>
+          <w:tcPr>
+            <w:tcW w:type="dxa" w:w="680"/>
+            <w:vAlign w:val="center"/>
+            <w:tcMar>
+              <w:top w:w="65" w:type="dxa"/>
+              <w:bottom w:w="65" w:type="dxa"/>
+              <w:left w:w="65" w:type="dxa"/>
+              <w:right w:w="65" w:type="dxa"/>
+            </w:tcMar>
+          </w:tcPr>
+          <w:p>
+            <w:pPr>
+              <w:spacing w:before="40" w:after="40" w:line="240" w:lineRule="auto"/>
+              <w:jc w:val="center"/>
+            </w:pPr>
+          </w:p>
+        </w:tc>
+        <w:tc>
+          <w:tcPr>
+            <w:tcW w:type="dxa" w:w="680"/>
+            <w:vAlign w:val="center"/>
+            <w:tcMar>
+              <w:top w:w="65" w:type="dxa"/>
+              <w:bottom w:w="65" w:type="dxa"/>
+              <w:left w:w="65" w:type="dxa"/>
+              <w:right w:w="65" w:type="dxa"/>
+            </w:tcMar>
+          </w:tcPr>
+          <w:p>
+            <w:pPr>
+              <w:spacing w:before="40" w:after="40" w:line="240" w:lineRule="auto"/>
+              <w:jc w:val="center"/>
+            </w:pPr>
+          </w:p>
+        </w:tc>
+        <w:tc>
+          <w:tcPr>
+            <w:tcW w:type="dxa" w:w="680"/>
+            <w:vAlign w:val="center"/>
+            <w:tcMar>
+              <w:top w:w="65" w:type="dxa"/>
+              <w:bottom w:w="65" w:type="dxa"/>
+              <w:left w:w="65" w:type="dxa"/>
+              <w:right w:w="65" w:type="dxa"/>
+            </w:tcMar>
+          </w:tcPr>
+          <w:p>
+            <w:pPr>
+              <w:spacing w:before="40" w:after="40" w:line="240" w:lineRule="auto"/>
+              <w:jc w:val="center"/>
+            </w:pPr>
+            <w:r>
+              <w:rPr>
+                <w:rFonts w:ascii="Calibri" w:hAnsi="Calibri"/>
+                <w:sz w:val="18"/>
+              </w:rPr>
+              <w:t>X</w:t>
+            </w:r>
+          </w:p>
+        </w:tc>
+        <w:tc>
+          <w:tcPr>
+            <w:tcW w:type="dxa" w:w="680"/>
+            <w:vAlign w:val="center"/>
+            <w:tcMar>
+              <w:top w:w="65" w:type="dxa"/>
+              <w:bottom w:w="65" w:type="dxa"/>
+              <w:left w:w="65" w:type="dxa"/>
+              <w:right w:w="65" w:type="dxa"/>
+            </w:tcMar>
+          </w:tcPr>
+          <w:p>
+            <w:pPr>
+              <w:spacing w:before="40" w:after="40" w:line="240" w:lineRule="auto"/>
+              <w:jc w:val="center"/>
+            </w:pPr>
+          </w:p>
+        </w:tc>
+        <w:tc>
+          <w:tcPr>
+            <w:tcW w:type="dxa" w:w="680"/>
+            <w:vAlign w:val="center"/>
+            <w:tcMar>
+              <w:top w:w="65" w:type="dxa"/>
+              <w:bottom w:w="65" w:type="dxa"/>
+              <w:left w:w="65" w:type="dxa"/>
+              <w:right w:w="65" w:type="dxa"/>
+            </w:tcMar>
+          </w:tcPr>
+          <w:p>
+            <w:pPr>
+              <w:spacing w:before="40" w:after="40" w:line="240" w:lineRule="auto"/>
+              <w:jc w:val="center"/>
+            </w:pPr>
+          </w:p>
+        </w:tc>
+      </w:tr>
+      <w:tr>
+        <w:trPr>
+          <w:cantSplit/>
+        </w:trPr>
+        <w:tc>
+          <w:tcPr>
+            <w:tcW w:type="dxa" w:w="1871"/>
+            <w:vMerge w:val="restart"/>
+            <w:vAlign w:val="center"/>
+            <w:tcMar>
+              <w:top w:w="65" w:type="dxa"/>
+              <w:bottom w:w="65" w:type="dxa"/>
+              <w:left w:w="65" w:type="dxa"/>
+              <w:right w:w="65" w:type="dxa"/>
+            </w:tcMar>
+            <w:tcMar>
+              <w:top w:w="65" w:type="dxa"/>
+              <w:bottom w:w="65" w:type="dxa"/>
+              <w:left w:w="65" w:type="dxa"/>
+              <w:right w:w="65" w:type="dxa"/>
+            </w:tcMar>
+            <w:tcMar>
+              <w:top w:w="65" w:type="dxa"/>
+              <w:bottom w:w="65" w:type="dxa"/>
+              <w:left w:w="65" w:type="dxa"/>
+              <w:right w:w="65" w:type="dxa"/>
+            </w:tcMar>
+          </w:tcPr>
+          <w:p>
+            <w:pPr>
+              <w:spacing w:before="40" w:after="40" w:line="240" w:lineRule="auto"/>
+            </w:pPr>
+            <w:r>
+              <w:rPr>
+                <w:rFonts w:ascii="Calibri" w:hAnsi="Calibri"/>
+                <w:sz w:val="18"/>
+              </w:rPr>
+              <w:t>Despachar pedido</w:t>
+            </w:r>
+          </w:p>
+        </w:tc>
+        <w:tc>
+          <w:tcPr>
+            <w:tcW w:type="dxa" w:w="3458"/>
+            <w:vAlign w:val="center"/>
+            <w:tcMar>
+              <w:top w:w="65" w:type="dxa"/>
+              <w:bottom w:w="65" w:type="dxa"/>
+              <w:left w:w="65" w:type="dxa"/>
+              <w:right w:w="65" w:type="dxa"/>
+            </w:tcMar>
+          </w:tcPr>
+          <w:p>
+            <w:pPr>
+              <w:spacing w:before="40" w:after="40" w:line="240" w:lineRule="auto"/>
+            </w:pPr>
+            <w:r>
+              <w:rPr>
+                <w:rFonts w:ascii="Calibri" w:hAnsi="Calibri"/>
+                <w:sz w:val="18"/>
+              </w:rPr>
+              <w:t>Entregar el paquete y la nota a transportes</w:t>
+            </w:r>
+          </w:p>
+        </w:tc>
+        <w:tc>
+          <w:tcPr>
+            <w:tcW w:type="dxa" w:w="680"/>
+            <w:vAlign w:val="center"/>
+            <w:tcMar>
+              <w:top w:w="65" w:type="dxa"/>
+              <w:bottom w:w="65" w:type="dxa"/>
+              <w:left w:w="65" w:type="dxa"/>
+              <w:right w:w="65" w:type="dxa"/>
+            </w:tcMar>
+          </w:tcPr>
+          <w:p>
+            <w:pPr>
+              <w:spacing w:before="40" w:after="40" w:line="240" w:lineRule="auto"/>
+              <w:jc w:val="center"/>
+            </w:pPr>
+          </w:p>
+        </w:tc>
+        <w:tc>
+          <w:tcPr>
+            <w:tcW w:type="dxa" w:w="680"/>
+            <w:vAlign w:val="center"/>
+            <w:tcMar>
+              <w:top w:w="65" w:type="dxa"/>
+              <w:bottom w:w="65" w:type="dxa"/>
+              <w:left w:w="65" w:type="dxa"/>
+              <w:right w:w="65" w:type="dxa"/>
+            </w:tcMar>
+          </w:tcPr>
+          <w:p>
+            <w:pPr>
+              <w:spacing w:before="40" w:after="40" w:line="240" w:lineRule="auto"/>
+              <w:jc w:val="center"/>
+            </w:pPr>
+          </w:p>
+        </w:tc>
+        <w:tc>
+          <w:tcPr>
+            <w:tcW w:type="dxa" w:w="680"/>
+            <w:vAlign w:val="center"/>
+            <w:tcMar>
+              <w:top w:w="65" w:type="dxa"/>
+              <w:bottom w:w="65" w:type="dxa"/>
+              <w:left w:w="65" w:type="dxa"/>
+              <w:right w:w="65" w:type="dxa"/>
+            </w:tcMar>
+          </w:tcPr>
+          <w:p>
+            <w:pPr>
+              <w:spacing w:before="40" w:after="40" w:line="240" w:lineRule="auto"/>
+              <w:jc w:val="center"/>
+            </w:pPr>
+          </w:p>
+        </w:tc>
+        <w:tc>
+          <w:tcPr>
+            <w:tcW w:type="dxa" w:w="680"/>
+            <w:vAlign w:val="center"/>
+            <w:tcMar>
+              <w:top w:w="65" w:type="dxa"/>
+              <w:bottom w:w="65" w:type="dxa"/>
+              <w:left w:w="65" w:type="dxa"/>
+              <w:right w:w="65" w:type="dxa"/>
+            </w:tcMar>
+          </w:tcPr>
+          <w:p>
+            <w:pPr>
+              <w:spacing w:before="40" w:after="40" w:line="240" w:lineRule="auto"/>
+              <w:jc w:val="center"/>
+            </w:pPr>
+            <w:r>
+              <w:rPr>
+                <w:rFonts w:ascii="Calibri" w:hAnsi="Calibri"/>
+                <w:sz w:val="18"/>
+              </w:rPr>
+              <w:t>X</w:t>
+            </w:r>
+          </w:p>
+        </w:tc>
+        <w:tc>
+          <w:tcPr>
+            <w:tcW w:type="dxa" w:w="680"/>
+            <w:vAlign w:val="center"/>
+            <w:tcMar>
+              <w:top w:w="65" w:type="dxa"/>
+              <w:bottom w:w="65" w:type="dxa"/>
+              <w:left w:w="65" w:type="dxa"/>
+              <w:right w:w="65" w:type="dxa"/>
+            </w:tcMar>
+          </w:tcPr>
+          <w:p>
+            <w:pPr>
+              <w:spacing w:before="40" w:after="40" w:line="240" w:lineRule="auto"/>
+              <w:jc w:val="center"/>
+            </w:pPr>
+            <w:r>
+              <w:rPr>
+                <w:rFonts w:ascii="Calibri" w:hAnsi="Calibri"/>
+                <w:sz w:val="18"/>
+              </w:rPr>
+              <w:t>X</w:t>
+            </w:r>
+          </w:p>
+        </w:tc>
+        <w:tc>
+          <w:tcPr>
+            <w:tcW w:type="dxa" w:w="680"/>
+            <w:vAlign w:val="center"/>
+            <w:tcMar>
+              <w:top w:w="65" w:type="dxa"/>
+              <w:bottom w:w="65" w:type="dxa"/>
+              <w:left w:w="65" w:type="dxa"/>
+              <w:right w:w="65" w:type="dxa"/>
+            </w:tcMar>
+          </w:tcPr>
+          <w:p>
+            <w:pPr>
+              <w:spacing w:before="40" w:after="40" w:line="240" w:lineRule="auto"/>
+              <w:jc w:val="center"/>
+            </w:pPr>
+          </w:p>
+        </w:tc>
+      </w:tr>
+      <w:tr>
+        <w:trPr>
+          <w:cantSplit/>
+        </w:trPr>
+        <w:tc>
+          <w:tcPr>
+            <w:tcW w:type="dxa" w:w="1871"/>
+            <w:vMerge/>
+          </w:tcPr>
+          <w:p/>
+        </w:tc>
+        <w:tc>
+          <w:tcPr>
+            <w:tcW w:type="dxa" w:w="3458"/>
+            <w:vAlign w:val="center"/>
+            <w:tcMar>
+              <w:top w:w="65" w:type="dxa"/>
+              <w:bottom w:w="65" w:type="dxa"/>
+              <w:left w:w="65" w:type="dxa"/>
+              <w:right w:w="65" w:type="dxa"/>
+            </w:tcMar>
+          </w:tcPr>
+          <w:p>
+            <w:pPr>
+              <w:spacing w:before="40" w:after="40" w:line="240" w:lineRule="auto"/>
+            </w:pPr>
+            <w:r>
+              <w:rPr>
+                <w:rFonts w:ascii="Calibri" w:hAnsi="Calibri"/>
+                <w:sz w:val="18"/>
+              </w:rPr>
+              <w:t>Comunicar la salida del almacén</w:t>
+            </w:r>
+          </w:p>
+        </w:tc>
+        <w:tc>
+          <w:tcPr>
+            <w:tcW w:type="dxa" w:w="680"/>
+            <w:vAlign w:val="center"/>
+            <w:tcMar>
+              <w:top w:w="65" w:type="dxa"/>
+              <w:bottom w:w="65" w:type="dxa"/>
+              <w:left w:w="65" w:type="dxa"/>
+              <w:right w:w="65" w:type="dxa"/>
+            </w:tcMar>
+          </w:tcPr>
+          <w:p>
+            <w:pPr>
+              <w:spacing w:before="40" w:after="40" w:line="240" w:lineRule="auto"/>
+              <w:jc w:val="center"/>
+            </w:pPr>
+          </w:p>
+        </w:tc>
+        <w:tc>
+          <w:tcPr>
+            <w:tcW w:type="dxa" w:w="680"/>
+            <w:vAlign w:val="center"/>
+            <w:tcMar>
+              <w:top w:w="65" w:type="dxa"/>
+              <w:bottom w:w="65" w:type="dxa"/>
+              <w:left w:w="65" w:type="dxa"/>
+              <w:right w:w="65" w:type="dxa"/>
+            </w:tcMar>
+          </w:tcPr>
+          <w:p>
+            <w:pPr>
+              <w:spacing w:before="40" w:after="40" w:line="240" w:lineRule="auto"/>
+              <w:jc w:val="center"/>
+            </w:pPr>
+          </w:p>
+        </w:tc>
+        <w:tc>
+          <w:tcPr>
+            <w:tcW w:type="dxa" w:w="680"/>
+            <w:vAlign w:val="center"/>
+            <w:tcMar>
+              <w:top w:w="65" w:type="dxa"/>
+              <w:bottom w:w="65" w:type="dxa"/>
+              <w:left w:w="65" w:type="dxa"/>
+              <w:right w:w="65" w:type="dxa"/>
+            </w:tcMar>
+          </w:tcPr>
+          <w:p>
+            <w:pPr>
+              <w:spacing w:before="40" w:after="40" w:line="240" w:lineRule="auto"/>
+              <w:jc w:val="center"/>
+            </w:pPr>
+          </w:p>
+        </w:tc>
+        <w:tc>
+          <w:tcPr>
+            <w:tcW w:type="dxa" w:w="680"/>
+            <w:vAlign w:val="center"/>
+            <w:tcMar>
+              <w:top w:w="65" w:type="dxa"/>
+              <w:bottom w:w="65" w:type="dxa"/>
+              <w:left w:w="65" w:type="dxa"/>
+              <w:right w:w="65" w:type="dxa"/>
+            </w:tcMar>
+          </w:tcPr>
+          <w:p>
+            <w:pPr>
+              <w:spacing w:before="40" w:after="40" w:line="240" w:lineRule="auto"/>
+              <w:jc w:val="center"/>
+            </w:pPr>
+            <w:r>
+              <w:rPr>
+                <w:rFonts w:ascii="Calibri" w:hAnsi="Calibri"/>
+                <w:sz w:val="18"/>
+              </w:rPr>
+              <w:t>X</w:t>
+            </w:r>
+          </w:p>
+        </w:tc>
+        <w:tc>
+          <w:tcPr>
+            <w:tcW w:type="dxa" w:w="680"/>
+            <w:vAlign w:val="center"/>
+            <w:tcMar>
+              <w:top w:w="65" w:type="dxa"/>
+              <w:bottom w:w="65" w:type="dxa"/>
+              <w:left w:w="65" w:type="dxa"/>
+              <w:right w:w="65" w:type="dxa"/>
+            </w:tcMar>
+          </w:tcPr>
+          <w:p>
+            <w:pPr>
+              <w:spacing w:before="40" w:after="40" w:line="240" w:lineRule="auto"/>
+              <w:jc w:val="center"/>
+            </w:pPr>
+          </w:p>
+        </w:tc>
+        <w:tc>
+          <w:tcPr>
+            <w:tcW w:type="dxa" w:w="680"/>
+            <w:vAlign w:val="center"/>
+            <w:tcMar>
+              <w:top w:w="65" w:type="dxa"/>
+              <w:bottom w:w="65" w:type="dxa"/>
+              <w:left w:w="65" w:type="dxa"/>
+              <w:right w:w="65" w:type="dxa"/>
+            </w:tcMar>
+          </w:tcPr>
+          <w:p>
+            <w:pPr>
+              <w:spacing w:before="40" w:after="40" w:line="240" w:lineRule="auto"/>
+              <w:jc w:val="center"/>
+            </w:pPr>
+          </w:p>
+        </w:tc>
+      </w:tr>
+      <w:tr>
+        <w:trPr>
+          <w:cantSplit/>
+        </w:trPr>
+        <w:tc>
+          <w:tcPr>
+            <w:tcW w:type="dxa" w:w="1871"/>
+            <w:vMerge/>
+          </w:tcPr>
+          <w:p/>
+        </w:tc>
+        <w:tc>
+          <w:tcPr>
+            <w:tcW w:type="dxa" w:w="3458"/>
+            <w:vAlign w:val="center"/>
+            <w:tcMar>
+              <w:top w:w="65" w:type="dxa"/>
+              <w:bottom w:w="65" w:type="dxa"/>
+              <w:left w:w="65" w:type="dxa"/>
+              <w:right w:w="65" w:type="dxa"/>
+            </w:tcMar>
+          </w:tcPr>
+          <w:p>
+            <w:pPr>
+              <w:spacing w:before="40" w:after="40" w:line="240" w:lineRule="auto"/>
+            </w:pPr>
+            <w:r>
+              <w:rPr>
+                <w:rFonts w:ascii="Calibri" w:hAnsi="Calibri"/>
+                <w:sz w:val="18"/>
+              </w:rPr>
+              <w:t>Marcar como atendido y habilitar facturación</w:t>
+            </w:r>
+          </w:p>
+        </w:tc>
+        <w:tc>
+          <w:tcPr>
+            <w:tcW w:type="dxa" w:w="680"/>
+            <w:vAlign w:val="center"/>
+            <w:tcMar>
+              <w:top w:w="65" w:type="dxa"/>
+              <w:bottom w:w="65" w:type="dxa"/>
+              <w:left w:w="65" w:type="dxa"/>
+              <w:right w:w="65" w:type="dxa"/>
+            </w:tcMar>
+          </w:tcPr>
+          <w:p>
+            <w:pPr>
+              <w:spacing w:before="40" w:after="40" w:line="240" w:lineRule="auto"/>
+              <w:jc w:val="center"/>
+            </w:pPr>
+          </w:p>
+        </w:tc>
+        <w:tc>
+          <w:tcPr>
+            <w:tcW w:type="dxa" w:w="680"/>
+            <w:vAlign w:val="center"/>
+            <w:tcMar>
+              <w:top w:w="65" w:type="dxa"/>
+              <w:bottom w:w="65" w:type="dxa"/>
+              <w:left w:w="65" w:type="dxa"/>
+              <w:right w:w="65" w:type="dxa"/>
+            </w:tcMar>
+          </w:tcPr>
+          <w:p>
+            <w:pPr>
+              <w:spacing w:before="40" w:after="40" w:line="240" w:lineRule="auto"/>
+              <w:jc w:val="center"/>
+            </w:pPr>
+          </w:p>
+        </w:tc>
+        <w:tc>
+          <w:tcPr>
+            <w:tcW w:type="dxa" w:w="680"/>
+            <w:vAlign w:val="center"/>
+            <w:tcMar>
+              <w:top w:w="65" w:type="dxa"/>
+              <w:bottom w:w="65" w:type="dxa"/>
+              <w:left w:w="65" w:type="dxa"/>
+              <w:right w:w="65" w:type="dxa"/>
+            </w:tcMar>
+          </w:tcPr>
+          <w:p>
+            <w:pPr>
+              <w:spacing w:before="40" w:after="40" w:line="240" w:lineRule="auto"/>
+              <w:jc w:val="center"/>
+            </w:pPr>
+            <w:r>
+              <w:rPr>
+                <w:rFonts w:ascii="Calibri" w:hAnsi="Calibri"/>
+                <w:sz w:val="18"/>
+              </w:rPr>
+              <w:t>X</w:t>
+            </w:r>
+          </w:p>
+        </w:tc>
+        <w:tc>
+          <w:tcPr>
+            <w:tcW w:type="dxa" w:w="680"/>
+            <w:vAlign w:val="center"/>
+            <w:tcMar>
+              <w:top w:w="65" w:type="dxa"/>
+              <w:bottom w:w="65" w:type="dxa"/>
+              <w:left w:w="65" w:type="dxa"/>
+              <w:right w:w="65" w:type="dxa"/>
+            </w:tcMar>
+          </w:tcPr>
+          <w:p>
+            <w:pPr>
+              <w:spacing w:before="40" w:after="40" w:line="240" w:lineRule="auto"/>
+              <w:jc w:val="center"/>
+            </w:pPr>
+          </w:p>
+        </w:tc>
+        <w:tc>
+          <w:tcPr>
+            <w:tcW w:type="dxa" w:w="680"/>
+            <w:vAlign w:val="center"/>
+            <w:tcMar>
+              <w:top w:w="65" w:type="dxa"/>
+              <w:bottom w:w="65" w:type="dxa"/>
+              <w:left w:w="65" w:type="dxa"/>
+              <w:right w:w="65" w:type="dxa"/>
+            </w:tcMar>
+          </w:tcPr>
+          <w:p>
+            <w:pPr>
+              <w:spacing w:before="40" w:after="40" w:line="240" w:lineRule="auto"/>
+              <w:jc w:val="center"/>
+            </w:pPr>
+          </w:p>
+        </w:tc>
+        <w:tc>
+          <w:tcPr>
+            <w:tcW w:type="dxa" w:w="680"/>
+            <w:vAlign w:val="center"/>
+            <w:tcMar>
+              <w:top w:w="65" w:type="dxa"/>
+              <w:bottom w:w="65" w:type="dxa"/>
+              <w:left w:w="65" w:type="dxa"/>
+              <w:right w:w="65" w:type="dxa"/>
+            </w:tcMar>
+          </w:tcPr>
+          <w:p>
+            <w:pPr>
+              <w:spacing w:before="40" w:after="40" w:line="240" w:lineRule="auto"/>
+              <w:jc w:val="center"/>
+            </w:pPr>
+          </w:p>
+        </w:tc>
+      </w:tr>
+      <w:tr>
+        <w:trPr>
+          <w:cantSplit/>
+        </w:trPr>
+        <w:tc>
+          <w:tcPr>
+            <w:tcW w:type="dxa" w:w="1871"/>
+            <w:vMerge w:val="restart"/>
+            <w:vAlign w:val="center"/>
+            <w:tcMar>
+              <w:top w:w="65" w:type="dxa"/>
+              <w:bottom w:w="65" w:type="dxa"/>
+              <w:left w:w="65" w:type="dxa"/>
+              <w:right w:w="65" w:type="dxa"/>
+            </w:tcMar>
+            <w:tcMar>
+              <w:top w:w="65" w:type="dxa"/>
+              <w:bottom w:w="65" w:type="dxa"/>
+              <w:left w:w="65" w:type="dxa"/>
+              <w:right w:w="65" w:type="dxa"/>
+            </w:tcMar>
+          </w:tcPr>
+          <w:p>
+            <w:pPr>
+              <w:spacing w:before="40" w:after="40" w:line="240" w:lineRule="auto"/>
+            </w:pPr>
+            <w:r>
+              <w:rPr>
+                <w:rFonts w:ascii="Calibri" w:hAnsi="Calibri"/>
+                <w:sz w:val="18"/>
+              </w:rPr>
+              <w:t>Facturar pedido</w:t>
+            </w:r>
+          </w:p>
+        </w:tc>
+        <w:tc>
+          <w:tcPr>
+            <w:tcW w:type="dxa" w:w="3458"/>
+            <w:vAlign w:val="center"/>
+            <w:tcMar>
+              <w:top w:w="65" w:type="dxa"/>
+              <w:bottom w:w="65" w:type="dxa"/>
+              <w:left w:w="65" w:type="dxa"/>
+              <w:right w:w="65" w:type="dxa"/>
+            </w:tcMar>
+          </w:tcPr>
+          <w:p>
+            <w:pPr>
+              <w:spacing w:before="40" w:after="40" w:line="240" w:lineRule="auto"/>
+            </w:pPr>
+            <w:r>
+              <w:rPr>
+                <w:rFonts w:ascii="Calibri" w:hAnsi="Calibri"/>
+                <w:sz w:val="18"/>
+              </w:rPr>
+              <w:t>Preparar y enviar la factura</w:t>
+            </w:r>
+          </w:p>
+        </w:tc>
+        <w:tc>
+          <w:tcPr>
+            <w:tcW w:type="dxa" w:w="680"/>
+            <w:vAlign w:val="center"/>
+            <w:tcMar>
+              <w:top w:w="65" w:type="dxa"/>
+              <w:bottom w:w="65" w:type="dxa"/>
+              <w:left w:w="65" w:type="dxa"/>
+              <w:right w:w="65" w:type="dxa"/>
+            </w:tcMar>
+          </w:tcPr>
+          <w:p>
+            <w:pPr>
+              <w:spacing w:before="40" w:after="40" w:line="240" w:lineRule="auto"/>
+              <w:jc w:val="center"/>
+            </w:pPr>
+          </w:p>
+        </w:tc>
+        <w:tc>
+          <w:tcPr>
+            <w:tcW w:type="dxa" w:w="680"/>
+            <w:vAlign w:val="center"/>
+            <w:tcMar>
+              <w:top w:w="65" w:type="dxa"/>
+              <w:bottom w:w="65" w:type="dxa"/>
+              <w:left w:w="65" w:type="dxa"/>
+              <w:right w:w="65" w:type="dxa"/>
+            </w:tcMar>
+          </w:tcPr>
+          <w:p>
+            <w:pPr>
+              <w:spacing w:before="40" w:after="40" w:line="240" w:lineRule="auto"/>
+              <w:jc w:val="center"/>
+            </w:pPr>
+          </w:p>
+        </w:tc>
+        <w:tc>
+          <w:tcPr>
+            <w:tcW w:type="dxa" w:w="680"/>
+            <w:vAlign w:val="center"/>
+            <w:tcMar>
+              <w:top w:w="65" w:type="dxa"/>
+              <w:bottom w:w="65" w:type="dxa"/>
+              <w:left w:w="65" w:type="dxa"/>
+              <w:right w:w="65" w:type="dxa"/>
+            </w:tcMar>
+          </w:tcPr>
+          <w:p>
+            <w:pPr>
+              <w:spacing w:before="40" w:after="40" w:line="240" w:lineRule="auto"/>
+              <w:jc w:val="center"/>
+            </w:pPr>
+          </w:p>
+        </w:tc>
+        <w:tc>
+          <w:tcPr>
+            <w:tcW w:type="dxa" w:w="680"/>
+            <w:vAlign w:val="center"/>
+            <w:tcMar>
+              <w:top w:w="65" w:type="dxa"/>
+              <w:bottom w:w="65" w:type="dxa"/>
+              <w:left w:w="65" w:type="dxa"/>
+              <w:right w:w="65" w:type="dxa"/>
+            </w:tcMar>
+          </w:tcPr>
+          <w:p>
+            <w:pPr>
+              <w:spacing w:before="40" w:after="40" w:line="240" w:lineRule="auto"/>
+              <w:jc w:val="center"/>
+            </w:pPr>
+          </w:p>
+        </w:tc>
+        <w:tc>
+          <w:tcPr>
+            <w:tcW w:type="dxa" w:w="680"/>
+            <w:vAlign w:val="center"/>
+            <w:tcMar>
+              <w:top w:w="65" w:type="dxa"/>
+              <w:bottom w:w="65" w:type="dxa"/>
+              <w:left w:w="65" w:type="dxa"/>
+              <w:right w:w="65" w:type="dxa"/>
+            </w:tcMar>
+          </w:tcPr>
+          <w:p>
+            <w:pPr>
+              <w:spacing w:before="40" w:after="40" w:line="240" w:lineRule="auto"/>
+              <w:jc w:val="center"/>
+            </w:pPr>
+          </w:p>
+        </w:tc>
+        <w:tc>
+          <w:tcPr>
+            <w:tcW w:type="dxa" w:w="680"/>
+            <w:vAlign w:val="center"/>
+            <w:tcMar>
+              <w:top w:w="65" w:type="dxa"/>
+              <w:bottom w:w="65" w:type="dxa"/>
+              <w:left w:w="65" w:type="dxa"/>
+              <w:right w:w="65" w:type="dxa"/>
+            </w:tcMar>
+          </w:tcPr>
+          <w:p>
+            <w:pPr>
+              <w:spacing w:before="40" w:after="40" w:line="240" w:lineRule="auto"/>
+              <w:jc w:val="center"/>
+            </w:pPr>
+            <w:r>
+              <w:rPr>
+                <w:rFonts w:ascii="Calibri" w:hAnsi="Calibri"/>
+                <w:sz w:val="18"/>
+              </w:rPr>
+              <w:t>X</w:t>
             </w:r>
           </w:p>
         </w:tc>
@@ -898,262 +3239,148 @@
         </w:trPr>
         <w:tc>
           <w:tcPr>
-            <w:tcW w:type="dxa" w:w="3175"/>
+            <w:tcW w:type="dxa" w:w="1871"/>
+            <w:vMerge/>
+          </w:tcPr>
+          <w:p/>
+        </w:tc>
+        <w:tc>
+          <w:tcPr>
+            <w:tcW w:type="dxa" w:w="3458"/>
+            <w:vAlign w:val="center"/>
+            <w:tcMar>
+              <w:top w:w="65" w:type="dxa"/>
+              <w:bottom w:w="65" w:type="dxa"/>
+              <w:left w:w="65" w:type="dxa"/>
+              <w:right w:w="65" w:type="dxa"/>
+            </w:tcMar>
           </w:tcPr>
           <w:p>
             <w:pPr>
-              <w:spacing w:before="120" w:after="120"/>
+              <w:spacing w:before="40" w:after="40" w:line="240" w:lineRule="auto"/>
             </w:pPr>
             <w:r>
               <w:rPr>
-                <w:sz w:val="21"/>
+                <w:rFonts w:ascii="Calibri" w:hAnsi="Calibri"/>
+                <w:sz w:val="18"/>
               </w:rPr>
-              <w:t>Vendedor y operadora</w:t>
+              <w:t>Recibir la factura</w:t>
             </w:r>
           </w:p>
         </w:tc>
         <w:tc>
           <w:tcPr>
-            <w:tcW w:type="dxa" w:w="2835"/>
+            <w:tcW w:type="dxa" w:w="680"/>
+            <w:vAlign w:val="center"/>
+            <w:tcMar>
+              <w:top w:w="65" w:type="dxa"/>
+              <w:bottom w:w="65" w:type="dxa"/>
+              <w:left w:w="65" w:type="dxa"/>
+              <w:right w:w="65" w:type="dxa"/>
+            </w:tcMar>
           </w:tcPr>
           <w:p>
             <w:pPr>
-              <w:spacing w:before="120" w:after="120"/>
+              <w:spacing w:before="40" w:after="40" w:line="240" w:lineRule="auto"/>
+              <w:jc w:val="center"/>
             </w:pPr>
             <w:r>
               <w:rPr>
-                <w:sz w:val="21"/>
+                <w:rFonts w:ascii="Calibri" w:hAnsi="Calibri"/>
+                <w:sz w:val="18"/>
               </w:rPr>
-              <w:t>Evaluación del pedido</w:t>
+              <w:t>X</w:t>
             </w:r>
           </w:p>
         </w:tc>
         <w:tc>
           <w:tcPr>
-            <w:tcW w:type="dxa" w:w="3402"/>
+            <w:tcW w:type="dxa" w:w="680"/>
+            <w:vAlign w:val="center"/>
+            <w:tcMar>
+              <w:top w:w="65" w:type="dxa"/>
+              <w:bottom w:w="65" w:type="dxa"/>
+              <w:left w:w="65" w:type="dxa"/>
+              <w:right w:w="65" w:type="dxa"/>
+            </w:tcMar>
           </w:tcPr>
           <w:p>
             <w:pPr>
-              <w:spacing w:before="120" w:after="120"/>
+              <w:spacing w:before="40" w:after="40" w:line="240" w:lineRule="auto"/>
+              <w:jc w:val="center"/>
             </w:pPr>
-            <w:r>
-              <w:rPr>
-                <w:sz w:val="21"/>
-              </w:rPr>
-              <w:t>Evaluar y registrar pedido</w:t>
-            </w:r>
-          </w:p>
-        </w:tc>
-      </w:tr>
-      <w:tr>
-        <w:trPr>
-          <w:cantSplit/>
-        </w:trPr>
-        <w:tc>
-          <w:tcPr>
-            <w:tcW w:type="dxa" w:w="3175"/>
-          </w:tcPr>
-          <w:p>
-            <w:pPr>
-              <w:spacing w:before="120" w:after="120"/>
-            </w:pPr>
-            <w:r>
-              <w:rPr>
-                <w:sz w:val="21"/>
-              </w:rPr>
-              <w:t>Vendedor y operadora</w:t>
-            </w:r>
           </w:p>
         </w:tc>
         <w:tc>
           <w:tcPr>
-            <w:tcW w:type="dxa" w:w="2835"/>
+            <w:tcW w:type="dxa" w:w="680"/>
+            <w:vAlign w:val="center"/>
+            <w:tcMar>
+              <w:top w:w="65" w:type="dxa"/>
+              <w:bottom w:w="65" w:type="dxa"/>
+              <w:left w:w="65" w:type="dxa"/>
+              <w:right w:w="65" w:type="dxa"/>
+            </w:tcMar>
           </w:tcPr>
           <w:p>
             <w:pPr>
-              <w:spacing w:before="120" w:after="120"/>
+              <w:spacing w:before="40" w:after="40" w:line="240" w:lineRule="auto"/>
+              <w:jc w:val="center"/>
             </w:pPr>
-            <w:r>
-              <w:rPr>
-                <w:sz w:val="21"/>
-              </w:rPr>
-              <w:t>Revisión del formato</w:t>
-            </w:r>
           </w:p>
         </w:tc>
         <w:tc>
           <w:tcPr>
-            <w:tcW w:type="dxa" w:w="3402"/>
+            <w:tcW w:type="dxa" w:w="680"/>
+            <w:vAlign w:val="center"/>
+            <w:tcMar>
+              <w:top w:w="65" w:type="dxa"/>
+              <w:bottom w:w="65" w:type="dxa"/>
+              <w:left w:w="65" w:type="dxa"/>
+              <w:right w:w="65" w:type="dxa"/>
+            </w:tcMar>
           </w:tcPr>
           <w:p>
             <w:pPr>
-              <w:spacing w:before="120" w:after="120"/>
+              <w:spacing w:before="40" w:after="40" w:line="240" w:lineRule="auto"/>
+              <w:jc w:val="center"/>
             </w:pPr>
-            <w:r>
-              <w:rPr>
-                <w:sz w:val="21"/>
-              </w:rPr>
-              <w:t>Verificar pedido impreso</w:t>
-            </w:r>
-          </w:p>
-        </w:tc>
-      </w:tr>
-      <w:tr>
-        <w:trPr>
-          <w:cantSplit/>
-        </w:trPr>
-        <w:tc>
-          <w:tcPr>
-            <w:tcW w:type="dxa" w:w="3175"/>
-          </w:tcPr>
-          <w:p>
-            <w:pPr>
-              <w:spacing w:before="120" w:after="120"/>
-            </w:pPr>
-            <w:r>
-              <w:rPr>
-                <w:sz w:val="21"/>
-              </w:rPr>
-              <w:t>Despachador</w:t>
-            </w:r>
           </w:p>
         </w:tc>
         <w:tc>
           <w:tcPr>
-            <w:tcW w:type="dxa" w:w="2835"/>
+            <w:tcW w:type="dxa" w:w="680"/>
+            <w:vAlign w:val="center"/>
+            <w:tcMar>
+              <w:top w:w="65" w:type="dxa"/>
+              <w:bottom w:w="65" w:type="dxa"/>
+              <w:left w:w="65" w:type="dxa"/>
+              <w:right w:w="65" w:type="dxa"/>
+            </w:tcMar>
           </w:tcPr>
           <w:p>
             <w:pPr>
-              <w:spacing w:before="120" w:after="120"/>
+              <w:spacing w:before="40" w:after="40" w:line="240" w:lineRule="auto"/>
+              <w:jc w:val="center"/>
             </w:pPr>
-            <w:r>
-              <w:rPr>
-                <w:sz w:val="21"/>
-              </w:rPr>
-              <w:t>Preparación del paquete</w:t>
-            </w:r>
           </w:p>
         </w:tc>
         <w:tc>
           <w:tcPr>
-            <w:tcW w:type="dxa" w:w="3402"/>
+            <w:tcW w:type="dxa" w:w="680"/>
+            <w:vAlign w:val="center"/>
+            <w:tcMar>
+              <w:top w:w="65" w:type="dxa"/>
+              <w:bottom w:w="65" w:type="dxa"/>
+              <w:left w:w="65" w:type="dxa"/>
+              <w:right w:w="65" w:type="dxa"/>
+            </w:tcMar>
           </w:tcPr>
           <w:p>
             <w:pPr>
-              <w:spacing w:before="120" w:after="120"/>
+              <w:spacing w:before="40" w:after="40" w:line="240" w:lineRule="auto"/>
+              <w:jc w:val="center"/>
             </w:pPr>
-            <w:r>
-              <w:rPr>
-                <w:sz w:val="21"/>
-              </w:rPr>
-              <w:t>Preparar y embalar pedido</w:t>
-            </w:r>
-          </w:p>
-        </w:tc>
-      </w:tr>
-      <w:tr>
-        <w:trPr>
-          <w:cantSplit/>
-        </w:trPr>
-        <w:tc>
-          <w:tcPr>
-            <w:tcW w:type="dxa" w:w="3175"/>
-          </w:tcPr>
-          <w:p>
-            <w:pPr>
-              <w:spacing w:before="120" w:after="120"/>
-            </w:pPr>
-            <w:r>
-              <w:rPr>
-                <w:sz w:val="21"/>
-              </w:rPr>
-              <w:t>Despachador, transportes y operadora</w:t>
-            </w:r>
-          </w:p>
-        </w:tc>
-        <w:tc>
-          <w:tcPr>
-            <w:tcW w:type="dxa" w:w="2835"/>
-          </w:tcPr>
-          <w:p>
-            <w:pPr>
-              <w:spacing w:before="120" w:after="120"/>
-            </w:pPr>
-            <w:r>
-              <w:rPr>
-                <w:sz w:val="21"/>
-              </w:rPr>
-              <w:t>Salida del pedido</w:t>
-            </w:r>
-          </w:p>
-        </w:tc>
-        <w:tc>
-          <w:tcPr>
-            <w:tcW w:type="dxa" w:w="3402"/>
-          </w:tcPr>
-          <w:p>
-            <w:pPr>
-              <w:spacing w:before="120" w:after="120"/>
-            </w:pPr>
-            <w:r>
-              <w:rPr>
-                <w:sz w:val="21"/>
-              </w:rPr>
-              <w:t>Despachar pedido</w:t>
-            </w:r>
-          </w:p>
-        </w:tc>
-      </w:tr>
-      <w:tr>
-        <w:trPr>
-          <w:cantSplit/>
-        </w:trPr>
-        <w:tc>
-          <w:tcPr>
-            <w:tcW w:type="dxa" w:w="3175"/>
-          </w:tcPr>
-          <w:p>
-            <w:pPr>
-              <w:spacing w:before="120" w:after="120"/>
-            </w:pPr>
-            <w:r>
-              <w:rPr>
-                <w:sz w:val="21"/>
-              </w:rPr>
-              <w:t>Operadora y cliente</w:t>
-            </w:r>
-          </w:p>
-        </w:tc>
-        <w:tc>
-          <w:tcPr>
-            <w:tcW w:type="dxa" w:w="2835"/>
-          </w:tcPr>
-          <w:p>
-            <w:pPr>
-              <w:spacing w:before="120" w:after="120"/>
-            </w:pPr>
-            <w:r>
-              <w:rPr>
-                <w:sz w:val="21"/>
-              </w:rPr>
-              <w:t>Facturación</w:t>
-            </w:r>
-          </w:p>
-        </w:tc>
-        <w:tc>
-          <w:tcPr>
-            <w:tcW w:type="dxa" w:w="3402"/>
-          </w:tcPr>
-          <w:p>
-            <w:pPr>
-              <w:spacing w:before="120" w:after="120"/>
-            </w:pPr>
-            <w:r>
-              <w:rPr>
-                <w:sz w:val="21"/>
-              </w:rPr>
-              <w:t>Facturar pedido</w:t>
-            </w:r>
           </w:p>
         </w:tc>
       </w:tr>

</xml_diff>

<commit_message>
Agregar propuesta de mejora con modelo de negocio y requerimiento funcional
</commit_message>
<xml_diff>
--- a/entregables/Modelo_Negocio_Pedidos.docx
+++ b/entregables/Modelo_Negocio_Pedidos.docx
@@ -3712,6 +3712,581 @@
         <w:t>13. La factura se envía al cliente una vez despachado el producto.</w:t>
       </w:r>
     </w:p>
+    <w:p>
+      <w:r>
+        <w:br w:type="page"/>
+      </w:r>
+    </w:p>
+    <w:p>
+      <w:pPr>
+        <w:pStyle w:val="Heading1"/>
+      </w:pPr>
+      <w:r>
+        <w:t>6. Propuesta de mejora</w:t>
+      </w:r>
+    </w:p>
+    <w:p>
+      <w:r>
+        <w:t>Proponemos trabajar con un solo registro del pedido, desde la solicitud hasta la factura. El vendedor ingresa los datos una vez y cada área continúa la atención usando el mismo número.</w:t>
+      </w:r>
+    </w:p>
+    <w:p>
+      <w:pPr>
+        <w:pStyle w:val="Heading2"/>
+      </w:pPr>
+      <w:r>
+        <w:t>Qué podemos simplificar</w:t>
+      </w:r>
+    </w:p>
+    <w:p>
+      <w:r>
+        <w:t>La toma por teléfono y la entrega del formato impreso obligan a trasladar y volver a revisar la misma información. La revisión del impreso sirve como control; proponemos reemplazarla por la validación de los datos del registro digital, sin eliminar la revisión de existencias ni de crédito.</w:t>
+      </w:r>
+    </w:p>
+    <w:tbl>
+      <w:tblPr>
+        <w:tblStyle w:val="TableGrid"/>
+        <w:tblW w:type="auto" w:w="0"/>
+        <w:tblLook w:firstColumn="1" w:firstRow="1" w:lastColumn="0" w:lastRow="0" w:noHBand="0" w:noVBand="1" w:val="04A0"/>
+      </w:tblPr>
+      <w:tblGrid>
+        <w:gridCol w:w="4873"/>
+        <w:gridCol w:w="4873"/>
+      </w:tblGrid>
+      <w:tr>
+        <w:trPr>
+          <w:tblHeader/>
+          <w:cantSplit/>
+        </w:trPr>
+        <w:tc>
+          <w:tcPr>
+            <w:tcW w:type="dxa" w:w="4873"/>
+            <w:shd w:fill="E8E8E8"/>
+          </w:tcPr>
+          <w:p>
+            <w:pPr>
+              <w:spacing w:after="100"/>
+            </w:pPr>
+            <w:r>
+              <w:rPr>
+                <w:b/>
+                <w:sz w:val="20"/>
+              </w:rPr>
+              <w:t>En el proceso actual</w:t>
+            </w:r>
+          </w:p>
+        </w:tc>
+        <w:tc>
+          <w:tcPr>
+            <w:tcW w:type="dxa" w:w="4873"/>
+            <w:shd w:fill="E8E8E8"/>
+          </w:tcPr>
+          <w:p>
+            <w:pPr>
+              <w:spacing w:after="100"/>
+            </w:pPr>
+            <w:r>
+              <w:rPr>
+                <w:b/>
+                <w:sz w:val="20"/>
+              </w:rPr>
+              <w:t>Nuestra propuesta</w:t>
+            </w:r>
+          </w:p>
+        </w:tc>
+      </w:tr>
+      <w:tr>
+        <w:trPr>
+          <w:cantSplit/>
+        </w:trPr>
+        <w:tc>
+          <w:tcPr>
+            <w:tcW w:type="dxa" w:w="4873"/>
+          </w:tcPr>
+          <w:p>
+            <w:pPr>
+              <w:spacing w:after="100"/>
+            </w:pPr>
+            <w:r>
+              <w:rPr>
+                <w:sz w:val="20"/>
+              </w:rPr>
+              <w:t>El vendedor comunica el pedido y después entrega el impreso.</w:t>
+            </w:r>
+          </w:p>
+        </w:tc>
+        <w:tc>
+          <w:tcPr>
+            <w:tcW w:type="dxa" w:w="4873"/>
+          </w:tcPr>
+          <w:p>
+            <w:pPr>
+              <w:spacing w:after="100"/>
+            </w:pPr>
+            <w:r>
+              <w:rPr>
+                <w:sz w:val="20"/>
+              </w:rPr>
+              <w:t>El vendedor registra una sola solicitud digital.</w:t>
+            </w:r>
+          </w:p>
+        </w:tc>
+      </w:tr>
+      <w:tr>
+        <w:trPr>
+          <w:cantSplit/>
+        </w:trPr>
+        <w:tc>
+          <w:tcPr>
+            <w:tcW w:type="dxa" w:w="4873"/>
+          </w:tcPr>
+          <w:p>
+            <w:pPr>
+              <w:spacing w:after="100"/>
+            </w:pPr>
+            <w:r>
+              <w:rPr>
+                <w:sz w:val="20"/>
+              </w:rPr>
+              <w:t>La operadora revisa el impreso contra el sistema.</w:t>
+            </w:r>
+          </w:p>
+        </w:tc>
+        <w:tc>
+          <w:tcPr>
+            <w:tcW w:type="dxa" w:w="4873"/>
+          </w:tcPr>
+          <w:p>
+            <w:pPr>
+              <w:spacing w:after="100"/>
+            </w:pPr>
+            <w:r>
+              <w:rPr>
+                <w:sz w:val="20"/>
+              </w:rPr>
+              <w:t>La operadora valida el pedido en el mismo registro.</w:t>
+            </w:r>
+          </w:p>
+        </w:tc>
+      </w:tr>
+      <w:tr>
+        <w:trPr>
+          <w:cantSplit/>
+        </w:trPr>
+        <w:tc>
+          <w:tcPr>
+            <w:tcW w:type="dxa" w:w="4873"/>
+          </w:tcPr>
+          <w:p>
+            <w:pPr>
+              <w:spacing w:after="100"/>
+            </w:pPr>
+            <w:r>
+              <w:rPr>
+                <w:sz w:val="20"/>
+              </w:rPr>
+              <w:t>Se envía una copia de la nota para actualizar el pedido.</w:t>
+            </w:r>
+          </w:p>
+        </w:tc>
+        <w:tc>
+          <w:tcPr>
+            <w:tcW w:type="dxa" w:w="4873"/>
+          </w:tcPr>
+          <w:p>
+            <w:pPr>
+              <w:spacing w:after="100"/>
+            </w:pPr>
+            <w:r>
+              <w:rPr>
+                <w:sz w:val="20"/>
+              </w:rPr>
+              <w:t>El despachador confirma la salida en el sistema.</w:t>
+            </w:r>
+          </w:p>
+        </w:tc>
+      </w:tr>
+      <w:tr>
+        <w:trPr>
+          <w:cantSplit/>
+        </w:trPr>
+        <w:tc>
+          <w:tcPr>
+            <w:tcW w:type="dxa" w:w="4873"/>
+          </w:tcPr>
+          <w:p>
+            <w:pPr>
+              <w:spacing w:after="100"/>
+            </w:pPr>
+            <w:r>
+              <w:rPr>
+                <w:sz w:val="20"/>
+              </w:rPr>
+              <w:t>La operadora cambia el estado y activa la facturación.</w:t>
+            </w:r>
+          </w:p>
+        </w:tc>
+        <w:tc>
+          <w:tcPr>
+            <w:tcW w:type="dxa" w:w="4873"/>
+          </w:tcPr>
+          <w:p>
+            <w:pPr>
+              <w:spacing w:after="100"/>
+            </w:pPr>
+            <w:r>
+              <w:rPr>
+                <w:sz w:val="20"/>
+              </w:rPr>
+              <w:t>Al registrar la salida, el sistema actualiza el estado y habilita la facturación.</w:t>
+            </w:r>
+          </w:p>
+        </w:tc>
+      </w:tr>
+      <w:tr>
+        <w:trPr>
+          <w:cantSplit/>
+        </w:trPr>
+        <w:tc>
+          <w:tcPr>
+            <w:tcW w:type="dxa" w:w="4873"/>
+          </w:tcPr>
+          <w:p>
+            <w:pPr>
+              <w:spacing w:after="100"/>
+            </w:pPr>
+            <w:r>
+              <w:rPr>
+                <w:sz w:val="20"/>
+              </w:rPr>
+              <w:t>La atención pasa por varias áreas.</w:t>
+            </w:r>
+          </w:p>
+        </w:tc>
+        <w:tc>
+          <w:tcPr>
+            <w:tcW w:type="dxa" w:w="4873"/>
+          </w:tcPr>
+          <w:p>
+            <w:pPr>
+              <w:spacing w:after="100"/>
+            </w:pPr>
+            <w:r>
+              <w:rPr>
+                <w:sz w:val="20"/>
+              </w:rPr>
+              <w:t>Todas consultan el mismo número y el estado del pedido.</w:t>
+            </w:r>
+          </w:p>
+        </w:tc>
+      </w:tr>
+    </w:tbl>
+    <w:p>
+      <w:pPr>
+        <w:pStyle w:val="Heading2"/>
+      </w:pPr>
+      <w:r>
+        <w:t>Qué agregamos</w:t>
+      </w:r>
+    </w:p>
+    <w:p>
+      <w:r>
+        <w:t>• Estados del pedido: Solicitado, Validado, Observado, Despachado y Facturado.</w:t>
+        <w:br/>
+        <w:t>• Motivo de observación cuando falten existencias o crédito.</w:t>
+        <w:br/>
+        <w:t>• Nota de despacho y factura vinculadas al número de pedido.</w:t>
+        <w:br/>
+        <w:t>• Control para evitar facturar dos veces la misma atención.</w:t>
+      </w:r>
+    </w:p>
+    <w:p>
+      <w:r>
+        <w:t>Si el pedido queda observado, se corrige en el mismo registro y se vuelve a validar. Solo un pedido validado puede salir del almacén; solo un pedido despachado puede facturarse. Después del despacho se mantiene el envío de la factura al cliente.</w:t>
+      </w:r>
+    </w:p>
+    <w:p>
+      <w:r>
+        <w:br w:type="page"/>
+      </w:r>
+    </w:p>
+    <w:p>
+      <w:pPr>
+        <w:pStyle w:val="Heading1"/>
+      </w:pPr>
+      <w:r>
+        <w:t>6.1. Modelo de negocio de la propuesta</w:t>
+      </w:r>
+    </w:p>
+    <w:p>
+      <w:r>
+        <w:t>Agrupamos la atención en tres procesos: gestionar el pedido, despacharlo y facturarlo. Cada participante conserva una tarea clara y trabaja con la misma información.</w:t>
+      </w:r>
+    </w:p>
+    <w:p>
+      <w:r>
+        <w:drawing>
+          <wp:inline xmlns:a="http://schemas.openxmlformats.org/drawingml/2006/main" xmlns:pic="http://schemas.openxmlformats.org/drawingml/2006/picture">
+            <wp:extent cx="5940000" cy="4654904"/>
+            <wp:docPr id="4" name="Picture 4"/>
+            <wp:cNvGraphicFramePr>
+              <a:graphicFrameLocks noChangeAspect="1"/>
+            </wp:cNvGraphicFramePr>
+            <a:graphic>
+              <a:graphicData uri="http://schemas.openxmlformats.org/drawingml/2006/picture">
+                <pic:pic>
+                  <pic:nvPicPr>
+                    <pic:cNvPr id="0" name="Propuesta_Negocio.png"/>
+                    <pic:cNvPicPr/>
+                  </pic:nvPicPr>
+                  <pic:blipFill>
+                    <a:blip r:embed="rId14"/>
+                    <a:stretch>
+                      <a:fillRect/>
+                    </a:stretch>
+                  </pic:blipFill>
+                  <pic:spPr>
+                    <a:xfrm>
+                      <a:off x="0" y="0"/>
+                      <a:ext cx="5940000" cy="4654904"/>
+                    </a:xfrm>
+                    <a:prstGeom prst="rect"/>
+                  </pic:spPr>
+                </pic:pic>
+              </a:graphicData>
+            </a:graphic>
+          </wp:inline>
+        </w:drawing>
+      </w:r>
+    </w:p>
+    <w:tbl>
+      <w:tblPr>
+        <w:tblStyle w:val="TableGrid"/>
+        <w:tblW w:type="auto" w:w="0"/>
+        <w:tblLook w:firstColumn="1" w:firstRow="1" w:lastColumn="0" w:lastRow="0" w:noHBand="0" w:noVBand="1" w:val="04A0"/>
+      </w:tblPr>
+      <w:tblGrid>
+        <w:gridCol w:w="4873"/>
+        <w:gridCol w:w="4873"/>
+      </w:tblGrid>
+      <w:tr>
+        <w:trPr>
+          <w:tblHeader/>
+          <w:cantSplit/>
+        </w:trPr>
+        <w:tc>
+          <w:tcPr>
+            <w:tcW w:type="dxa" w:w="4873"/>
+            <w:shd w:fill="E8E8E8"/>
+          </w:tcPr>
+          <w:p>
+            <w:pPr>
+              <w:spacing w:after="100"/>
+            </w:pPr>
+            <w:r>
+              <w:rPr>
+                <w:b/>
+                <w:sz w:val="20"/>
+              </w:rPr>
+              <w:t>Proceso</w:t>
+            </w:r>
+          </w:p>
+        </w:tc>
+        <w:tc>
+          <w:tcPr>
+            <w:tcW w:type="dxa" w:w="4873"/>
+            <w:shd w:fill="E8E8E8"/>
+          </w:tcPr>
+          <w:p>
+            <w:pPr>
+              <w:spacing w:after="100"/>
+            </w:pPr>
+            <w:r>
+              <w:rPr>
+                <w:b/>
+                <w:sz w:val="20"/>
+              </w:rPr>
+              <w:t>Participantes</w:t>
+            </w:r>
+          </w:p>
+        </w:tc>
+      </w:tr>
+      <w:tr>
+        <w:trPr>
+          <w:cantSplit/>
+        </w:trPr>
+        <w:tc>
+          <w:tcPr>
+            <w:tcW w:type="dxa" w:w="4873"/>
+          </w:tcPr>
+          <w:p>
+            <w:pPr>
+              <w:spacing w:after="100"/>
+            </w:pPr>
+            <w:r>
+              <w:rPr>
+                <w:sz w:val="20"/>
+              </w:rPr>
+              <w:t>Gestionar pedido</w:t>
+            </w:r>
+          </w:p>
+        </w:tc>
+        <w:tc>
+          <w:tcPr>
+            <w:tcW w:type="dxa" w:w="4873"/>
+          </w:tcPr>
+          <w:p>
+            <w:pPr>
+              <w:spacing w:after="100"/>
+            </w:pPr>
+            <w:r>
+              <w:rPr>
+                <w:sz w:val="20"/>
+              </w:rPr>
+              <w:t>Cliente, vendedor y operadora.</w:t>
+            </w:r>
+          </w:p>
+        </w:tc>
+      </w:tr>
+      <w:tr>
+        <w:trPr>
+          <w:cantSplit/>
+        </w:trPr>
+        <w:tc>
+          <w:tcPr>
+            <w:tcW w:type="dxa" w:w="4873"/>
+          </w:tcPr>
+          <w:p>
+            <w:pPr>
+              <w:spacing w:after="100"/>
+            </w:pPr>
+            <w:r>
+              <w:rPr>
+                <w:sz w:val="20"/>
+              </w:rPr>
+              <w:t>Despachar pedido</w:t>
+            </w:r>
+          </w:p>
+        </w:tc>
+        <w:tc>
+          <w:tcPr>
+            <w:tcW w:type="dxa" w:w="4873"/>
+          </w:tcPr>
+          <w:p>
+            <w:pPr>
+              <w:spacing w:after="100"/>
+            </w:pPr>
+            <w:r>
+              <w:rPr>
+                <w:sz w:val="20"/>
+              </w:rPr>
+              <w:t>Despachador y transportes.</w:t>
+            </w:r>
+          </w:p>
+        </w:tc>
+      </w:tr>
+      <w:tr>
+        <w:trPr>
+          <w:cantSplit/>
+        </w:trPr>
+        <w:tc>
+          <w:tcPr>
+            <w:tcW w:type="dxa" w:w="4873"/>
+          </w:tcPr>
+          <w:p>
+            <w:pPr>
+              <w:spacing w:after="100"/>
+            </w:pPr>
+            <w:r>
+              <w:rPr>
+                <w:sz w:val="20"/>
+              </w:rPr>
+              <w:t>Facturar pedido</w:t>
+            </w:r>
+          </w:p>
+        </w:tc>
+        <w:tc>
+          <w:tcPr>
+            <w:tcW w:type="dxa" w:w="4873"/>
+          </w:tcPr>
+          <w:p>
+            <w:pPr>
+              <w:spacing w:after="100"/>
+            </w:pPr>
+            <w:r>
+              <w:rPr>
+                <w:sz w:val="20"/>
+              </w:rPr>
+              <w:t>Responsable de facturación y cliente.</w:t>
+            </w:r>
+          </w:p>
+        </w:tc>
+      </w:tr>
+    </w:tbl>
+    <w:p>
+      <w:r>
+        <w:br w:type="page"/>
+      </w:r>
+    </w:p>
+    <w:p>
+      <w:pPr>
+        <w:pStyle w:val="Heading1"/>
+      </w:pPr>
+      <w:r>
+        <w:t>6.2. Modelo de Requerimiento Funcional de la propuesta</w:t>
+      </w:r>
+    </w:p>
+    <w:p>
+      <w:r>
+        <w:t>El sistema propuesto permite registrar la solicitud, validar el pedido, consultar su estado, registrar su salida y emitir la factura. La actualización del estado y la habilitación de la facturación quedan dentro del registro de salida.</w:t>
+      </w:r>
+    </w:p>
+    <w:p>
+      <w:r>
+        <w:drawing>
+          <wp:inline xmlns:a="http://schemas.openxmlformats.org/drawingml/2006/main" xmlns:pic="http://schemas.openxmlformats.org/drawingml/2006/picture">
+            <wp:extent cx="5940000" cy="4654904"/>
+            <wp:docPr id="5" name="Picture 5"/>
+            <wp:cNvGraphicFramePr>
+              <a:graphicFrameLocks noChangeAspect="1"/>
+            </wp:cNvGraphicFramePr>
+            <a:graphic>
+              <a:graphicData uri="http://schemas.openxmlformats.org/drawingml/2006/picture">
+                <pic:pic>
+                  <pic:nvPicPr>
+                    <pic:cNvPr id="0" name="Propuesta_Requerimiento_Funcional.png"/>
+                    <pic:cNvPicPr/>
+                  </pic:nvPicPr>
+                  <pic:blipFill>
+                    <a:blip r:embed="rId15"/>
+                    <a:stretch>
+                      <a:fillRect/>
+                    </a:stretch>
+                  </pic:blipFill>
+                  <pic:spPr>
+                    <a:xfrm>
+                      <a:off x="0" y="0"/>
+                      <a:ext cx="5940000" cy="4654904"/>
+                    </a:xfrm>
+                    <a:prstGeom prst="rect"/>
+                  </pic:spPr>
+                </pic:pic>
+              </a:graphicData>
+            </a:graphic>
+          </wp:inline>
+        </w:drawing>
+      </w:r>
+    </w:p>
+    <w:p>
+      <w:r>
+        <w:t>El vendedor tendría acceso para registrar y consultar sus pedidos. La operadora validaría existencias y crédito. El despachador confirmaría la salida y el responsable de facturación emitiría la factura. Son funciones propuestas para mejorar la atención actual.</w:t>
+      </w:r>
+    </w:p>
+    <w:p>
+      <w:r>
+        <w:t>El cliente y transportes participan en el negocio, pero no necesitan acceso al sistema en esta propuesta. El rol de facturación puede ser realizado por la misma operadora, según lo que defina la empresa.</w:t>
+      </w:r>
+    </w:p>
     <w:sectPr>
       <w:footerReference w:type="default" r:id="rId12"/>
       <w:pgSz w:w="12240" w:h="15840"/>

</xml_diff>